<commit_message>
Added page template design
</commit_message>
<xml_diff>
--- a/Documentation.docx
+++ b/Documentation.docx
@@ -960,13 +960,7 @@
         <w:rPr>
           <w:rStyle w:val="QuoteChar"/>
         </w:rPr>
-        <w:t>u</w:t>
-      </w:r>
-      <w:r>
-        <w:rPr>
-          <w:rStyle w:val="QuoteChar"/>
-        </w:rPr>
-        <w:t>sers often leave a website within seconds if they can’t find what they’re looking for</w:t>
+        <w:t>users often leave a website within seconds if they can’t find what they’re looking for</w:t>
       </w:r>
       <w:r>
         <w:rPr>
@@ -2193,224 +2187,121 @@
         <w:rPr>
           <w:b/>
           <w:bCs/>
-          <w:lang w:val="en-BW"/>
         </w:rPr>
       </w:pPr>
       <w:r>
         <w:rPr>
           <w:b/>
           <w:bCs/>
-          <w:lang w:val="en-BW"/>
         </w:rPr>
         <w:t>Rooms/ Listings, Room Details and Bookings Pages</w:t>
       </w:r>
     </w:p>
     <w:p>
-      <w:pPr>
-        <w:rPr>
-          <w:lang w:val="en-BW"/>
-        </w:rPr>
-      </w:pPr>
-      <w:r>
-        <w:rPr>
-          <w:lang w:val="en-BW"/>
-        </w:rPr>
+      <w:r>
         <w:t>These pages work together to form the main booking process of the website.</w:t>
       </w:r>
     </w:p>
     <w:p>
-      <w:pPr>
-        <w:rPr>
-          <w:lang w:val="en-BW"/>
-        </w:rPr>
-      </w:pPr>
-      <w:r>
-        <w:rPr>
-          <w:lang w:val="en-BW"/>
-        </w:rPr>
+      <w:r>
         <w:t xml:space="preserve">The </w:t>
       </w:r>
       <w:r>
         <w:rPr>
           <w:b/>
           <w:bCs/>
-          <w:lang w:val="en-BW"/>
         </w:rPr>
         <w:t>Rooms/Listings page</w:t>
       </w:r>
       <w:r>
-        <w:rPr>
-          <w:lang w:val="en-BW"/>
-        </w:rPr>
         <w:t xml:space="preserve"> displays available accommodation options such as hotels, resorts, and lodges. Users can browse through different listings based on their search preferences.</w:t>
       </w:r>
     </w:p>
     <w:p>
-      <w:pPr>
-        <w:rPr>
-          <w:lang w:val="en-BW"/>
-        </w:rPr>
-      </w:pPr>
-      <w:r>
-        <w:rPr>
-          <w:lang w:val="en-BW"/>
-        </w:rPr>
+      <w:r>
         <w:t>From this page, users select a</w:t>
       </w:r>
       <w:r>
-        <w:rPr>
-          <w:lang w:val="en-BW"/>
-        </w:rPr>
         <w:t xml:space="preserve">n </w:t>
       </w:r>
       <w:r>
-        <w:rPr>
-          <w:lang w:val="en-BW"/>
-        </w:rPr>
         <w:t>accommodation</w:t>
       </w:r>
       <w:r>
-        <w:rPr>
-          <w:lang w:val="en-BW"/>
-        </w:rPr>
         <w:t xml:space="preserve"> and are directed to the </w:t>
       </w:r>
       <w:r>
         <w:rPr>
           <w:b/>
           <w:bCs/>
-          <w:lang w:val="en-BW"/>
         </w:rPr>
         <w:t>Room Details page</w:t>
       </w:r>
       <w:r>
-        <w:rPr>
-          <w:lang w:val="en-BW"/>
-        </w:rPr>
         <w:t>, which provides more detailed information including images, pricing, and descriptions of the selected accommodation.</w:t>
       </w:r>
     </w:p>
     <w:p>
-      <w:pPr>
-        <w:rPr>
-          <w:lang w:val="en-BW"/>
-        </w:rPr>
-      </w:pPr>
-      <w:r>
-        <w:rPr>
-          <w:lang w:val="en-BW"/>
-        </w:rPr>
+      <w:r>
         <w:t xml:space="preserve">Users can then proceed to the </w:t>
       </w:r>
       <w:r>
         <w:rPr>
           <w:b/>
           <w:bCs/>
-          <w:lang w:val="en-BW"/>
         </w:rPr>
         <w:t>Bookings page</w:t>
       </w:r>
       <w:r>
-        <w:rPr>
-          <w:lang w:val="en-BW"/>
-        </w:rPr>
         <w:t xml:space="preserve">, where they enter their </w:t>
       </w:r>
       <w:r>
-        <w:rPr>
-          <w:lang w:val="en-BW"/>
-        </w:rPr>
         <w:t>user credentials</w:t>
       </w:r>
       <w:r>
-        <w:rPr>
-          <w:lang w:val="en-BW"/>
-        </w:rPr>
         <w:t xml:space="preserve">, select </w:t>
       </w:r>
       <w:r>
-        <w:rPr>
-          <w:lang w:val="en-BW"/>
-        </w:rPr>
         <w:t xml:space="preserve">payment </w:t>
       </w:r>
       <w:r>
-        <w:rPr>
-          <w:lang w:val="en-BW"/>
-        </w:rPr>
         <w:t>method (either online or pay at property</w:t>
       </w:r>
       <w:r>
-        <w:rPr>
-          <w:lang w:val="en-BW"/>
-        </w:rPr>
         <w:t>)</w:t>
       </w:r>
       <w:r>
-        <w:rPr>
-          <w:lang w:val="en-BW"/>
-        </w:rPr>
         <w:t xml:space="preserve">, and complete the reservation process. After booking, a confirmation message is </w:t>
       </w:r>
       <w:r>
-        <w:rPr>
-          <w:lang w:val="en-BW"/>
-        </w:rPr>
         <w:t>displayed,</w:t>
       </w:r>
       <w:r>
-        <w:rPr>
-          <w:lang w:val="en-BW"/>
-        </w:rPr>
         <w:t xml:space="preserve"> and a personalized email may be sent to the user.</w:t>
       </w:r>
     </w:p>
     <w:p>
-      <w:pPr>
-        <w:rPr>
-          <w:lang w:val="en-BW"/>
-        </w:rPr>
-      </w:pPr>
       <w:r>
         <w:rPr>
           <w:b/>
           <w:bCs/>
-          <w:lang w:val="en-BW"/>
         </w:rPr>
         <w:t>Customer service page</w:t>
       </w:r>
       <w:r>
-        <w:rPr>
-          <w:lang w:val="en-BW"/>
-        </w:rPr>
         <w:t>:</w:t>
       </w:r>
       <w:r>
-        <w:rPr>
-          <w:lang w:val="en-BW"/>
-        </w:rPr>
         <w:t xml:space="preserve"> </w:t>
       </w:r>
       <w:r>
-        <w:rPr>
-          <w:lang w:val="en-BW"/>
-        </w:rPr>
         <w:t>It</w:t>
       </w:r>
       <w:r>
-        <w:rPr>
-          <w:lang w:val="en-BW"/>
-        </w:rPr>
         <w:t xml:space="preserve"> includes a multi-channel customer support system. The platform allows users to contact support through a contact form, where they are required to provide relevant information such as their name, email, and query. Alternatively, users can seek assistance through social media platforms such as WhatsApp or Instagram, where they can communicate their issues based on the features of the selected platform.</w:t>
       </w:r>
     </w:p>
-    <w:p>
-      <w:pPr>
-        <w:rPr>
-          <w:lang w:val="en-BW"/>
-        </w:rPr>
-      </w:pPr>
-    </w:p>
+    <w:p/>
     <w:p>
       <w:pPr>
         <w:pStyle w:val="Title"/>
@@ -2422,7 +2313,6 @@
           <w:i/>
           <w:iCs/>
           <w:u w:val="single"/>
-          <w:lang w:val="en-BW"/>
         </w:rPr>
       </w:pPr>
       <w:r>
@@ -2430,21 +2320,12 @@
           <w:i/>
           <w:iCs/>
           <w:u w:val="single"/>
-          <w:lang w:val="en-BW"/>
         </w:rPr>
         <w:t>TECHNICAL BRIEF</w:t>
       </w:r>
     </w:p>
     <w:p>
-      <w:pPr>
-        <w:rPr>
-          <w:lang w:val="en-BW"/>
-        </w:rPr>
-      </w:pPr>
-      <w:r>
-        <w:rPr>
-          <w:lang w:val="en-BW"/>
-        </w:rPr>
+      <w:r>
         <w:t>The website will be developed using the following:</w:t>
       </w:r>
     </w:p>
@@ -2468,143 +2349,77 @@
       </w:r>
     </w:p>
     <w:p>
-      <w:pPr>
-        <w:rPr>
-          <w:lang w:val="en-BW"/>
-        </w:rPr>
-      </w:pPr>
       <w:r>
         <w:rPr>
           <w:b/>
           <w:bCs/>
-          <w:lang w:val="en-BW"/>
         </w:rPr>
         <w:t>HTML5</w:t>
       </w:r>
       <w:r>
-        <w:rPr>
-          <w:lang w:val="en-BW"/>
-        </w:rPr>
         <w:t>: This will be used to structure the content of the website such as images</w:t>
       </w:r>
       <w:r>
-        <w:rPr>
-          <w:lang w:val="en-BW"/>
-        </w:rPr>
         <w:t>, pages, text and forms.</w:t>
       </w:r>
     </w:p>
     <w:p>
-      <w:pPr>
-        <w:rPr>
-          <w:lang w:val="en-BW"/>
-        </w:rPr>
-      </w:pPr>
       <w:r>
         <w:rPr>
           <w:b/>
           <w:bCs/>
-          <w:lang w:val="en-BW"/>
         </w:rPr>
         <w:t>CSS</w:t>
       </w:r>
       <w:r>
-        <w:rPr>
-          <w:lang w:val="en-BW"/>
-        </w:rPr>
         <w:t xml:space="preserve">: </w:t>
       </w:r>
       <w:r>
-        <w:rPr>
-          <w:lang w:val="en-BW"/>
-        </w:rPr>
         <w:t xml:space="preserve">Used for styling the website. This includes the background, </w:t>
       </w:r>
       <w:r>
-        <w:rPr>
-          <w:lang w:val="en-BW"/>
-        </w:rPr>
         <w:t>buttons</w:t>
       </w:r>
       <w:r>
-        <w:rPr>
-          <w:lang w:val="en-BW"/>
-        </w:rPr>
         <w:t>, text</w:t>
       </w:r>
       <w:r>
-        <w:rPr>
-          <w:lang w:val="en-BW"/>
-        </w:rPr>
         <w:t xml:space="preserve">, </w:t>
       </w:r>
       <w:r>
-        <w:rPr>
-          <w:lang w:val="en-BW"/>
-        </w:rPr>
         <w:t>icons and</w:t>
       </w:r>
       <w:r>
-        <w:rPr>
-          <w:lang w:val="en-BW"/>
-        </w:rPr>
         <w:t xml:space="preserve"> a responsive design.</w:t>
       </w:r>
     </w:p>
     <w:p>
-      <w:pPr>
-        <w:rPr>
-          <w:lang w:val="en-BW"/>
-        </w:rPr>
-      </w:pPr>
       <w:r>
         <w:rPr>
           <w:b/>
           <w:bCs/>
-          <w:lang w:val="en-BW"/>
         </w:rPr>
         <w:t>JavaScript</w:t>
       </w:r>
       <w:r>
-        <w:rPr>
-          <w:lang w:val="en-BW"/>
-        </w:rPr>
         <w:t>:</w:t>
       </w:r>
       <w:r>
-        <w:rPr>
-          <w:lang w:val="en-BW"/>
-        </w:rPr>
         <w:t xml:space="preserve"> </w:t>
       </w:r>
       <w:r>
-        <w:rPr>
-          <w:lang w:val="en-BW"/>
-        </w:rPr>
         <w:t>Used to add interactivity with the website such as, form validation,</w:t>
       </w:r>
       <w:r>
-        <w:rPr>
-          <w:lang w:val="en-BW"/>
-        </w:rPr>
         <w:t xml:space="preserve"> dynamic island filtering </w:t>
       </w:r>
       <w:r>
-        <w:rPr>
-          <w:lang w:val="en-BW"/>
-        </w:rPr>
         <w:t>and interactive island map</w:t>
       </w:r>
       <w:r>
-        <w:rPr>
-          <w:lang w:val="en-BW"/>
-        </w:rPr>
         <w:t>s</w:t>
       </w:r>
       <w:r>
-        <w:rPr>
-          <w:lang w:val="en-BW"/>
-        </w:rPr>
         <w:t>, as well as pop-up info and image slideshow.</w:t>
       </w:r>
     </w:p>
@@ -2622,66 +2437,31 @@
         <w:t>DEVELOPMENT TOOLS</w:t>
       </w:r>
     </w:p>
-    <w:p>
-      <w:pPr>
-        <w:rPr>
-          <w:lang w:val="en-BW"/>
-        </w:rPr>
-      </w:pPr>
-    </w:p>
-    <w:p>
-      <w:pPr>
-        <w:rPr>
-          <w:lang w:val="en-BW"/>
-        </w:rPr>
-      </w:pPr>
+    <w:p/>
+    <w:p>
       <w:r>
         <w:rPr>
           <w:b/>
           <w:bCs/>
-          <w:lang w:val="en-BW"/>
         </w:rPr>
         <w:t>Code editor</w:t>
       </w:r>
       <w:r>
-        <w:rPr>
-          <w:lang w:val="en-BW"/>
-        </w:rPr>
         <w:t>: Visual Studio Code</w:t>
       </w:r>
       <w:r>
-        <w:rPr>
-          <w:lang w:val="en-BW"/>
-        </w:rPr>
         <w:t xml:space="preserve"> for writing and managing source code.</w:t>
       </w:r>
     </w:p>
     <w:p>
-      <w:pPr>
-        <w:rPr>
-          <w:lang w:val="en-BW"/>
-        </w:rPr>
-      </w:pPr>
-      <w:r>
-        <w:rPr>
-          <w:lang w:val="en-BW"/>
-        </w:rPr>
+      <w:r>
         <w:t xml:space="preserve">Web Browsers: </w:t>
       </w:r>
       <w:r>
-        <w:rPr>
-          <w:lang w:val="en-BW"/>
-        </w:rPr>
         <w:t>MS Edge and Google Chrome will be used for testing and debugging source code.</w:t>
       </w:r>
     </w:p>
-    <w:p>
-      <w:pPr>
-        <w:rPr>
-          <w:lang w:val="en-BW"/>
-        </w:rPr>
-      </w:pPr>
-    </w:p>
+    <w:p/>
     <w:p>
       <w:pPr>
         <w:rPr>
@@ -2696,15 +2476,7 @@
       </w:r>
     </w:p>
     <w:p>
-      <w:pPr>
-        <w:rPr>
-          <w:lang w:val="en-BW"/>
-        </w:rPr>
-      </w:pPr>
-      <w:r>
-        <w:rPr>
-          <w:lang w:val="en-BW"/>
-        </w:rPr>
+      <w:r>
         <w:t>Canva/ Figma: Used to design</w:t>
       </w:r>
     </w:p>
@@ -2715,14 +2487,8 @@
           <w:ilvl w:val="0"/>
           <w:numId w:val="30"/>
         </w:numPr>
-        <w:rPr>
-          <w:lang w:val="en-BW"/>
-        </w:rPr>
-      </w:pPr>
-      <w:r>
-        <w:rPr>
-          <w:lang w:val="en-BW"/>
-        </w:rPr>
+      </w:pPr>
+      <w:r>
         <w:t>Wireframes</w:t>
       </w:r>
     </w:p>
@@ -2733,27 +2499,13 @@
           <w:ilvl w:val="0"/>
           <w:numId w:val="30"/>
         </w:numPr>
-        <w:rPr>
-          <w:lang w:val="en-BW"/>
-        </w:rPr>
-      </w:pPr>
-      <w:r>
-        <w:rPr>
-          <w:lang w:val="en-BW"/>
-        </w:rPr>
+      </w:pPr>
+      <w:r>
         <w:t>Visual elements</w:t>
       </w:r>
     </w:p>
     <w:p>
-      <w:pPr>
-        <w:rPr>
-          <w:lang w:val="en-BW"/>
-        </w:rPr>
-      </w:pPr>
-      <w:r>
-        <w:rPr>
-          <w:lang w:val="en-BW"/>
-        </w:rPr>
+      <w:r>
         <w:t>Pinterest: Alternative for visual elements</w:t>
       </w:r>
     </w:p>
@@ -2771,90 +2523,112 @@
       </w:r>
     </w:p>
     <w:p>
-      <w:pPr>
-        <w:rPr>
-          <w:lang w:val="en-BW"/>
-        </w:rPr>
-      </w:pPr>
-      <w:r>
-        <w:rPr>
-          <w:lang w:val="en-BW"/>
-        </w:rPr>
+      <w:r>
         <w:t>For database</w:t>
       </w:r>
       <w:r>
-        <w:rPr>
-          <w:lang w:val="en-BW"/>
-        </w:rPr>
         <w:t>: MySQL to store input and destination data etc</w:t>
       </w:r>
       <w:r>
-        <w:rPr>
-          <w:lang w:val="en-BW"/>
-        </w:rPr>
         <w:t>.</w:t>
       </w:r>
     </w:p>
     <w:p>
-      <w:pPr>
-        <w:rPr>
-          <w:lang w:val="en-BW"/>
-        </w:rPr>
-      </w:pPr>
-      <w:r>
-        <w:rPr>
-          <w:lang w:val="en-BW"/>
-        </w:rPr>
+      <w:r>
         <w:t>Book strap</w:t>
       </w:r>
       <w:r>
-        <w:rPr>
-          <w:lang w:val="en-BW"/>
-        </w:rPr>
         <w:t>: To further enhance front end technology</w:t>
       </w:r>
     </w:p>
     <w:p>
-      <w:pPr>
-        <w:rPr>
-          <w:lang w:val="en-BW"/>
-        </w:rPr>
-      </w:pPr>
-      <w:r>
-        <w:rPr>
-          <w:lang w:val="en-BW"/>
-        </w:rPr>
+      <w:r>
         <w:t xml:space="preserve">Icon libraries: </w:t>
       </w:r>
       <w:r>
-        <w:rPr>
-          <w:lang w:val="en-BW"/>
-        </w:rPr>
         <w:t>Font Awesome</w:t>
       </w:r>
       <w:r>
-        <w:rPr>
-          <w:lang w:val="en-BW"/>
-        </w:rPr>
         <w:t xml:space="preserve"> will be used to import business icons</w:t>
       </w:r>
       <w:r>
-        <w:rPr>
-          <w:lang w:val="en-BW"/>
-        </w:rPr>
         <w:t>.</w:t>
       </w:r>
     </w:p>
-    <w:p>
-      <w:pPr>
-        <w:rPr>
-          <w:lang w:val="en-BW"/>
-        </w:rPr>
-      </w:pPr>
-      <w:r>
-        <w:rPr>
-          <w:lang w:val="en-BW"/>
-        </w:rPr>
+    <w:p/>
+    <w:p>
+      <w:pPr>
+        <w:pStyle w:val="Title"/>
+        <w:numPr>
+          <w:ilvl w:val="0"/>
+          <w:numId w:val="7"/>
+        </w:numPr>
+        <w:rPr>
+          <w:i/>
+          <w:iCs/>
+          <w:u w:val="single"/>
+        </w:rPr>
+      </w:pPr>
+      <w:r>
+        <w:rPr>
+          <w:i/>
+          <w:iCs/>
+          <w:u w:val="single"/>
+        </w:rPr>
+        <w:t>PAGE TEMPLATE DESIGN</w:t>
+      </w:r>
+    </w:p>
+    <w:p>
+      <w:r>
+        <w:rPr>
+          <w:noProof/>
+        </w:rPr>
+        <w:lastRenderedPageBreak/>
+        <w:drawing>
+          <wp:inline distT="0" distB="0" distL="0" distR="0" wp14:anchorId="317397F1" wp14:editId="459AAF57">
+            <wp:extent cx="6124680" cy="5571654"/>
+            <wp:effectExtent l="0" t="0" r="0" b="0"/>
+            <wp:docPr id="1205637374" name="Picture 1"/>
+            <wp:cNvGraphicFramePr>
+              <a:graphicFrameLocks xmlns:a="http://schemas.openxmlformats.org/drawingml/2006/main" noChangeAspect="1"/>
+            </wp:cNvGraphicFramePr>
+            <a:graphic xmlns:a="http://schemas.openxmlformats.org/drawingml/2006/main">
+              <a:graphicData uri="http://schemas.openxmlformats.org/drawingml/2006/picture">
+                <pic:pic xmlns:pic="http://schemas.openxmlformats.org/drawingml/2006/picture">
+                  <pic:nvPicPr>
+                    <pic:cNvPr id="1205637374" name="Picture 1205637374"/>
+                    <pic:cNvPicPr/>
+                  </pic:nvPicPr>
+                  <pic:blipFill>
+                    <a:blip r:embed="rId9" cstate="print">
+                      <a:extLst>
+                        <a:ext uri="{28A0092B-C50C-407E-A947-70E740481C1C}">
+                          <a14:useLocalDpi xmlns:a14="http://schemas.microsoft.com/office/drawing/2010/main" val="0"/>
+                        </a:ext>
+                      </a:extLst>
+                    </a:blip>
+                    <a:stretch>
+                      <a:fillRect/>
+                    </a:stretch>
+                  </pic:blipFill>
+                  <pic:spPr>
+                    <a:xfrm>
+                      <a:off x="0" y="0"/>
+                      <a:ext cx="6130868" cy="5577283"/>
+                    </a:xfrm>
+                    <a:prstGeom prst="rect">
+                      <a:avLst/>
+                    </a:prstGeom>
+                  </pic:spPr>
+                </pic:pic>
+              </a:graphicData>
+            </a:graphic>
+          </wp:inline>
+        </w:drawing>
+      </w:r>
+    </w:p>
+    <w:p>
+      <w:r>
         <w:t xml:space="preserve"> </w:t>
       </w:r>
     </w:p>
@@ -6983,6 +6757,7 @@
   <w:style w:type="character" w:default="1" w:styleId="DefaultParagraphFont">
     <w:name w:val="Default Paragraph Font"/>
     <w:uiPriority w:val="1"/>
+    <w:semiHidden/>
     <w:unhideWhenUsed/>
   </w:style>
   <w:style w:type="table" w:default="1" w:styleId="TableNormal">

</xml_diff>

<commit_message>
Added home page structural layer, About & Contact pages
</commit_message>
<xml_diff>
--- a/Documentation.docx
+++ b/Documentation.docx
@@ -2585,7 +2585,7 @@
         </w:rPr>
         <w:lastRenderedPageBreak/>
         <w:drawing>
-          <wp:inline distT="0" distB="0" distL="0" distR="0" wp14:anchorId="7A5EC0F7" wp14:editId="72F5051A">
+          <wp:inline distT="0" distB="0" distL="0" distR="0" wp14:anchorId="7A5EC0F7" wp14:editId="117A5508">
             <wp:extent cx="3790950" cy="9190990"/>
             <wp:effectExtent l="0" t="0" r="0" b="0"/>
             <wp:docPr id="1771502528" name="Picture 1"/>
@@ -2596,7 +2596,7 @@
               <a:graphicData uri="http://schemas.openxmlformats.org/drawingml/2006/picture">
                 <pic:pic xmlns:pic="http://schemas.openxmlformats.org/drawingml/2006/picture">
                   <pic:nvPicPr>
-                    <pic:cNvPr id="1771502528" name="Picture 1771502528"/>
+                    <pic:cNvPr id="1771502528" name="Picture 1"/>
                     <pic:cNvPicPr/>
                   </pic:nvPicPr>
                   <pic:blipFill>

</xml_diff>

<commit_message>
Added new pages and made changes
</commit_message>
<xml_diff>
--- a/Documentation.docx
+++ b/Documentation.docx
@@ -37,7 +37,7 @@
         <w:rPr>
           <w:lang w:val="en-GB"/>
         </w:rPr>
-        <w:t>Objectives</w:t>
+        <w:t>Introduction</w:t>
       </w:r>
       <w:r>
         <w:rPr>
@@ -56,82 +56,105 @@
         <w:rPr>
           <w:lang w:val="en-GB"/>
         </w:rPr>
-        <w:t xml:space="preserve">The objective of this website is to provide tourists </w:t>
-      </w:r>
-      <w:r>
-        <w:rPr>
-          <w:lang w:val="en-GB"/>
-        </w:rPr>
-        <w:t xml:space="preserve">comprehensive and easy-to-use platform for planning their trips to the </w:t>
-      </w:r>
-      <w:r>
-        <w:rPr>
-          <w:lang w:val="en-GB"/>
-        </w:rPr>
-        <w:t xml:space="preserve">Bahamas. It aims to inform tourists about destinations, </w:t>
-      </w:r>
-      <w:r>
-        <w:rPr>
-          <w:lang w:val="en-GB"/>
-        </w:rPr>
-        <w:t>accommodations and activities etc. while also offering a booking system for hotels, tours and transportation.</w:t>
-      </w:r>
-      <w:r>
-        <w:rPr>
-          <w:lang w:val="en-GB"/>
-        </w:rPr>
-        <w:t xml:space="preserve"> The main purpose is to increase tourism </w:t>
-      </w:r>
-      <w:r>
-        <w:rPr>
-          <w:lang w:val="en-GB"/>
-        </w:rPr>
-        <w:t xml:space="preserve">in the Bahamas and help local businesses expand by </w:t>
-      </w:r>
-      <w:r>
-        <w:rPr>
-          <w:lang w:val="en-GB"/>
-        </w:rPr>
-        <w:t>attracting more</w:t>
-      </w:r>
-      <w:r>
-        <w:rPr>
-          <w:lang w:val="en-GB"/>
-        </w:rPr>
+        <w:t xml:space="preserve">Tourism </w:t>
+      </w:r>
+      <w:r>
+        <w:rPr>
+          <w:lang w:val="en-GB"/>
+        </w:rPr>
+        <w:t xml:space="preserve">plays a significant role in the economy of Bahamas, attracting visitors with </w:t>
+      </w:r>
+      <w:r>
+        <w:rPr>
+          <w:lang w:val="en-GB"/>
+        </w:rPr>
+        <w:t>its</w:t>
+      </w:r>
+      <w:r>
+        <w:rPr>
+          <w:lang w:val="en-GB"/>
+        </w:rPr>
+        <w:t xml:space="preserve"> beaches, culture and attractions.</w:t>
+      </w:r>
+      <w:r>
         <w:t xml:space="preserve"> </w:t>
       </w:r>
       <w:r>
-        <w:rPr>
-          <w:lang w:val="en-GB"/>
-        </w:rPr>
-        <w:t>visitors to generate income for development.</w:t>
+        <w:t>However, planning a trip can be time-consuming due to scattered information on destinations, accommodations, and activities. Th</w:t>
+      </w:r>
+      <w:r>
+        <w:t xml:space="preserve">erefore, </w:t>
+      </w:r>
+      <w:r>
+        <w:t xml:space="preserve">this </w:t>
+      </w:r>
+      <w:r>
+        <w:t>website</w:t>
+      </w:r>
+      <w:r>
+        <w:t xml:space="preserve"> is designed to provide a centralized and user-friendly platform where tourists can explore key locations, view accommodation options, and plan their trips efficiently</w:t>
+      </w:r>
+      <w:r>
+        <w:t>.</w:t>
+      </w:r>
+    </w:p>
+    <w:p>
+      <w:pPr>
+        <w:pStyle w:val="Heading1"/>
+        <w:rPr>
+          <w:lang w:val="en-GB"/>
+        </w:rPr>
+      </w:pPr>
+      <w:r>
+        <w:rPr>
+          <w:lang w:val="en-GB"/>
+        </w:rPr>
+        <w:t>Objective</w:t>
+      </w:r>
+      <w:r>
+        <w:rPr>
+          <w:lang w:val="en-GB"/>
+        </w:rPr>
+        <w:t>:</w:t>
+      </w:r>
+    </w:p>
+    <w:p>
+      <w:pPr>
+        <w:rPr>
+          <w:lang w:val="en-GB"/>
+        </w:rPr>
+      </w:pPr>
+      <w:r>
+        <w:t>To provide a simple, user-friendly platform for planning and booking trips to the Bahamas</w:t>
+      </w:r>
+      <w:r>
+        <w:rPr>
+          <w:lang w:val="en-GB"/>
+        </w:rPr>
+        <w:t xml:space="preserve"> as studies have shown that</w:t>
+      </w:r>
+      <w:r>
+        <w:t xml:space="preserve"> </w:t>
+      </w:r>
+      <w:r>
+        <w:t>according to (Champ Digital, 2024), “81% of travellers research destinations online before booking their trips</w:t>
+      </w:r>
+      <w:r>
+        <w:t>”</w:t>
+      </w:r>
+      <w:r>
+        <w:t>.</w:t>
       </w:r>
     </w:p>
     <w:p>
       <w:pPr>
         <w:pStyle w:val="Heading2"/>
-        <w:ind w:left="720"/>
-        <w:rPr>
-          <w:lang w:val="en-GB"/>
-        </w:rPr>
-      </w:pPr>
-      <w:r>
-        <w:rPr>
-          <w:rStyle w:val="QuoteChar"/>
-        </w:rPr>
-        <w:t>According to (Champ Digital, 2024), “81% of travellers research destinations online before booking their trips”</w:t>
-      </w:r>
-      <w:r>
-        <w:t>, therefore</w:t>
-      </w:r>
-      <w:r>
-        <w:t>, the goals of the website are:</w:t>
-      </w:r>
-      <w:r>
-        <w:rPr>
-          <w:lang w:val="en-GB"/>
-        </w:rPr>
-        <w:t xml:space="preserve"> </w:t>
+      </w:pPr>
+      <w:r>
+        <w:t>Goals</w:t>
+      </w:r>
+      <w:r>
+        <w:t>:</w:t>
       </w:r>
     </w:p>
     <w:p>
@@ -143,13 +166,19 @@
         <w:rPr>
           <w:rFonts w:hAnsi="Symbol"/>
         </w:rPr>
-        <w:t></w:t>
+        <w:t>1.</w:t>
       </w:r>
       <w:r>
         <w:t xml:space="preserve"> To </w:t>
       </w:r>
       <w:r>
-        <w:t xml:space="preserve">provide reliable and up-to-date travel </w:t>
+        <w:t xml:space="preserve">provide reliable and </w:t>
+      </w:r>
+      <w:r>
+        <w:t>current</w:t>
+      </w:r>
+      <w:r>
+        <w:t xml:space="preserve"> travel </w:t>
       </w:r>
       <w:r>
         <w:t>information</w:t>
@@ -167,16 +196,25 @@
         <w:rPr>
           <w:rFonts w:hAnsi="Symbol"/>
         </w:rPr>
-        <w:t></w:t>
-      </w:r>
-      <w:r>
-        <w:t xml:space="preserve"> </w:t>
+        <w:t xml:space="preserve">2. </w:t>
       </w:r>
       <w:r>
         <w:t>F</w:t>
       </w:r>
       <w:r>
-        <w:t>acilitate online booking of hotels, tours and experiences.</w:t>
+        <w:t>acilitate online booking of hotels, t</w:t>
+      </w:r>
+      <w:r>
+        <w:t>ransport</w:t>
+      </w:r>
+      <w:r>
+        <w:t xml:space="preserve"> and </w:t>
+      </w:r>
+      <w:r>
+        <w:t>attractions</w:t>
+      </w:r>
+      <w:r>
+        <w:t>.</w:t>
       </w:r>
     </w:p>
     <w:p>
@@ -188,7 +226,7 @@
         <w:rPr>
           <w:rFonts w:hAnsi="Symbol"/>
         </w:rPr>
-        <w:t></w:t>
+        <w:t xml:space="preserve">3. </w:t>
       </w:r>
       <w:r>
         <w:t xml:space="preserve"> </w:t>
@@ -212,7 +250,7 @@
         <w:rPr>
           <w:rFonts w:hAnsi="Symbol"/>
         </w:rPr>
-        <w:t></w:t>
+        <w:t>4.</w:t>
       </w:r>
       <w:r>
         <w:t xml:space="preserve"> To </w:t>
@@ -474,6 +512,7 @@
         <w:rPr>
           <w:lang w:val="en-GB"/>
         </w:rPr>
+        <w:lastRenderedPageBreak/>
         <w:t>Income:</w:t>
       </w:r>
       <w:r>
@@ -920,6 +959,8 @@
       <w:pPr>
         <w:rPr>
           <w:rStyle w:val="QuoteChar"/>
+          <w:i w:val="0"/>
+          <w:iCs w:val="0"/>
           <w:lang w:val="en-GB"/>
         </w:rPr>
       </w:pPr>
@@ -959,934 +1000,41 @@
       <w:r>
         <w:rPr>
           <w:rStyle w:val="QuoteChar"/>
-        </w:rPr>
-        <w:t>users often leave a website within seconds if they can’t find what they’re looking for</w:t>
+          <w:i w:val="0"/>
+          <w:iCs w:val="0"/>
+        </w:rPr>
+        <w:t>users</w:t>
       </w:r>
       <w:r>
         <w:rPr>
           <w:rStyle w:val="QuoteChar"/>
         </w:rPr>
+        <w:t xml:space="preserve"> </w:t>
+      </w:r>
+      <w:r>
+        <w:rPr>
+          <w:rStyle w:val="QuoteChar"/>
+          <w:i w:val="0"/>
+          <w:iCs w:val="0"/>
+        </w:rPr>
+        <w:t>often leave a website within seconds if they can’t find what they’re looking for</w:t>
+      </w:r>
+      <w:r>
+        <w:rPr>
+          <w:rStyle w:val="QuoteChar"/>
+          <w:i w:val="0"/>
+          <w:iCs w:val="0"/>
+        </w:rPr>
         <w:t>;</w:t>
       </w:r>
       <w:r>
         <w:rPr>
           <w:rStyle w:val="QuoteChar"/>
+          <w:i w:val="0"/>
+          <w:iCs w:val="0"/>
         </w:rPr>
         <w:t xml:space="preserve"> clear navigation is the key to keeping visitors engaged and satisfied.” — Nielsen Norman Group, 2020</w:t>
       </w:r>
-    </w:p>
-    <w:p>
-      <w:pPr>
-        <w:rPr>
-          <w:lang w:val="en-GB"/>
-        </w:rPr>
-      </w:pPr>
-    </w:p>
-    <w:p>
-      <w:pPr>
-        <w:rPr>
-          <w:lang w:val="en-GB"/>
-        </w:rPr>
-      </w:pPr>
-    </w:p>
-    <w:p>
-      <w:pPr>
-        <w:pStyle w:val="Title"/>
-        <w:numPr>
-          <w:ilvl w:val="0"/>
-          <w:numId w:val="7"/>
-        </w:numPr>
-        <w:rPr>
-          <w:i/>
-          <w:iCs/>
-          <w:u w:val="single"/>
-          <w:lang w:val="en-GB"/>
-        </w:rPr>
-      </w:pPr>
-      <w:r>
-        <w:rPr>
-          <w:i/>
-          <w:iCs/>
-          <w:u w:val="single"/>
-          <w:lang w:val="en-GB"/>
-        </w:rPr>
-        <w:t>INFORMATION DESIGN &amp; TAXANOMY</w:t>
-      </w:r>
-    </w:p>
-    <w:p>
-      <w:pPr>
-        <w:rPr>
-          <w:lang w:val="en-GB"/>
-        </w:rPr>
-      </w:pPr>
-    </w:p>
-    <w:p>
-      <w:pPr>
-        <w:rPr>
-          <w:lang w:val="en-GB"/>
-        </w:rPr>
-      </w:pPr>
-    </w:p>
-    <w:p>
-      <w:pPr>
-        <w:pStyle w:val="Heading2"/>
-        <w:rPr>
-          <w:lang w:val="en-GB"/>
-        </w:rPr>
-      </w:pPr>
-      <w:r>
-        <w:rPr>
-          <w:lang w:val="en-GB"/>
-        </w:rPr>
-        <w:t>SITE MAP</w:t>
-      </w:r>
-      <w:r>
-        <w:rPr>
-          <w:lang w:val="en-GB"/>
-        </w:rPr>
-        <w:t xml:space="preserve"> NAVIGATION</w:t>
-      </w:r>
-    </w:p>
-    <w:p>
-      <w:pPr>
-        <w:rPr>
-          <w:lang w:val="en-GB"/>
-        </w:rPr>
-      </w:pPr>
-    </w:p>
-    <w:p>
-      <w:pPr>
-        <w:pStyle w:val="Subtitle"/>
-        <w:rPr>
-          <w:b/>
-          <w:bCs/>
-          <w:lang w:val="en-GB"/>
-        </w:rPr>
-      </w:pPr>
-      <w:r>
-        <w:rPr>
-          <w:b/>
-          <w:bCs/>
-          <w:lang w:val="en-GB"/>
-        </w:rPr>
-        <w:t>HOME PAGE</w:t>
-      </w:r>
-    </w:p>
-    <w:p>
-      <w:pPr>
-        <w:pStyle w:val="ListParagraph"/>
-        <w:numPr>
-          <w:ilvl w:val="0"/>
-          <w:numId w:val="10"/>
-        </w:numPr>
-        <w:rPr>
-          <w:lang w:val="en-GB"/>
-        </w:rPr>
-      </w:pPr>
-      <w:r>
-        <w:rPr>
-          <w:lang w:val="en-GB"/>
-        </w:rPr>
-        <w:t xml:space="preserve">Language selection </w:t>
-      </w:r>
-      <w:r>
-        <w:rPr>
-          <w:lang w:val="en-GB"/>
-        </w:rPr>
-        <w:t>icon</w:t>
-      </w:r>
-      <w:r>
-        <w:rPr>
-          <w:lang w:val="en-GB"/>
-        </w:rPr>
-        <w:t>.</w:t>
-      </w:r>
-    </w:p>
-    <w:p>
-      <w:pPr>
-        <w:pStyle w:val="ListParagraph"/>
-        <w:numPr>
-          <w:ilvl w:val="0"/>
-          <w:numId w:val="10"/>
-        </w:numPr>
-        <w:rPr>
-          <w:lang w:val="en-GB"/>
-        </w:rPr>
-      </w:pPr>
-      <w:r>
-        <w:rPr>
-          <w:lang w:val="en-GB"/>
-        </w:rPr>
-        <w:t>Help ce</w:t>
-      </w:r>
-      <w:r>
-        <w:rPr>
-          <w:lang w:val="en-GB"/>
-        </w:rPr>
-        <w:t>ntre redirect icon.</w:t>
-      </w:r>
-    </w:p>
-    <w:p>
-      <w:pPr>
-        <w:pStyle w:val="ListParagraph"/>
-        <w:numPr>
-          <w:ilvl w:val="0"/>
-          <w:numId w:val="10"/>
-        </w:numPr>
-        <w:rPr>
-          <w:lang w:val="en-GB"/>
-        </w:rPr>
-      </w:pPr>
-      <w:r>
-        <w:rPr>
-          <w:lang w:val="en-GB"/>
-        </w:rPr>
-        <w:t>Curency selection icon.</w:t>
-      </w:r>
-    </w:p>
-    <w:p>
-      <w:pPr>
-        <w:pStyle w:val="ListParagraph"/>
-        <w:numPr>
-          <w:ilvl w:val="0"/>
-          <w:numId w:val="10"/>
-        </w:numPr>
-        <w:rPr>
-          <w:lang w:val="en-GB"/>
-        </w:rPr>
-      </w:pPr>
-      <w:r>
-        <w:rPr>
-          <w:lang w:val="en-GB"/>
-        </w:rPr>
-        <w:t>Destination</w:t>
-      </w:r>
-      <w:r>
-        <w:rPr>
-          <w:lang w:val="en-GB"/>
-        </w:rPr>
-        <w:t xml:space="preserve">, </w:t>
-      </w:r>
-      <w:r>
-        <w:rPr>
-          <w:lang w:val="en-GB"/>
-        </w:rPr>
-        <w:t>Check-in and Check-out, reservation tabs</w:t>
-      </w:r>
-      <w:r>
-        <w:rPr>
-          <w:lang w:val="en-GB"/>
-        </w:rPr>
-        <w:t xml:space="preserve"> integrated into a search bar.</w:t>
-      </w:r>
-    </w:p>
-    <w:p>
-      <w:pPr>
-        <w:pStyle w:val="ListParagraph"/>
-        <w:numPr>
-          <w:ilvl w:val="0"/>
-          <w:numId w:val="10"/>
-        </w:numPr>
-        <w:rPr>
-          <w:lang w:val="en-GB"/>
-        </w:rPr>
-      </w:pPr>
-      <w:r>
-        <w:rPr>
-          <w:lang w:val="en-GB"/>
-        </w:rPr>
-        <w:t>Sign-up</w:t>
-      </w:r>
-      <w:r>
-        <w:rPr>
-          <w:lang w:val="en-GB"/>
-        </w:rPr>
-        <w:t>/ login</w:t>
-      </w:r>
-      <w:r>
-        <w:rPr>
-          <w:lang w:val="en-GB"/>
-        </w:rPr>
-        <w:t xml:space="preserve"> button.</w:t>
-      </w:r>
-    </w:p>
-    <w:p>
-      <w:pPr>
-        <w:pStyle w:val="Subtitle"/>
-        <w:rPr>
-          <w:b/>
-          <w:bCs/>
-          <w:lang w:val="en-GB"/>
-        </w:rPr>
-      </w:pPr>
-      <w:r>
-        <w:rPr>
-          <w:b/>
-          <w:bCs/>
-          <w:lang w:val="en-GB"/>
-        </w:rPr>
-        <w:lastRenderedPageBreak/>
-        <w:t>ABOUT</w:t>
-      </w:r>
-      <w:r>
-        <w:rPr>
-          <w:b/>
-          <w:bCs/>
-          <w:lang w:val="en-GB"/>
-        </w:rPr>
-        <w:t xml:space="preserve"> US PAGE</w:t>
-      </w:r>
-    </w:p>
-    <w:p>
-      <w:pPr>
-        <w:pStyle w:val="ListParagraph"/>
-        <w:numPr>
-          <w:ilvl w:val="0"/>
-          <w:numId w:val="11"/>
-        </w:numPr>
-        <w:rPr>
-          <w:lang w:val="en-GB"/>
-        </w:rPr>
-      </w:pPr>
-      <w:r>
-        <w:rPr>
-          <w:lang w:val="en-GB"/>
-        </w:rPr>
-        <w:t>Information about website services.</w:t>
-      </w:r>
-    </w:p>
-    <w:p>
-      <w:pPr>
-        <w:pStyle w:val="ListParagraph"/>
-        <w:numPr>
-          <w:ilvl w:val="0"/>
-          <w:numId w:val="11"/>
-        </w:numPr>
-        <w:rPr>
-          <w:lang w:val="en-GB"/>
-        </w:rPr>
-      </w:pPr>
-      <w:r>
-        <w:rPr>
-          <w:lang w:val="en-GB"/>
-        </w:rPr>
-        <w:t xml:space="preserve">Travel </w:t>
-      </w:r>
-      <w:r>
-        <w:rPr>
-          <w:lang w:val="en-GB"/>
-        </w:rPr>
-        <w:t>tips section</w:t>
-      </w:r>
-      <w:r>
-        <w:rPr>
-          <w:lang w:val="en-GB"/>
-        </w:rPr>
-        <w:t>.</w:t>
-      </w:r>
-    </w:p>
-    <w:p>
-      <w:pPr>
-        <w:pStyle w:val="ListParagraph"/>
-        <w:numPr>
-          <w:ilvl w:val="0"/>
-          <w:numId w:val="11"/>
-        </w:numPr>
-        <w:rPr>
-          <w:lang w:val="en-GB"/>
-        </w:rPr>
-      </w:pPr>
-      <w:r>
-        <w:rPr>
-          <w:lang w:val="en-GB"/>
-        </w:rPr>
-        <w:t>Frequently asked questions section.</w:t>
-      </w:r>
-    </w:p>
-    <w:p>
-      <w:pPr>
-        <w:pStyle w:val="Subtitle"/>
-        <w:rPr>
-          <w:b/>
-          <w:bCs/>
-          <w:lang w:val="en-GB"/>
-        </w:rPr>
-      </w:pPr>
-    </w:p>
-    <w:p>
-      <w:pPr>
-        <w:pStyle w:val="Subtitle"/>
-        <w:rPr>
-          <w:b/>
-          <w:bCs/>
-          <w:lang w:val="en-GB"/>
-        </w:rPr>
-      </w:pPr>
-      <w:r>
-        <w:rPr>
-          <w:b/>
-          <w:bCs/>
-          <w:lang w:val="en-GB"/>
-        </w:rPr>
-        <w:t>CAR RENTAL</w:t>
-      </w:r>
-      <w:r>
-        <w:rPr>
-          <w:b/>
-          <w:bCs/>
-          <w:lang w:val="en-GB"/>
-        </w:rPr>
-        <w:t xml:space="preserve"> PAGE</w:t>
-      </w:r>
-    </w:p>
-    <w:p>
-      <w:pPr>
-        <w:pStyle w:val="ListParagraph"/>
-        <w:numPr>
-          <w:ilvl w:val="0"/>
-          <w:numId w:val="11"/>
-        </w:numPr>
-        <w:rPr>
-          <w:lang w:val="en-GB"/>
-        </w:rPr>
-      </w:pPr>
-      <w:r>
-        <w:rPr>
-          <w:lang w:val="en-GB"/>
-        </w:rPr>
-        <w:t>Pick-up location</w:t>
-      </w:r>
-      <w:r>
-        <w:rPr>
-          <w:lang w:val="en-GB"/>
-        </w:rPr>
-        <w:t xml:space="preserve"> search bar.</w:t>
-      </w:r>
-    </w:p>
-    <w:p>
-      <w:pPr>
-        <w:pStyle w:val="ListParagraph"/>
-        <w:numPr>
-          <w:ilvl w:val="0"/>
-          <w:numId w:val="11"/>
-        </w:numPr>
-        <w:rPr>
-          <w:lang w:val="en-GB"/>
-        </w:rPr>
-      </w:pPr>
-      <w:r>
-        <w:rPr>
-          <w:lang w:val="en-GB"/>
-        </w:rPr>
-        <w:t>Pick-up date</w:t>
-      </w:r>
-      <w:r>
-        <w:rPr>
-          <w:lang w:val="en-GB"/>
-        </w:rPr>
-        <w:t xml:space="preserve"> calendar.</w:t>
-      </w:r>
-    </w:p>
-    <w:p>
-      <w:pPr>
-        <w:pStyle w:val="ListParagraph"/>
-        <w:numPr>
-          <w:ilvl w:val="0"/>
-          <w:numId w:val="11"/>
-        </w:numPr>
-        <w:rPr>
-          <w:lang w:val="en-GB"/>
-        </w:rPr>
-      </w:pPr>
-      <w:r>
-        <w:rPr>
-          <w:lang w:val="en-GB"/>
-        </w:rPr>
-        <w:t>Drop-off date calendar.</w:t>
-      </w:r>
-    </w:p>
-    <w:p>
-      <w:pPr>
-        <w:pStyle w:val="ListParagraph"/>
-        <w:numPr>
-          <w:ilvl w:val="0"/>
-          <w:numId w:val="11"/>
-        </w:numPr>
-        <w:rPr>
-          <w:lang w:val="en-GB"/>
-        </w:rPr>
-      </w:pPr>
-      <w:r>
-        <w:rPr>
-          <w:lang w:val="en-GB"/>
-        </w:rPr>
-        <w:t>Travel tips section</w:t>
-      </w:r>
-    </w:p>
-    <w:p>
-      <w:pPr>
-        <w:pStyle w:val="ListParagraph"/>
-        <w:numPr>
-          <w:ilvl w:val="0"/>
-          <w:numId w:val="11"/>
-        </w:numPr>
-        <w:rPr>
-          <w:lang w:val="en-GB"/>
-        </w:rPr>
-      </w:pPr>
-      <w:r>
-        <w:rPr>
-          <w:lang w:val="en-GB"/>
-        </w:rPr>
-        <w:t>Frequently asked questions section.</w:t>
-      </w:r>
-    </w:p>
-    <w:p>
-      <w:pPr>
-        <w:pStyle w:val="ListParagraph"/>
-        <w:rPr>
-          <w:lang w:val="en-GB"/>
-        </w:rPr>
-      </w:pPr>
-    </w:p>
-    <w:p>
-      <w:pPr>
-        <w:pStyle w:val="Subtitle"/>
-        <w:rPr>
-          <w:b/>
-          <w:bCs/>
-          <w:lang w:val="en-GB"/>
-        </w:rPr>
-      </w:pPr>
-      <w:r>
-        <w:rPr>
-          <w:b/>
-          <w:bCs/>
-          <w:lang w:val="en-GB"/>
-        </w:rPr>
-        <w:t>ATTRACTIONS</w:t>
-      </w:r>
-    </w:p>
-    <w:p>
-      <w:pPr>
-        <w:pStyle w:val="ListParagraph"/>
-        <w:numPr>
-          <w:ilvl w:val="0"/>
-          <w:numId w:val="12"/>
-        </w:numPr>
-        <w:rPr>
-          <w:lang w:val="en-GB"/>
-        </w:rPr>
-      </w:pPr>
-      <w:r>
-        <w:rPr>
-          <w:lang w:val="en-GB"/>
-        </w:rPr>
-        <w:t>Destination search bar.</w:t>
-      </w:r>
-    </w:p>
-    <w:p>
-      <w:pPr>
-        <w:pStyle w:val="ListParagraph"/>
-        <w:numPr>
-          <w:ilvl w:val="0"/>
-          <w:numId w:val="12"/>
-        </w:numPr>
-        <w:rPr>
-          <w:lang w:val="en-GB"/>
-        </w:rPr>
-      </w:pPr>
-      <w:r>
-        <w:rPr>
-          <w:lang w:val="en-GB"/>
-        </w:rPr>
-        <w:t xml:space="preserve">Destination </w:t>
-      </w:r>
-      <w:r>
-        <w:rPr>
-          <w:lang w:val="en-GB"/>
-        </w:rPr>
-        <w:t>images and a reserve button.</w:t>
-      </w:r>
-    </w:p>
-    <w:p>
-      <w:pPr>
-        <w:pStyle w:val="ListParagraph"/>
-        <w:numPr>
-          <w:ilvl w:val="0"/>
-          <w:numId w:val="12"/>
-        </w:numPr>
-        <w:rPr>
-          <w:lang w:val="en-GB"/>
-        </w:rPr>
-      </w:pPr>
-      <w:r>
-        <w:rPr>
-          <w:lang w:val="en-GB"/>
-        </w:rPr>
-        <w:t>Calendar tab for reservation/booking.</w:t>
-      </w:r>
-    </w:p>
-    <w:p>
-      <w:pPr>
-        <w:rPr>
-          <w:lang w:val="en-GB"/>
-        </w:rPr>
-      </w:pPr>
-    </w:p>
-    <w:p>
-      <w:pPr>
-        <w:pStyle w:val="Subtitle"/>
-        <w:rPr>
-          <w:b/>
-          <w:bCs/>
-          <w:lang w:val="en-GB"/>
-        </w:rPr>
-      </w:pPr>
-      <w:r>
-        <w:rPr>
-          <w:b/>
-          <w:bCs/>
-          <w:lang w:val="en-GB"/>
-        </w:rPr>
-        <w:t>RESERVATIONS</w:t>
-      </w:r>
-    </w:p>
-    <w:p>
-      <w:pPr>
-        <w:pStyle w:val="ListParagraph"/>
-        <w:numPr>
-          <w:ilvl w:val="0"/>
-          <w:numId w:val="28"/>
-        </w:numPr>
-        <w:rPr>
-          <w:lang w:val="en-GB"/>
-        </w:rPr>
-      </w:pPr>
-      <w:r>
-        <w:rPr>
-          <w:lang w:val="en-GB"/>
-        </w:rPr>
-        <w:t xml:space="preserve">Information </w:t>
-      </w:r>
-      <w:r>
-        <w:rPr>
-          <w:lang w:val="en-GB"/>
-        </w:rPr>
-        <w:t>on reserved destinations.</w:t>
-      </w:r>
-    </w:p>
-    <w:p>
-      <w:pPr>
-        <w:pStyle w:val="Subtitle"/>
-        <w:rPr>
-          <w:rStyle w:val="SubtitleChar"/>
-          <w:b/>
-          <w:bCs/>
-        </w:rPr>
-      </w:pPr>
-      <w:r>
-        <w:rPr>
-          <w:rStyle w:val="SubtitleChar"/>
-          <w:b/>
-          <w:bCs/>
-        </w:rPr>
-        <w:t>ROOMS/ LISTINGS</w:t>
-      </w:r>
-    </w:p>
-    <w:p>
-      <w:pPr>
-        <w:pStyle w:val="ListParagraph"/>
-        <w:numPr>
-          <w:ilvl w:val="0"/>
-          <w:numId w:val="21"/>
-        </w:numPr>
-      </w:pPr>
-      <w:r>
-        <w:t>Hotels</w:t>
-      </w:r>
-    </w:p>
-    <w:p>
-      <w:pPr>
-        <w:pStyle w:val="ListParagraph"/>
-        <w:numPr>
-          <w:ilvl w:val="0"/>
-          <w:numId w:val="21"/>
-        </w:numPr>
-      </w:pPr>
-      <w:r>
-        <w:t>Resorts</w:t>
-      </w:r>
-    </w:p>
-    <w:p>
-      <w:pPr>
-        <w:pStyle w:val="ListParagraph"/>
-        <w:numPr>
-          <w:ilvl w:val="0"/>
-          <w:numId w:val="21"/>
-        </w:numPr>
-      </w:pPr>
-      <w:r>
-        <w:t>Lodges</w:t>
-      </w:r>
-    </w:p>
-    <w:p>
-      <w:pPr>
-        <w:pStyle w:val="Subtitle"/>
-        <w:rPr>
-          <w:rStyle w:val="Strong"/>
-        </w:rPr>
-      </w:pPr>
-      <w:r>
-        <w:rPr>
-          <w:rStyle w:val="Strong"/>
-        </w:rPr>
-        <w:t>R</w:t>
-      </w:r>
-      <w:r>
-        <w:rPr>
-          <w:rStyle w:val="Strong"/>
-        </w:rPr>
-        <w:t>OOM DETAILS PAGE</w:t>
-      </w:r>
-    </w:p>
-    <w:p>
-      <w:pPr>
-        <w:pStyle w:val="ListParagraph"/>
-        <w:numPr>
-          <w:ilvl w:val="0"/>
-          <w:numId w:val="22"/>
-        </w:numPr>
-      </w:pPr>
-      <w:r>
-        <w:t>Image</w:t>
-      </w:r>
-    </w:p>
-    <w:p>
-      <w:pPr>
-        <w:pStyle w:val="ListParagraph"/>
-        <w:numPr>
-          <w:ilvl w:val="0"/>
-          <w:numId w:val="22"/>
-        </w:numPr>
-      </w:pPr>
-      <w:r>
-        <w:t>Prices</w:t>
-      </w:r>
-    </w:p>
-    <w:p>
-      <w:pPr>
-        <w:pStyle w:val="ListParagraph"/>
-        <w:numPr>
-          <w:ilvl w:val="0"/>
-          <w:numId w:val="22"/>
-        </w:numPr>
-      </w:pPr>
-      <w:r>
-        <w:t>Description</w:t>
-      </w:r>
-    </w:p>
-    <w:p>
-      <w:pPr>
-        <w:pStyle w:val="ListParagraph"/>
-        <w:numPr>
-          <w:ilvl w:val="0"/>
-          <w:numId w:val="22"/>
-        </w:numPr>
-      </w:pPr>
-      <w:r>
-        <w:t>Book button</w:t>
-      </w:r>
-    </w:p>
-    <w:p>
-      <w:pPr>
-        <w:pStyle w:val="Subtitle"/>
-        <w:rPr>
-          <w:b/>
-          <w:bCs/>
-        </w:rPr>
-      </w:pPr>
-    </w:p>
-    <w:p>
-      <w:pPr>
-        <w:pStyle w:val="Subtitle"/>
-        <w:rPr>
-          <w:b/>
-          <w:bCs/>
-        </w:rPr>
-      </w:pPr>
-      <w:r>
-        <w:rPr>
-          <w:b/>
-          <w:bCs/>
-        </w:rPr>
-        <w:t>BOOKINGS PAGE</w:t>
-      </w:r>
-    </w:p>
-    <w:p>
-      <w:pPr>
-        <w:pStyle w:val="ListParagraph"/>
-        <w:numPr>
-          <w:ilvl w:val="0"/>
-          <w:numId w:val="23"/>
-        </w:numPr>
-      </w:pPr>
-      <w:r>
-        <w:t>User sign in credentials</w:t>
-      </w:r>
-    </w:p>
-    <w:p>
-      <w:pPr>
-        <w:pStyle w:val="ListParagraph"/>
-        <w:numPr>
-          <w:ilvl w:val="0"/>
-          <w:numId w:val="23"/>
-        </w:numPr>
-      </w:pPr>
-      <w:r>
-        <w:t>Payment</w:t>
-      </w:r>
-      <w:r>
-        <w:t xml:space="preserve"> section.</w:t>
-      </w:r>
-    </w:p>
-    <w:p>
-      <w:pPr>
-        <w:pStyle w:val="ListParagraph"/>
-        <w:numPr>
-          <w:ilvl w:val="0"/>
-          <w:numId w:val="23"/>
-        </w:numPr>
-        <w:rPr>
-          <w:lang w:val="en-GB"/>
-        </w:rPr>
-      </w:pPr>
-      <w:r>
-        <w:rPr>
-          <w:lang w:val="en-GB"/>
-        </w:rPr>
-        <w:t>Frequently asked questions section.</w:t>
-      </w:r>
-    </w:p>
-    <w:p/>
-    <w:p>
-      <w:pPr>
-        <w:pStyle w:val="Subtitle"/>
-        <w:rPr>
-          <w:b/>
-          <w:bCs/>
-        </w:rPr>
-      </w:pPr>
-      <w:r>
-        <w:rPr>
-          <w:b/>
-          <w:bCs/>
-        </w:rPr>
-        <w:t xml:space="preserve"> </w:t>
-      </w:r>
-      <w:r>
-        <w:rPr>
-          <w:b/>
-          <w:bCs/>
-        </w:rPr>
-        <w:t xml:space="preserve">CUSTOMER SERVICE </w:t>
-      </w:r>
-      <w:r>
-        <w:rPr>
-          <w:b/>
-          <w:bCs/>
-        </w:rPr>
-        <w:t>PAGE</w:t>
-      </w:r>
-    </w:p>
-    <w:p>
-      <w:pPr>
-        <w:pStyle w:val="ListParagraph"/>
-        <w:numPr>
-          <w:ilvl w:val="0"/>
-          <w:numId w:val="24"/>
-        </w:numPr>
-      </w:pPr>
-      <w:r>
-        <w:lastRenderedPageBreak/>
-        <w:t>Contact form</w:t>
-      </w:r>
-    </w:p>
-    <w:p>
-      <w:pPr>
-        <w:pStyle w:val="ListParagraph"/>
-        <w:numPr>
-          <w:ilvl w:val="0"/>
-          <w:numId w:val="24"/>
-        </w:numPr>
-      </w:pPr>
-      <w:r>
-        <w:t>Frequently asked question menu.</w:t>
-      </w:r>
-    </w:p>
-    <w:p>
-      <w:pPr>
-        <w:pStyle w:val="ListParagraph"/>
-        <w:numPr>
-          <w:ilvl w:val="0"/>
-          <w:numId w:val="24"/>
-        </w:numPr>
-      </w:pPr>
-      <w:r>
-        <w:t xml:space="preserve">A feedback </w:t>
-      </w:r>
-      <w:r>
-        <w:t>form.</w:t>
-      </w:r>
-    </w:p>
-    <w:p>
-      <w:pPr>
-        <w:pStyle w:val="ListParagraph"/>
-        <w:numPr>
-          <w:ilvl w:val="0"/>
-          <w:numId w:val="24"/>
-        </w:numPr>
-      </w:pPr>
-      <w:r>
-        <w:t>Social links located in the footer.</w:t>
-      </w:r>
-    </w:p>
-    <w:p/>
-    <w:p/>
-    <w:p>
-      <w:pPr>
-        <w:rPr>
-          <w:lang w:val="en-GB"/>
-        </w:rPr>
-      </w:pPr>
-    </w:p>
-    <w:p>
-      <w:pPr>
-        <w:rPr>
-          <w:lang w:val="en-GB"/>
-        </w:rPr>
-      </w:pPr>
-    </w:p>
-    <w:p>
-      <w:pPr>
-        <w:rPr>
-          <w:lang w:val="en-GB"/>
-        </w:rPr>
-      </w:pPr>
-    </w:p>
-    <w:p>
-      <w:pPr>
-        <w:rPr>
-          <w:lang w:val="en-GB"/>
-        </w:rPr>
-      </w:pPr>
-    </w:p>
-    <w:p>
-      <w:pPr>
-        <w:rPr>
-          <w:lang w:val="en-GB"/>
-        </w:rPr>
-      </w:pPr>
     </w:p>
     <w:p>
       <w:pPr>
@@ -1904,20 +1052,128 @@
         </w:tabs>
         <w:spacing w:after="160" w:line="259" w:lineRule="auto"/>
         <w:rPr>
+          <w:lang w:val="en-GB"/>
+        </w:rPr>
+      </w:pPr>
+    </w:p>
+    <w:p>
+      <w:pPr>
+        <w:pStyle w:val="Title"/>
+        <w:numPr>
+          <w:ilvl w:val="0"/>
+          <w:numId w:val="7"/>
+        </w:numPr>
+        <w:rPr>
+          <w:i/>
+          <w:iCs/>
+          <w:u w:val="single"/>
+          <w:lang w:val="en-GB"/>
+        </w:rPr>
+      </w:pPr>
+      <w:r>
+        <w:rPr>
+          <w:i/>
+          <w:iCs/>
+          <w:u w:val="single"/>
+          <w:lang w:val="en-GB"/>
+        </w:rPr>
+        <w:t>INFORMATION DESIGN &amp; TAXANOMY</w:t>
+      </w:r>
+    </w:p>
+    <w:p>
+      <w:pPr>
+        <w:rPr>
+          <w:lang w:val="en-GB"/>
+        </w:rPr>
+      </w:pPr>
+    </w:p>
+    <w:p>
+      <w:pPr>
+        <w:rPr>
+          <w:lang w:val="en-GB"/>
+        </w:rPr>
+      </w:pPr>
+    </w:p>
+    <w:p>
+      <w:pPr>
+        <w:pStyle w:val="Heading2"/>
+        <w:rPr>
+          <w:lang w:val="en-GB"/>
+        </w:rPr>
+      </w:pPr>
+      <w:r>
+        <w:rPr>
+          <w:lang w:val="en-GB"/>
+        </w:rPr>
+        <w:t>SITE MAP</w:t>
+      </w:r>
+      <w:r>
+        <w:rPr>
+          <w:lang w:val="en-GB"/>
+        </w:rPr>
+        <w:t xml:space="preserve"> NAVIGATION</w:t>
+      </w:r>
+    </w:p>
+    <w:p>
+      <w:pPr>
+        <w:rPr>
+          <w:lang w:val="en-GB"/>
+        </w:rPr>
+      </w:pPr>
+    </w:p>
+    <w:p>
+      <w:pPr>
+        <w:rPr>
+          <w:lang w:val="en-GB"/>
+        </w:rPr>
+      </w:pPr>
+    </w:p>
+    <w:p>
+      <w:pPr>
+        <w:rPr>
+          <w:lang w:val="en-GB"/>
+        </w:rPr>
+      </w:pPr>
+    </w:p>
+    <w:p>
+      <w:pPr>
+        <w:rPr>
+          <w:lang w:val="en-GB"/>
+        </w:rPr>
+      </w:pPr>
+    </w:p>
+    <w:p>
+      <w:pPr>
+        <w:rPr>
+          <w:lang w:val="en-GB"/>
+        </w:rPr>
+      </w:pPr>
+    </w:p>
+    <w:p>
+      <w:pPr>
+        <w:rPr>
+          <w:lang w:val="en-GB"/>
+        </w:rPr>
+      </w:pPr>
+    </w:p>
+    <w:p>
+      <w:pPr>
+        <w:rPr>
+          <w:lang w:val="en-GB"/>
+        </w:rPr>
+      </w:pPr>
+      <w:r>
+        <w:rPr>
+          <w:b/>
+          <w:bCs/>
           <w:noProof/>
           <w:lang w:val="en-GB"/>
         </w:rPr>
-      </w:pPr>
-      <w:r>
-        <w:rPr>
-          <w:noProof/>
-          <w:lang w:val="en-GB"/>
-        </w:rPr>
         <w:drawing>
-          <wp:inline distT="0" distB="0" distL="0" distR="0" wp14:anchorId="4FFE71A2" wp14:editId="749EE82B">
-            <wp:extent cx="5731510" cy="5163820"/>
-            <wp:effectExtent l="0" t="0" r="2540" b="0"/>
-            <wp:docPr id="1762200699" name="Picture 4"/>
+          <wp:inline distT="0" distB="0" distL="0" distR="0" wp14:anchorId="07F845F6" wp14:editId="05A71304">
+            <wp:extent cx="5731510" cy="3994785"/>
+            <wp:effectExtent l="0" t="0" r="2540" b="5715"/>
+            <wp:docPr id="1707573058" name="Picture 1"/>
             <wp:cNvGraphicFramePr>
               <a:graphicFrameLocks xmlns:a="http://schemas.openxmlformats.org/drawingml/2006/main" noChangeAspect="1"/>
             </wp:cNvGraphicFramePr>
@@ -1925,7 +1181,7 @@
               <a:graphicData uri="http://schemas.openxmlformats.org/drawingml/2006/picture">
                 <pic:pic xmlns:pic="http://schemas.openxmlformats.org/drawingml/2006/picture">
                   <pic:nvPicPr>
-                    <pic:cNvPr id="1762200699" name="Picture 1762200699"/>
+                    <pic:cNvPr id="1707573058" name="Picture 1707573058"/>
                     <pic:cNvPicPr/>
                   </pic:nvPicPr>
                   <pic:blipFill>
@@ -1943,7 +1199,7 @@
                   <pic:spPr>
                     <a:xfrm>
                       <a:off x="0" y="0"/>
-                      <a:ext cx="5731510" cy="5163820"/>
+                      <a:ext cx="5731510" cy="3994785"/>
                     </a:xfrm>
                     <a:prstGeom prst="rect">
                       <a:avLst/>
@@ -1958,76 +1214,12 @@
     </w:p>
     <w:p>
       <w:pPr>
-        <w:pStyle w:val="ListParagraph"/>
-        <w:ind w:left="1440"/>
-        <w:rPr>
-          <w:lang w:val="en-GB"/>
-        </w:rPr>
-      </w:pPr>
-    </w:p>
-    <w:p>
-      <w:pPr>
-        <w:rPr>
-          <w:lang w:val="en-GB"/>
-        </w:rPr>
-      </w:pPr>
-      <w:r>
+        <w:pStyle w:val="Subtitle"/>
         <w:rPr>
           <w:b/>
           <w:bCs/>
           <w:lang w:val="en-GB"/>
         </w:rPr>
-        <w:lastRenderedPageBreak/>
-        <w:t>Home Page</w:t>
-      </w:r>
-      <w:r>
-        <w:rPr>
-          <w:lang w:val="en-GB"/>
-        </w:rPr>
-        <w:t xml:space="preserve">: This serves as the main entry point for the website. Users </w:t>
-      </w:r>
-      <w:r>
-        <w:rPr>
-          <w:lang w:val="en-GB"/>
-        </w:rPr>
-        <w:t>have the option to register an account free of charge upon entry for data</w:t>
-      </w:r>
-      <w:r>
-        <w:rPr>
-          <w:lang w:val="en-GB"/>
-        </w:rPr>
-        <w:t xml:space="preserve"> keeping purposes. Furthermore, one can select their </w:t>
-      </w:r>
-      <w:r>
-        <w:rPr>
-          <w:lang w:val="en-GB"/>
-        </w:rPr>
-        <w:t>country’s</w:t>
-      </w:r>
-      <w:r>
-        <w:rPr>
-          <w:lang w:val="en-GB"/>
-        </w:rPr>
-        <w:t xml:space="preserve"> na</w:t>
-      </w:r>
-      <w:r>
-        <w:rPr>
-          <w:lang w:val="en-GB"/>
-        </w:rPr>
-        <w:t>tive language for easier communication and understanding.</w:t>
-      </w:r>
-      <w:r>
-        <w:rPr>
-          <w:lang w:val="en-GB"/>
-        </w:rPr>
-        <w:t xml:space="preserve"> </w:t>
-      </w:r>
-    </w:p>
-    <w:p>
-      <w:pPr>
-        <w:rPr>
-          <w:lang w:val="en-GB"/>
-        </w:rPr>
       </w:pPr>
       <w:r>
         <w:rPr>
@@ -2035,101 +1227,137 @@
           <w:bCs/>
           <w:lang w:val="en-GB"/>
         </w:rPr>
-        <w:t>About us</w:t>
-      </w:r>
-      <w:r>
-        <w:rPr>
-          <w:lang w:val="en-GB"/>
-        </w:rPr>
-        <w:t xml:space="preserve">: </w:t>
-      </w:r>
-      <w:r>
-        <w:rPr>
-          <w:lang w:val="en-GB"/>
-        </w:rPr>
-        <w:t xml:space="preserve">This page provides any relevant information about the website and the services </w:t>
-      </w:r>
-      <w:r>
-        <w:rPr>
-          <w:lang w:val="en-GB"/>
-        </w:rPr>
-        <w:t xml:space="preserve">offered. It also includes travel tips </w:t>
-      </w:r>
-      <w:r>
-        <w:rPr>
-          <w:lang w:val="en-GB"/>
-        </w:rPr>
-        <w:t>to guide users and FAQ section to address common concerns.</w:t>
-      </w:r>
-    </w:p>
-    <w:p>
-      <w:pPr>
-        <w:rPr>
-          <w:lang w:val="en-GB"/>
-        </w:rPr>
-      </w:pPr>
-      <w:r>
+        <w:t>HOME PAGE</w:t>
+      </w:r>
+    </w:p>
+    <w:p>
+      <w:pPr>
+        <w:pStyle w:val="ListParagraph"/>
+        <w:numPr>
+          <w:ilvl w:val="0"/>
+          <w:numId w:val="10"/>
+        </w:numPr>
+        <w:rPr>
+          <w:lang w:val="en-GB"/>
+        </w:rPr>
+      </w:pPr>
+      <w:r>
+        <w:rPr>
+          <w:lang w:val="en-GB"/>
+        </w:rPr>
+        <w:t xml:space="preserve">Language selection </w:t>
+      </w:r>
+      <w:r>
+        <w:rPr>
+          <w:lang w:val="en-GB"/>
+        </w:rPr>
+        <w:t>icon</w:t>
+      </w:r>
+      <w:r>
+        <w:rPr>
+          <w:lang w:val="en-GB"/>
+        </w:rPr>
+        <w:t>.</w:t>
+      </w:r>
+    </w:p>
+    <w:p>
+      <w:pPr>
+        <w:pStyle w:val="ListParagraph"/>
+        <w:numPr>
+          <w:ilvl w:val="0"/>
+          <w:numId w:val="10"/>
+        </w:numPr>
+        <w:rPr>
+          <w:lang w:val="en-GB"/>
+        </w:rPr>
+      </w:pPr>
+      <w:r>
+        <w:rPr>
+          <w:lang w:val="en-GB"/>
+        </w:rPr>
+        <w:t>Help ce</w:t>
+      </w:r>
+      <w:r>
+        <w:rPr>
+          <w:lang w:val="en-GB"/>
+        </w:rPr>
+        <w:t>ntre redirect icon.</w:t>
+      </w:r>
+    </w:p>
+    <w:p>
+      <w:pPr>
+        <w:pStyle w:val="ListParagraph"/>
+        <w:numPr>
+          <w:ilvl w:val="0"/>
+          <w:numId w:val="10"/>
+        </w:numPr>
+        <w:rPr>
+          <w:lang w:val="en-GB"/>
+        </w:rPr>
+      </w:pPr>
+      <w:r>
+        <w:rPr>
+          <w:lang w:val="en-GB"/>
+        </w:rPr>
+        <w:t>Currency</w:t>
+      </w:r>
+      <w:r>
+        <w:rPr>
+          <w:lang w:val="en-GB"/>
+        </w:rPr>
+        <w:t xml:space="preserve"> selection icon.</w:t>
+      </w:r>
+    </w:p>
+    <w:p>
+      <w:pPr>
+        <w:pStyle w:val="ListParagraph"/>
+        <w:numPr>
+          <w:ilvl w:val="0"/>
+          <w:numId w:val="10"/>
+        </w:numPr>
+        <w:rPr>
+          <w:lang w:val="en-GB"/>
+        </w:rPr>
+      </w:pPr>
+      <w:r>
+        <w:rPr>
+          <w:lang w:val="en-GB"/>
+        </w:rPr>
+        <w:t>Sign-up</w:t>
+      </w:r>
+      <w:r>
+        <w:rPr>
+          <w:lang w:val="en-GB"/>
+        </w:rPr>
+        <w:t>/ login</w:t>
+      </w:r>
+      <w:r>
+        <w:rPr>
+          <w:lang w:val="en-GB"/>
+        </w:rPr>
+        <w:t xml:space="preserve"> button.</w:t>
+      </w:r>
+    </w:p>
+    <w:p>
+      <w:pPr>
+        <w:rPr>
+          <w:lang w:val="en-GB"/>
+        </w:rPr>
+      </w:pPr>
+    </w:p>
+    <w:p>
+      <w:pPr>
+        <w:pStyle w:val="ListParagraph"/>
+        <w:numPr>
+          <w:ilvl w:val="0"/>
+          <w:numId w:val="33"/>
+        </w:numPr>
+        <w:ind w:left="1080"/>
         <w:rPr>
           <w:b/>
           <w:bCs/>
           <w:lang w:val="en-GB"/>
         </w:rPr>
-        <w:t>Car Rental</w:t>
-      </w:r>
-      <w:r>
-        <w:rPr>
-          <w:lang w:val="en-GB"/>
-        </w:rPr>
-        <w:t xml:space="preserve">: </w:t>
-      </w:r>
-      <w:r>
-        <w:rPr>
-          <w:lang w:val="en-GB"/>
-        </w:rPr>
-        <w:t xml:space="preserve">This serves </w:t>
-      </w:r>
-      <w:r>
-        <w:rPr>
-          <w:lang w:val="en-GB"/>
-        </w:rPr>
-        <w:t>to</w:t>
-      </w:r>
-      <w:r>
-        <w:rPr>
-          <w:lang w:val="en-GB"/>
-        </w:rPr>
-        <w:t xml:space="preserve"> allow users to search for transport</w:t>
-      </w:r>
-      <w:r>
-        <w:rPr>
-          <w:lang w:val="en-GB"/>
-        </w:rPr>
-        <w:t xml:space="preserve"> services with the ability to enter a pick-up location</w:t>
-      </w:r>
-      <w:r>
-        <w:rPr>
-          <w:lang w:val="en-GB"/>
-        </w:rPr>
-        <w:t>, choose pick-up and drop-off dates</w:t>
-      </w:r>
-      <w:r>
-        <w:rPr>
-          <w:lang w:val="en-GB"/>
-        </w:rPr>
-        <w:t xml:space="preserve"> as well as an integrated </w:t>
-      </w:r>
-      <w:r>
-        <w:rPr>
-          <w:lang w:val="en-GB"/>
-        </w:rPr>
-        <w:t>FAQs section and travel tips for assistance.</w:t>
-      </w:r>
-    </w:p>
-    <w:p>
-      <w:pPr>
-        <w:rPr>
-          <w:lang w:val="en-GB"/>
-        </w:rPr>
       </w:pPr>
       <w:r>
         <w:rPr>
@@ -2137,156 +1365,962 @@
           <w:bCs/>
           <w:lang w:val="en-GB"/>
         </w:rPr>
-        <w:t>Attractions page</w:t>
-      </w:r>
-      <w:r>
-        <w:rPr>
-          <w:lang w:val="en-GB"/>
-        </w:rPr>
-        <w:t xml:space="preserve">: This allows users to explore activities and destinations </w:t>
-      </w:r>
-      <w:r>
-        <w:rPr>
-          <w:lang w:val="en-GB"/>
-        </w:rPr>
-        <w:t xml:space="preserve">while planning for their visit to The </w:t>
-      </w:r>
-      <w:r>
-        <w:rPr>
-          <w:lang w:val="en-GB"/>
-        </w:rPr>
-        <w:t>Bahamas</w:t>
-      </w:r>
-      <w:r>
-        <w:rPr>
-          <w:lang w:val="en-GB"/>
-        </w:rPr>
-        <w:t xml:space="preserve">. Users </w:t>
-      </w:r>
-      <w:r>
-        <w:rPr>
-          <w:lang w:val="en-GB"/>
-        </w:rPr>
-        <w:t>can</w:t>
-      </w:r>
-      <w:r>
-        <w:rPr>
-          <w:lang w:val="en-GB"/>
-        </w:rPr>
-        <w:t xml:space="preserve"> make reservations and view their selection with the ability to cancel</w:t>
-      </w:r>
-      <w:r>
-        <w:rPr>
-          <w:lang w:val="en-GB"/>
-        </w:rPr>
-        <w:t xml:space="preserve"> any unwanted reservations before confirmation.</w:t>
-      </w:r>
-    </w:p>
-    <w:p>
-      <w:pPr>
+        <w:t>ABOUT</w:t>
+      </w:r>
+      <w:r>
         <w:rPr>
           <w:b/>
           <w:bCs/>
-        </w:rPr>
-      </w:pPr>
-      <w:r>
+          <w:lang w:val="en-GB"/>
+        </w:rPr>
+        <w:t xml:space="preserve"> PAGE</w:t>
+      </w:r>
+    </w:p>
+    <w:p>
+      <w:pPr>
+        <w:pStyle w:val="ListParagraph"/>
+        <w:numPr>
+          <w:ilvl w:val="0"/>
+          <w:numId w:val="11"/>
+        </w:numPr>
+        <w:ind w:left="1440"/>
+        <w:rPr>
+          <w:lang w:val="en-GB"/>
+        </w:rPr>
+      </w:pPr>
+      <w:r>
+        <w:rPr>
+          <w:lang w:val="en-GB"/>
+        </w:rPr>
+        <w:t>Information about website services.</w:t>
+      </w:r>
+    </w:p>
+    <w:p>
+      <w:pPr>
+        <w:pStyle w:val="ListParagraph"/>
+        <w:numPr>
+          <w:ilvl w:val="0"/>
+          <w:numId w:val="11"/>
+        </w:numPr>
+        <w:ind w:left="1440"/>
+        <w:rPr>
+          <w:lang w:val="en-GB"/>
+        </w:rPr>
+      </w:pPr>
+      <w:r>
+        <w:rPr>
+          <w:lang w:val="en-GB"/>
+        </w:rPr>
+        <w:t xml:space="preserve">Travel </w:t>
+      </w:r>
+      <w:r>
+        <w:rPr>
+          <w:lang w:val="en-GB"/>
+        </w:rPr>
+        <w:t>tips section</w:t>
+      </w:r>
+      <w:r>
+        <w:rPr>
+          <w:lang w:val="en-GB"/>
+        </w:rPr>
+        <w:t>.</w:t>
+      </w:r>
+    </w:p>
+    <w:p>
+      <w:pPr>
+        <w:pStyle w:val="ListParagraph"/>
+        <w:numPr>
+          <w:ilvl w:val="0"/>
+          <w:numId w:val="11"/>
+        </w:numPr>
+        <w:ind w:left="1440"/>
+        <w:rPr>
+          <w:lang w:val="en-GB"/>
+        </w:rPr>
+      </w:pPr>
+      <w:r>
+        <w:rPr>
+          <w:lang w:val="en-GB"/>
+        </w:rPr>
+        <w:t>Frequently asked questions section.</w:t>
+      </w:r>
+    </w:p>
+    <w:p>
+      <w:pPr>
+        <w:ind w:left="315"/>
+        <w:rPr>
+          <w:lang w:val="en-GB"/>
+        </w:rPr>
+      </w:pPr>
+    </w:p>
+    <w:p>
+      <w:pPr>
+        <w:pStyle w:val="ListParagraph"/>
+        <w:numPr>
+          <w:ilvl w:val="0"/>
+          <w:numId w:val="33"/>
+        </w:numPr>
+        <w:ind w:left="1080"/>
         <w:rPr>
           <w:b/>
           <w:bCs/>
         </w:rPr>
-        <w:t>Rooms/ Listings, Room Details and Bookings Pages</w:t>
-      </w:r>
-    </w:p>
-    <w:p>
-      <w:r>
-        <w:t>These pages work together to form the main booking process of the website.</w:t>
-      </w:r>
-    </w:p>
-    <w:p>
-      <w:r>
-        <w:t xml:space="preserve">The </w:t>
-      </w:r>
+      </w:pPr>
       <w:r>
         <w:rPr>
           <w:b/>
           <w:bCs/>
         </w:rPr>
-        <w:t>Rooms/Listings page</w:t>
-      </w:r>
-      <w:r>
-        <w:t xml:space="preserve"> displays available accommodation options such as hotels, resorts, and lodges. Users can browse through different listings based on their search preferences.</w:t>
-      </w:r>
-    </w:p>
-    <w:p>
-      <w:r>
-        <w:t>From this page, users select a</w:t>
-      </w:r>
-      <w:r>
-        <w:t xml:space="preserve">n </w:t>
-      </w:r>
-      <w:r>
-        <w:t>accommodation</w:t>
-      </w:r>
-      <w:r>
-        <w:t xml:space="preserve"> and are directed to the </w:t>
-      </w:r>
-      <w:r>
+        <w:t>CONTACT PAGE</w:t>
+      </w:r>
+    </w:p>
+    <w:p>
+      <w:pPr>
+        <w:pStyle w:val="ListParagraph"/>
+        <w:numPr>
+          <w:ilvl w:val="0"/>
+          <w:numId w:val="24"/>
+        </w:numPr>
+        <w:ind w:left="1395"/>
+      </w:pPr>
+      <w:r>
+        <w:t>Contact form</w:t>
+      </w:r>
+    </w:p>
+    <w:p>
+      <w:pPr>
+        <w:pStyle w:val="ListParagraph"/>
+        <w:numPr>
+          <w:ilvl w:val="0"/>
+          <w:numId w:val="24"/>
+        </w:numPr>
+        <w:ind w:left="1395"/>
+      </w:pPr>
+      <w:r>
+        <w:t>Frequently asked question menu.</w:t>
+      </w:r>
+    </w:p>
+    <w:p>
+      <w:pPr>
+        <w:pStyle w:val="ListParagraph"/>
+        <w:numPr>
+          <w:ilvl w:val="0"/>
+          <w:numId w:val="24"/>
+        </w:numPr>
+        <w:ind w:left="1395"/>
+      </w:pPr>
+      <w:r>
+        <w:t>A feedback section.</w:t>
+      </w:r>
+    </w:p>
+    <w:p>
+      <w:pPr>
+        <w:pStyle w:val="ListParagraph"/>
+        <w:numPr>
+          <w:ilvl w:val="0"/>
+          <w:numId w:val="24"/>
+        </w:numPr>
+        <w:ind w:left="1395"/>
+      </w:pPr>
+      <w:r>
+        <w:t>Social links located in the footer.</w:t>
+      </w:r>
+    </w:p>
+    <w:p/>
+    <w:p>
+      <w:pPr>
+        <w:pStyle w:val="Subtitle"/>
         <w:rPr>
           <w:b/>
           <w:bCs/>
         </w:rPr>
-        <w:t>Room Details page</w:t>
-      </w:r>
-      <w:r>
-        <w:t>, which provides more detailed information including images, pricing, and descriptions of the selected accommodation.</w:t>
-      </w:r>
-    </w:p>
-    <w:p>
-      <w:r>
-        <w:t xml:space="preserve">Users can then proceed to the </w:t>
-      </w:r>
+      </w:pPr>
       <w:r>
         <w:rPr>
           <w:b/>
           <w:bCs/>
         </w:rPr>
-        <w:t>Bookings page</w:t>
-      </w:r>
-      <w:r>
-        <w:t xml:space="preserve">, where they enter their </w:t>
-      </w:r>
-      <w:r>
-        <w:t>user credentials</w:t>
-      </w:r>
-      <w:r>
-        <w:t xml:space="preserve">, select </w:t>
-      </w:r>
-      <w:r>
-        <w:t xml:space="preserve">payment </w:t>
-      </w:r>
-      <w:r>
-        <w:t>method (either online or pay at property</w:t>
-      </w:r>
-      <w:r>
-        <w:t>)</w:t>
-      </w:r>
-      <w:r>
-        <w:t xml:space="preserve">, and complete the reservation process. After booking, a confirmation message is </w:t>
-      </w:r>
-      <w:r>
-        <w:t>displayed,</w:t>
-      </w:r>
-      <w:r>
-        <w:t xml:space="preserve"> and a personalized email may be sent to the user.</w:t>
-      </w:r>
-    </w:p>
-    <w:p>
-      <w:r>
+        <w:lastRenderedPageBreak/>
+        <w:t>SERVICES PAGE</w:t>
+      </w:r>
+    </w:p>
+    <w:p>
+      <w:pPr>
+        <w:pStyle w:val="Subtitle"/>
+        <w:rPr>
+          <w:b/>
+          <w:lang w:val="fr-FR"/>
+        </w:rPr>
+      </w:pPr>
+    </w:p>
+    <w:p>
+      <w:pPr>
+        <w:pStyle w:val="ListParagraph"/>
+        <w:numPr>
+          <w:ilvl w:val="0"/>
+          <w:numId w:val="34"/>
+        </w:numPr>
+        <w:rPr>
+          <w:b/>
+          <w:lang w:val="fr-FR"/>
+        </w:rPr>
+      </w:pPr>
+      <w:r>
+        <w:rPr>
+          <w:b/>
+          <w:lang w:val="fr-FR"/>
+        </w:rPr>
+        <w:t>CAR RENTAL</w:t>
+      </w:r>
+      <w:r>
+        <w:rPr>
+          <w:b/>
+          <w:lang w:val="fr-FR"/>
+        </w:rPr>
+        <w:t xml:space="preserve"> </w:t>
+      </w:r>
+    </w:p>
+    <w:p>
+      <w:pPr>
+        <w:pStyle w:val="ListParagraph"/>
+        <w:numPr>
+          <w:ilvl w:val="0"/>
+          <w:numId w:val="11"/>
+        </w:numPr>
+        <w:rPr>
+          <w:lang w:val="en-GB"/>
+        </w:rPr>
+      </w:pPr>
+      <w:r>
+        <w:rPr>
+          <w:lang w:val="en-GB"/>
+        </w:rPr>
+        <w:t>Pick-up location</w:t>
+      </w:r>
+      <w:r>
+        <w:rPr>
+          <w:lang w:val="en-GB"/>
+        </w:rPr>
+        <w:t xml:space="preserve"> search bar.</w:t>
+      </w:r>
+    </w:p>
+    <w:p>
+      <w:pPr>
+        <w:pStyle w:val="ListParagraph"/>
+        <w:numPr>
+          <w:ilvl w:val="0"/>
+          <w:numId w:val="11"/>
+        </w:numPr>
+        <w:rPr>
+          <w:lang w:val="en-GB"/>
+        </w:rPr>
+      </w:pPr>
+      <w:r>
+        <w:rPr>
+          <w:lang w:val="en-GB"/>
+        </w:rPr>
+        <w:t>Pick-up date</w:t>
+      </w:r>
+      <w:r>
+        <w:rPr>
+          <w:lang w:val="en-GB"/>
+        </w:rPr>
+        <w:t xml:space="preserve"> calendar.</w:t>
+      </w:r>
+    </w:p>
+    <w:p>
+      <w:pPr>
+        <w:pStyle w:val="ListParagraph"/>
+        <w:numPr>
+          <w:ilvl w:val="0"/>
+          <w:numId w:val="11"/>
+        </w:numPr>
+        <w:rPr>
+          <w:lang w:val="en-GB"/>
+        </w:rPr>
+      </w:pPr>
+      <w:r>
+        <w:rPr>
+          <w:lang w:val="en-GB"/>
+        </w:rPr>
+        <w:t>Drop-off date calendar.</w:t>
+      </w:r>
+    </w:p>
+    <w:p>
+      <w:pPr>
+        <w:pStyle w:val="ListParagraph"/>
+        <w:numPr>
+          <w:ilvl w:val="0"/>
+          <w:numId w:val="11"/>
+        </w:numPr>
+        <w:rPr>
+          <w:lang w:val="en-GB"/>
+        </w:rPr>
+      </w:pPr>
+      <w:r>
+        <w:rPr>
+          <w:lang w:val="en-GB"/>
+        </w:rPr>
+        <w:t>Travel tips section</w:t>
+      </w:r>
+    </w:p>
+    <w:p>
+      <w:pPr>
+        <w:pStyle w:val="ListParagraph"/>
+        <w:numPr>
+          <w:ilvl w:val="0"/>
+          <w:numId w:val="11"/>
+        </w:numPr>
+        <w:rPr>
+          <w:lang w:val="en-GB"/>
+        </w:rPr>
+      </w:pPr>
+      <w:r>
+        <w:rPr>
+          <w:lang w:val="en-GB"/>
+        </w:rPr>
+        <w:t>Frequently asked questions section.</w:t>
+      </w:r>
+    </w:p>
+    <w:p>
+      <w:pPr>
+        <w:pStyle w:val="ListParagraph"/>
+        <w:rPr>
+          <w:lang w:val="en-GB"/>
+        </w:rPr>
+      </w:pPr>
+    </w:p>
+    <w:p>
+      <w:pPr>
+        <w:pStyle w:val="ListParagraph"/>
+        <w:numPr>
+          <w:ilvl w:val="0"/>
+          <w:numId w:val="36"/>
+        </w:numPr>
         <w:rPr>
           <w:b/>
           <w:bCs/>
-        </w:rPr>
-        <w:t>Customer service page</w:t>
+          <w:lang w:val="en-GB"/>
+        </w:rPr>
+      </w:pPr>
+      <w:r>
+        <w:rPr>
+          <w:b/>
+          <w:bCs/>
+          <w:lang w:val="en-GB"/>
+        </w:rPr>
+        <w:t>ATTRACTIONS</w:t>
+      </w:r>
+    </w:p>
+    <w:p>
+      <w:pPr>
+        <w:pStyle w:val="ListParagraph"/>
+        <w:numPr>
+          <w:ilvl w:val="0"/>
+          <w:numId w:val="12"/>
+        </w:numPr>
+        <w:rPr>
+          <w:lang w:val="en-GB"/>
+        </w:rPr>
+      </w:pPr>
+      <w:r>
+        <w:rPr>
+          <w:lang w:val="en-GB"/>
+        </w:rPr>
+        <w:t>Destination search bar.</w:t>
+      </w:r>
+    </w:p>
+    <w:p>
+      <w:pPr>
+        <w:pStyle w:val="ListParagraph"/>
+        <w:numPr>
+          <w:ilvl w:val="0"/>
+          <w:numId w:val="12"/>
+        </w:numPr>
+        <w:rPr>
+          <w:lang w:val="en-GB"/>
+        </w:rPr>
+      </w:pPr>
+      <w:r>
+        <w:rPr>
+          <w:lang w:val="en-GB"/>
+        </w:rPr>
+        <w:t xml:space="preserve">Destination </w:t>
+      </w:r>
+      <w:r>
+        <w:rPr>
+          <w:lang w:val="en-GB"/>
+        </w:rPr>
+        <w:t>images and a reserve button.</w:t>
+      </w:r>
+    </w:p>
+    <w:p>
+      <w:pPr>
+        <w:pStyle w:val="ListParagraph"/>
+        <w:numPr>
+          <w:ilvl w:val="0"/>
+          <w:numId w:val="12"/>
+        </w:numPr>
+        <w:rPr>
+          <w:lang w:val="en-GB"/>
+        </w:rPr>
+      </w:pPr>
+      <w:r>
+        <w:rPr>
+          <w:lang w:val="en-GB"/>
+        </w:rPr>
+        <w:t>Calendar tab for reservation/booking.</w:t>
+      </w:r>
+    </w:p>
+    <w:p>
+      <w:pPr>
+        <w:pStyle w:val="ListParagraph"/>
+        <w:ind w:left="1080"/>
+        <w:rPr>
+          <w:lang w:val="en-GB"/>
+        </w:rPr>
+      </w:pPr>
+    </w:p>
+    <w:p>
+      <w:pPr>
+        <w:pStyle w:val="ListParagraph"/>
+        <w:numPr>
+          <w:ilvl w:val="0"/>
+          <w:numId w:val="36"/>
+        </w:numPr>
+        <w:rPr>
+          <w:b/>
+        </w:rPr>
+      </w:pPr>
+      <w:r>
+        <w:rPr>
+          <w:b/>
+        </w:rPr>
+        <w:t>ROOMS/ LISTINGS</w:t>
+      </w:r>
+    </w:p>
+    <w:p>
+      <w:pPr>
+        <w:pStyle w:val="ListParagraph"/>
+        <w:numPr>
+          <w:ilvl w:val="0"/>
+          <w:numId w:val="21"/>
+        </w:numPr>
+      </w:pPr>
+      <w:r>
+        <w:t>Hotels</w:t>
+      </w:r>
+    </w:p>
+    <w:p>
+      <w:pPr>
+        <w:pStyle w:val="ListParagraph"/>
+        <w:numPr>
+          <w:ilvl w:val="0"/>
+          <w:numId w:val="21"/>
+        </w:numPr>
+      </w:pPr>
+      <w:r>
+        <w:t>Resorts</w:t>
+      </w:r>
+    </w:p>
+    <w:p>
+      <w:pPr>
+        <w:pStyle w:val="ListParagraph"/>
+        <w:numPr>
+          <w:ilvl w:val="0"/>
+          <w:numId w:val="21"/>
+        </w:numPr>
+      </w:pPr>
+      <w:r>
+        <w:t>Lodges</w:t>
+      </w:r>
+    </w:p>
+    <w:p>
+      <w:pPr>
+        <w:pStyle w:val="ListParagraph"/>
+        <w:numPr>
+          <w:ilvl w:val="1"/>
+          <w:numId w:val="21"/>
+        </w:numPr>
+        <w:rPr>
+          <w:rStyle w:val="Strong"/>
+        </w:rPr>
+      </w:pPr>
+      <w:r>
+        <w:rPr>
+          <w:rStyle w:val="Strong"/>
+        </w:rPr>
+        <w:t>R</w:t>
+      </w:r>
+      <w:r>
+        <w:rPr>
+          <w:rStyle w:val="Strong"/>
+        </w:rPr>
+        <w:t>OOM DETAILS PAGE</w:t>
+      </w:r>
+    </w:p>
+    <w:p>
+      <w:pPr>
+        <w:pStyle w:val="ListParagraph"/>
+        <w:numPr>
+          <w:ilvl w:val="0"/>
+          <w:numId w:val="22"/>
+        </w:numPr>
+      </w:pPr>
+      <w:r>
+        <w:t>Image</w:t>
+      </w:r>
+    </w:p>
+    <w:p>
+      <w:pPr>
+        <w:pStyle w:val="ListParagraph"/>
+        <w:numPr>
+          <w:ilvl w:val="0"/>
+          <w:numId w:val="22"/>
+        </w:numPr>
+      </w:pPr>
+      <w:r>
+        <w:t>Prices</w:t>
+      </w:r>
+    </w:p>
+    <w:p>
+      <w:pPr>
+        <w:pStyle w:val="ListParagraph"/>
+        <w:numPr>
+          <w:ilvl w:val="0"/>
+          <w:numId w:val="22"/>
+        </w:numPr>
+      </w:pPr>
+      <w:r>
+        <w:t>Description</w:t>
+      </w:r>
+    </w:p>
+    <w:p>
+      <w:pPr>
+        <w:pStyle w:val="ListParagraph"/>
+        <w:numPr>
+          <w:ilvl w:val="0"/>
+          <w:numId w:val="22"/>
+        </w:numPr>
+      </w:pPr>
+      <w:r>
+        <w:t>Book button</w:t>
+      </w:r>
+    </w:p>
+    <w:p>
+      <w:pPr>
+        <w:pStyle w:val="ListParagraph"/>
+        <w:numPr>
+          <w:ilvl w:val="0"/>
+          <w:numId w:val="38"/>
+        </w:numPr>
+        <w:rPr>
+          <w:b/>
+          <w:bCs/>
+        </w:rPr>
+      </w:pPr>
+      <w:r>
+        <w:rPr>
+          <w:b/>
+          <w:bCs/>
+        </w:rPr>
+        <w:t>BOOKINGS PAGE</w:t>
+      </w:r>
+    </w:p>
+    <w:p>
+      <w:pPr>
+        <w:pStyle w:val="ListParagraph"/>
+        <w:numPr>
+          <w:ilvl w:val="0"/>
+          <w:numId w:val="23"/>
+        </w:numPr>
+      </w:pPr>
+      <w:r>
+        <w:t>User sign in credentials</w:t>
+      </w:r>
+    </w:p>
+    <w:p>
+      <w:pPr>
+        <w:pStyle w:val="ListParagraph"/>
+        <w:numPr>
+          <w:ilvl w:val="0"/>
+          <w:numId w:val="23"/>
+        </w:numPr>
+      </w:pPr>
+      <w:r>
+        <w:t>Payment</w:t>
+      </w:r>
+      <w:r>
+        <w:t xml:space="preserve"> section.</w:t>
+      </w:r>
+    </w:p>
+    <w:p>
+      <w:pPr>
+        <w:pStyle w:val="ListParagraph"/>
+        <w:numPr>
+          <w:ilvl w:val="0"/>
+          <w:numId w:val="23"/>
+        </w:numPr>
+        <w:rPr>
+          <w:lang w:val="en-GB"/>
+        </w:rPr>
+      </w:pPr>
+      <w:r>
+        <w:rPr>
+          <w:lang w:val="en-GB"/>
+        </w:rPr>
+        <w:t>Frequently asked questions section.</w:t>
+      </w:r>
+    </w:p>
+    <w:p>
+      <w:pPr>
+        <w:rPr>
+          <w:lang w:val="en-GB"/>
+        </w:rPr>
+      </w:pPr>
+    </w:p>
+    <w:p>
+      <w:pPr>
+        <w:rPr>
+          <w:lang w:val="en-GB"/>
+        </w:rPr>
+      </w:pPr>
+      <w:r>
+        <w:rPr>
+          <w:b/>
+          <w:bCs/>
+          <w:lang w:val="en-GB"/>
+        </w:rPr>
+        <w:t>Home Page</w:t>
+      </w:r>
+      <w:r>
+        <w:rPr>
+          <w:lang w:val="en-GB"/>
+        </w:rPr>
+        <w:t xml:space="preserve">: This serves as the main entry point for the website. Users </w:t>
+      </w:r>
+      <w:r>
+        <w:rPr>
+          <w:lang w:val="en-GB"/>
+        </w:rPr>
+        <w:t>have the option to register an account free of charge upon entry for data</w:t>
+      </w:r>
+      <w:r>
+        <w:rPr>
+          <w:lang w:val="en-GB"/>
+        </w:rPr>
+        <w:t xml:space="preserve"> keeping purposes. Furthermore, one can select their </w:t>
+      </w:r>
+      <w:r>
+        <w:rPr>
+          <w:lang w:val="en-GB"/>
+        </w:rPr>
+        <w:t>country’s</w:t>
+      </w:r>
+      <w:r>
+        <w:rPr>
+          <w:lang w:val="en-GB"/>
+        </w:rPr>
+        <w:t xml:space="preserve"> na</w:t>
+      </w:r>
+      <w:r>
+        <w:rPr>
+          <w:lang w:val="en-GB"/>
+        </w:rPr>
+        <w:t>tive language for easier communication and understanding.</w:t>
+      </w:r>
+      <w:r>
+        <w:rPr>
+          <w:lang w:val="en-GB"/>
+        </w:rPr>
+        <w:t xml:space="preserve"> </w:t>
+      </w:r>
+    </w:p>
+    <w:p>
+      <w:pPr>
+        <w:rPr>
+          <w:lang w:val="en-GB"/>
+        </w:rPr>
+      </w:pPr>
+      <w:r>
+        <w:rPr>
+          <w:b/>
+          <w:bCs/>
+          <w:lang w:val="en-GB"/>
+        </w:rPr>
+        <w:t>About us</w:t>
+      </w:r>
+      <w:r>
+        <w:rPr>
+          <w:lang w:val="en-GB"/>
+        </w:rPr>
+        <w:t xml:space="preserve">: </w:t>
+      </w:r>
+      <w:r>
+        <w:rPr>
+          <w:lang w:val="en-GB"/>
+        </w:rPr>
+        <w:t xml:space="preserve">This page provides any relevant information about the website and the services </w:t>
+      </w:r>
+      <w:r>
+        <w:rPr>
+          <w:lang w:val="en-GB"/>
+        </w:rPr>
+        <w:t xml:space="preserve">offered. It also includes travel tips </w:t>
+      </w:r>
+      <w:r>
+        <w:rPr>
+          <w:lang w:val="en-GB"/>
+        </w:rPr>
+        <w:t>to guide users and FAQ section to address common concerns.</w:t>
+      </w:r>
+    </w:p>
+    <w:p>
+      <w:pPr>
+        <w:rPr>
+          <w:lang w:val="en-GB"/>
+        </w:rPr>
+      </w:pPr>
+      <w:r>
+        <w:rPr>
+          <w:b/>
+          <w:bCs/>
+          <w:lang w:val="en-GB"/>
+        </w:rPr>
+        <w:t>Car Rental</w:t>
+      </w:r>
+      <w:r>
+        <w:rPr>
+          <w:lang w:val="en-GB"/>
+        </w:rPr>
+        <w:t xml:space="preserve">: </w:t>
+      </w:r>
+      <w:r>
+        <w:rPr>
+          <w:lang w:val="en-GB"/>
+        </w:rPr>
+        <w:t xml:space="preserve">This serves </w:t>
+      </w:r>
+      <w:r>
+        <w:rPr>
+          <w:lang w:val="en-GB"/>
+        </w:rPr>
+        <w:t>to</w:t>
+      </w:r>
+      <w:r>
+        <w:rPr>
+          <w:lang w:val="en-GB"/>
+        </w:rPr>
+        <w:t xml:space="preserve"> allow users to search for transport</w:t>
+      </w:r>
+      <w:r>
+        <w:rPr>
+          <w:lang w:val="en-GB"/>
+        </w:rPr>
+        <w:t xml:space="preserve"> services with the ability to enter a pick-up location</w:t>
+      </w:r>
+      <w:r>
+        <w:rPr>
+          <w:lang w:val="en-GB"/>
+        </w:rPr>
+        <w:t>, choose pick-up and drop-off dates</w:t>
+      </w:r>
+      <w:r>
+        <w:rPr>
+          <w:lang w:val="en-GB"/>
+        </w:rPr>
+        <w:t xml:space="preserve"> as well as an integrated </w:t>
+      </w:r>
+      <w:r>
+        <w:rPr>
+          <w:lang w:val="en-GB"/>
+        </w:rPr>
+        <w:t>FAQs section and travel tips for assistance.</w:t>
+      </w:r>
+    </w:p>
+    <w:p>
+      <w:pPr>
+        <w:rPr>
+          <w:lang w:val="en-GB"/>
+        </w:rPr>
+      </w:pPr>
+      <w:r>
+        <w:rPr>
+          <w:b/>
+          <w:bCs/>
+          <w:lang w:val="en-GB"/>
+        </w:rPr>
+        <w:t>Attractions page</w:t>
+      </w:r>
+      <w:r>
+        <w:rPr>
+          <w:lang w:val="en-GB"/>
+        </w:rPr>
+        <w:t xml:space="preserve">: This allows users to explore activities and destinations </w:t>
+      </w:r>
+      <w:r>
+        <w:rPr>
+          <w:lang w:val="en-GB"/>
+        </w:rPr>
+        <w:t xml:space="preserve">while planning for their visit to The </w:t>
+      </w:r>
+      <w:r>
+        <w:rPr>
+          <w:lang w:val="en-GB"/>
+        </w:rPr>
+        <w:t>Bahamas</w:t>
+      </w:r>
+      <w:r>
+        <w:rPr>
+          <w:lang w:val="en-GB"/>
+        </w:rPr>
+        <w:t xml:space="preserve">. Users </w:t>
+      </w:r>
+      <w:r>
+        <w:rPr>
+          <w:lang w:val="en-GB"/>
+        </w:rPr>
+        <w:t>can</w:t>
+      </w:r>
+      <w:r>
+        <w:rPr>
+          <w:lang w:val="en-GB"/>
+        </w:rPr>
+        <w:t xml:space="preserve"> make reservations and view their selection with the ability to cancel</w:t>
+      </w:r>
+      <w:r>
+        <w:rPr>
+          <w:lang w:val="en-GB"/>
+        </w:rPr>
+        <w:t xml:space="preserve"> any unwanted reservations before confirmation.</w:t>
+      </w:r>
+    </w:p>
+    <w:p>
+      <w:pPr>
+        <w:rPr>
+          <w:b/>
+          <w:bCs/>
+        </w:rPr>
+      </w:pPr>
+      <w:r>
+        <w:rPr>
+          <w:b/>
+          <w:bCs/>
+        </w:rPr>
+        <w:t>Rooms/ Listings, Room Details and Bookings Pages</w:t>
+      </w:r>
+    </w:p>
+    <w:p>
+      <w:r>
+        <w:lastRenderedPageBreak/>
+        <w:t>These pages work together to form the main booking process of the website</w:t>
+      </w:r>
+      <w:r>
+        <w:t xml:space="preserve"> all encompassed in the services page</w:t>
+      </w:r>
+      <w:r>
+        <w:t>.</w:t>
+      </w:r>
+    </w:p>
+    <w:p>
+      <w:r>
+        <w:t xml:space="preserve">The </w:t>
+      </w:r>
+      <w:r>
+        <w:rPr>
+          <w:b/>
+          <w:bCs/>
+        </w:rPr>
+        <w:t>Rooms/Listings page</w:t>
+      </w:r>
+      <w:r>
+        <w:t xml:space="preserve"> displays available accommodation options such as hotels, resorts, and lodges. Users can browse through different listings based on their search preferences.</w:t>
+      </w:r>
+    </w:p>
+    <w:p>
+      <w:r>
+        <w:t>From this page, users select a</w:t>
+      </w:r>
+      <w:r>
+        <w:t xml:space="preserve">n </w:t>
+      </w:r>
+      <w:r>
+        <w:t>accommodation</w:t>
+      </w:r>
+      <w:r>
+        <w:t xml:space="preserve"> and are directed to the </w:t>
+      </w:r>
+      <w:r>
+        <w:rPr>
+          <w:b/>
+          <w:bCs/>
+        </w:rPr>
+        <w:t>Room Details page</w:t>
+      </w:r>
+      <w:r>
+        <w:t>, which provides more detailed information including images, pricing, and descriptions of the selected accommodation.</w:t>
+      </w:r>
+    </w:p>
+    <w:p>
+      <w:r>
+        <w:t xml:space="preserve">Users can then proceed to the </w:t>
+      </w:r>
+      <w:r>
+        <w:rPr>
+          <w:b/>
+          <w:bCs/>
+        </w:rPr>
+        <w:t>Bookings page</w:t>
+      </w:r>
+      <w:r>
+        <w:t xml:space="preserve">, where they enter their </w:t>
+      </w:r>
+      <w:r>
+        <w:t>user credentials</w:t>
+      </w:r>
+      <w:r>
+        <w:t xml:space="preserve">, select </w:t>
+      </w:r>
+      <w:r>
+        <w:t xml:space="preserve">payment </w:t>
+      </w:r>
+      <w:r>
+        <w:t>method (either online or pay at property</w:t>
+      </w:r>
+      <w:r>
+        <w:t>)</w:t>
+      </w:r>
+      <w:r>
+        <w:t xml:space="preserve">, and complete the reservation process. After booking, a confirmation message is </w:t>
+      </w:r>
+      <w:r>
+        <w:t>displayed,</w:t>
+      </w:r>
+      <w:r>
+        <w:t xml:space="preserve"> and a personalized email may be sent to the user.</w:t>
+      </w:r>
+    </w:p>
+    <w:p>
+      <w:r>
+        <w:rPr>
+          <w:b/>
+          <w:bCs/>
+        </w:rPr>
+        <w:t>C</w:t>
+      </w:r>
+      <w:r>
+        <w:rPr>
+          <w:b/>
+          <w:bCs/>
+        </w:rPr>
+        <w:t>ontact</w:t>
+      </w:r>
+      <w:r>
+        <w:rPr>
+          <w:b/>
+          <w:bCs/>
+        </w:rPr>
+        <w:t xml:space="preserve"> page</w:t>
       </w:r>
       <w:r>
         <w:t>:</w:t>
@@ -2298,7 +2332,19 @@
         <w:t>It</w:t>
       </w:r>
       <w:r>
-        <w:t xml:space="preserve"> includes a multi-channel customer support system. The platform allows users to contact support through a contact form, where they are required to provide relevant information such as their name, email, and query. Alternatively, users can seek assistance through social media platforms such as WhatsApp or Instagram, where they can communicate their issues based on the features of the selected platform.</w:t>
+        <w:t xml:space="preserve"> includes a multi-channel customer support system. The platform allows users to contact support through a contact form, where they are required to provide relevant information such as their name, email, and query</w:t>
+      </w:r>
+      <w:r>
+        <w:t xml:space="preserve">, as well as a </w:t>
+      </w:r>
+      <w:r>
+        <w:t>feedback section</w:t>
+      </w:r>
+      <w:r>
+        <w:t>.</w:t>
+      </w:r>
+      <w:r>
+        <w:t xml:space="preserve"> Alternatively, users can seek assistance through social media platforms such as WhatsApp or Instagram, where they can communicate their issues based on the features of the selected platform.</w:t>
       </w:r>
     </w:p>
     <w:p/>
@@ -2433,7 +2479,6 @@
         <w:rPr>
           <w:rStyle w:val="Strong"/>
         </w:rPr>
-        <w:lastRenderedPageBreak/>
         <w:t>DEVELOPMENT TOOLS</w:t>
       </w:r>
     </w:p>
@@ -2506,6 +2551,7 @@
     </w:p>
     <w:p>
       <w:r>
+        <w:lastRenderedPageBreak/>
         <w:t>Pinterest: Alternative for visual elements</w:t>
       </w:r>
     </w:p>
@@ -2583,12 +2629,11 @@
         <w:rPr>
           <w:noProof/>
         </w:rPr>
-        <w:lastRenderedPageBreak/>
         <w:drawing>
-          <wp:inline distT="0" distB="0" distL="0" distR="0" wp14:anchorId="7A5EC0F7" wp14:editId="117A5508">
-            <wp:extent cx="3790950" cy="9190990"/>
-            <wp:effectExtent l="0" t="0" r="0" b="0"/>
-            <wp:docPr id="1771502528" name="Picture 1"/>
+          <wp:inline distT="0" distB="0" distL="0" distR="0" wp14:anchorId="6221C1CD" wp14:editId="41BCD31F">
+            <wp:extent cx="5731510" cy="4954905"/>
+            <wp:effectExtent l="0" t="0" r="2540" b="0"/>
+            <wp:docPr id="577673764" name="Picture 2"/>
             <wp:cNvGraphicFramePr>
               <a:graphicFrameLocks xmlns:a="http://schemas.openxmlformats.org/drawingml/2006/main" noChangeAspect="1"/>
             </wp:cNvGraphicFramePr>
@@ -2596,7 +2641,7 @@
               <a:graphicData uri="http://schemas.openxmlformats.org/drawingml/2006/picture">
                 <pic:pic xmlns:pic="http://schemas.openxmlformats.org/drawingml/2006/picture">
                   <pic:nvPicPr>
-                    <pic:cNvPr id="1771502528" name="Picture 1"/>
+                    <pic:cNvPr id="577673764" name="Picture 577673764"/>
                     <pic:cNvPicPr/>
                   </pic:nvPicPr>
                   <pic:blipFill>
@@ -2614,7 +2659,7 @@
                   <pic:spPr>
                     <a:xfrm>
                       <a:off x="0" y="0"/>
-                      <a:ext cx="3794468" cy="9199519"/>
+                      <a:ext cx="5731510" cy="4954905"/>
                     </a:xfrm>
                     <a:prstGeom prst="rect">
                       <a:avLst/>
@@ -2629,7 +2674,6 @@
     </w:p>
     <w:p>
       <w:r>
-        <w:lastRenderedPageBreak/>
         <w:t xml:space="preserve"> </w:t>
       </w:r>
     </w:p>
@@ -2681,6 +2725,7 @@
         <w:rPr>
           <w:lang w:val="en-GB"/>
         </w:rPr>
+        <w:lastRenderedPageBreak/>
         <w:br/>
       </w:r>
     </w:p>
@@ -2749,17 +2794,17 @@
   <w:abstractNum w:abstractNumId="0" w15:restartNumberingAfterBreak="0">
     <w:nsid w:val="05CF07E4"/>
     <w:multiLevelType w:val="hybridMultilevel"/>
-    <w:tmpl w:val="E192421C"/>
-    <w:lvl w:ilvl="0" w:tplc="2000000B">
-      <w:start w:val="1"/>
-      <w:numFmt w:val="bullet"/>
-      <w:lvlText w:val=""/>
+    <w:tmpl w:val="32B82912"/>
+    <w:lvl w:ilvl="0" w:tplc="20000001">
+      <w:start w:val="1"/>
+      <w:numFmt w:val="bullet"/>
+      <w:lvlText w:val=""/>
       <w:lvlJc w:val="left"/>
       <w:pPr>
         <w:ind w:left="720" w:hanging="360"/>
       </w:pPr>
       <w:rPr>
-        <w:rFonts w:ascii="Wingdings" w:hAnsi="Wingdings" w:hint="default"/>
+        <w:rFonts w:ascii="Symbol" w:hAnsi="Symbol" w:hint="default"/>
       </w:rPr>
     </w:lvl>
     <w:lvl w:ilvl="1" w:tplc="20000003" w:tentative="1">
@@ -2860,6 +2905,119 @@
     </w:lvl>
   </w:abstractNum>
   <w:abstractNum w:abstractNumId="1" w15:restartNumberingAfterBreak="0">
+    <w:nsid w:val="11EC2EA7"/>
+    <w:multiLevelType w:val="hybridMultilevel"/>
+    <w:tmpl w:val="E80A5A30"/>
+    <w:lvl w:ilvl="0" w:tplc="20000003">
+      <w:start w:val="1"/>
+      <w:numFmt w:val="bullet"/>
+      <w:lvlText w:val="o"/>
+      <w:lvlJc w:val="left"/>
+      <w:pPr>
+        <w:ind w:left="720" w:hanging="360"/>
+      </w:pPr>
+      <w:rPr>
+        <w:rFonts w:ascii="Courier New" w:hAnsi="Courier New" w:cs="Courier New" w:hint="default"/>
+      </w:rPr>
+    </w:lvl>
+    <w:lvl w:ilvl="1" w:tplc="20000003" w:tentative="1">
+      <w:start w:val="1"/>
+      <w:numFmt w:val="bullet"/>
+      <w:lvlText w:val="o"/>
+      <w:lvlJc w:val="left"/>
+      <w:pPr>
+        <w:ind w:left="1440" w:hanging="360"/>
+      </w:pPr>
+      <w:rPr>
+        <w:rFonts w:ascii="Courier New" w:hAnsi="Courier New" w:cs="Courier New" w:hint="default"/>
+      </w:rPr>
+    </w:lvl>
+    <w:lvl w:ilvl="2" w:tplc="20000005" w:tentative="1">
+      <w:start w:val="1"/>
+      <w:numFmt w:val="bullet"/>
+      <w:lvlText w:val=""/>
+      <w:lvlJc w:val="left"/>
+      <w:pPr>
+        <w:ind w:left="2160" w:hanging="360"/>
+      </w:pPr>
+      <w:rPr>
+        <w:rFonts w:ascii="Wingdings" w:hAnsi="Wingdings" w:hint="default"/>
+      </w:rPr>
+    </w:lvl>
+    <w:lvl w:ilvl="3" w:tplc="20000001" w:tentative="1">
+      <w:start w:val="1"/>
+      <w:numFmt w:val="bullet"/>
+      <w:lvlText w:val=""/>
+      <w:lvlJc w:val="left"/>
+      <w:pPr>
+        <w:ind w:left="2880" w:hanging="360"/>
+      </w:pPr>
+      <w:rPr>
+        <w:rFonts w:ascii="Symbol" w:hAnsi="Symbol" w:hint="default"/>
+      </w:rPr>
+    </w:lvl>
+    <w:lvl w:ilvl="4" w:tplc="20000003" w:tentative="1">
+      <w:start w:val="1"/>
+      <w:numFmt w:val="bullet"/>
+      <w:lvlText w:val="o"/>
+      <w:lvlJc w:val="left"/>
+      <w:pPr>
+        <w:ind w:left="3600" w:hanging="360"/>
+      </w:pPr>
+      <w:rPr>
+        <w:rFonts w:ascii="Courier New" w:hAnsi="Courier New" w:cs="Courier New" w:hint="default"/>
+      </w:rPr>
+    </w:lvl>
+    <w:lvl w:ilvl="5" w:tplc="20000005" w:tentative="1">
+      <w:start w:val="1"/>
+      <w:numFmt w:val="bullet"/>
+      <w:lvlText w:val=""/>
+      <w:lvlJc w:val="left"/>
+      <w:pPr>
+        <w:ind w:left="4320" w:hanging="360"/>
+      </w:pPr>
+      <w:rPr>
+        <w:rFonts w:ascii="Wingdings" w:hAnsi="Wingdings" w:hint="default"/>
+      </w:rPr>
+    </w:lvl>
+    <w:lvl w:ilvl="6" w:tplc="20000001" w:tentative="1">
+      <w:start w:val="1"/>
+      <w:numFmt w:val="bullet"/>
+      <w:lvlText w:val=""/>
+      <w:lvlJc w:val="left"/>
+      <w:pPr>
+        <w:ind w:left="5040" w:hanging="360"/>
+      </w:pPr>
+      <w:rPr>
+        <w:rFonts w:ascii="Symbol" w:hAnsi="Symbol" w:hint="default"/>
+      </w:rPr>
+    </w:lvl>
+    <w:lvl w:ilvl="7" w:tplc="20000003" w:tentative="1">
+      <w:start w:val="1"/>
+      <w:numFmt w:val="bullet"/>
+      <w:lvlText w:val="o"/>
+      <w:lvlJc w:val="left"/>
+      <w:pPr>
+        <w:ind w:left="5760" w:hanging="360"/>
+      </w:pPr>
+      <w:rPr>
+        <w:rFonts w:ascii="Courier New" w:hAnsi="Courier New" w:cs="Courier New" w:hint="default"/>
+      </w:rPr>
+    </w:lvl>
+    <w:lvl w:ilvl="8" w:tplc="20000005" w:tentative="1">
+      <w:start w:val="1"/>
+      <w:numFmt w:val="bullet"/>
+      <w:lvlText w:val=""/>
+      <w:lvlJc w:val="left"/>
+      <w:pPr>
+        <w:ind w:left="6480" w:hanging="360"/>
+      </w:pPr>
+      <w:rPr>
+        <w:rFonts w:ascii="Wingdings" w:hAnsi="Wingdings" w:hint="default"/>
+      </w:rPr>
+    </w:lvl>
+  </w:abstractNum>
+  <w:abstractNum w:abstractNumId="2" w15:restartNumberingAfterBreak="0">
     <w:nsid w:val="139A228F"/>
     <w:multiLevelType w:val="hybridMultilevel"/>
     <w:tmpl w:val="F36615FC"/>
@@ -2972,7 +3130,7 @@
       </w:rPr>
     </w:lvl>
   </w:abstractNum>
-  <w:abstractNum w:abstractNumId="2" w15:restartNumberingAfterBreak="0">
+  <w:abstractNum w:abstractNumId="3" w15:restartNumberingAfterBreak="0">
     <w:nsid w:val="18B45768"/>
     <w:multiLevelType w:val="hybridMultilevel"/>
     <w:tmpl w:val="F58EDC6E"/>
@@ -3085,20 +3243,133 @@
       </w:rPr>
     </w:lvl>
   </w:abstractNum>
-  <w:abstractNum w:abstractNumId="3" w15:restartNumberingAfterBreak="0">
+  <w:abstractNum w:abstractNumId="4" w15:restartNumberingAfterBreak="0">
     <w:nsid w:val="1E543384"/>
     <w:multiLevelType w:val="hybridMultilevel"/>
-    <w:tmpl w:val="2B0CF0BA"/>
-    <w:lvl w:ilvl="0" w:tplc="2000000B">
-      <w:start w:val="1"/>
-      <w:numFmt w:val="bullet"/>
-      <w:lvlText w:val=""/>
+    <w:tmpl w:val="E990FFDA"/>
+    <w:lvl w:ilvl="0" w:tplc="20000001">
+      <w:start w:val="1"/>
+      <w:numFmt w:val="bullet"/>
+      <w:lvlText w:val=""/>
       <w:lvlJc w:val="left"/>
       <w:pPr>
         <w:ind w:left="720" w:hanging="360"/>
       </w:pPr>
       <w:rPr>
-        <w:rFonts w:ascii="Wingdings" w:hAnsi="Wingdings" w:hint="default"/>
+        <w:rFonts w:ascii="Symbol" w:hAnsi="Symbol" w:hint="default"/>
+      </w:rPr>
+    </w:lvl>
+    <w:lvl w:ilvl="1" w:tplc="20000003">
+      <w:start w:val="1"/>
+      <w:numFmt w:val="bullet"/>
+      <w:lvlText w:val="o"/>
+      <w:lvlJc w:val="left"/>
+      <w:pPr>
+        <w:ind w:left="1440" w:hanging="360"/>
+      </w:pPr>
+      <w:rPr>
+        <w:rFonts w:ascii="Courier New" w:hAnsi="Courier New" w:cs="Courier New" w:hint="default"/>
+      </w:rPr>
+    </w:lvl>
+    <w:lvl w:ilvl="2" w:tplc="20000005" w:tentative="1">
+      <w:start w:val="1"/>
+      <w:numFmt w:val="bullet"/>
+      <w:lvlText w:val=""/>
+      <w:lvlJc w:val="left"/>
+      <w:pPr>
+        <w:ind w:left="2160" w:hanging="360"/>
+      </w:pPr>
+      <w:rPr>
+        <w:rFonts w:ascii="Wingdings" w:hAnsi="Wingdings" w:hint="default"/>
+      </w:rPr>
+    </w:lvl>
+    <w:lvl w:ilvl="3" w:tplc="20000001" w:tentative="1">
+      <w:start w:val="1"/>
+      <w:numFmt w:val="bullet"/>
+      <w:lvlText w:val=""/>
+      <w:lvlJc w:val="left"/>
+      <w:pPr>
+        <w:ind w:left="2880" w:hanging="360"/>
+      </w:pPr>
+      <w:rPr>
+        <w:rFonts w:ascii="Symbol" w:hAnsi="Symbol" w:hint="default"/>
+      </w:rPr>
+    </w:lvl>
+    <w:lvl w:ilvl="4" w:tplc="20000003" w:tentative="1">
+      <w:start w:val="1"/>
+      <w:numFmt w:val="bullet"/>
+      <w:lvlText w:val="o"/>
+      <w:lvlJc w:val="left"/>
+      <w:pPr>
+        <w:ind w:left="3600" w:hanging="360"/>
+      </w:pPr>
+      <w:rPr>
+        <w:rFonts w:ascii="Courier New" w:hAnsi="Courier New" w:cs="Courier New" w:hint="default"/>
+      </w:rPr>
+    </w:lvl>
+    <w:lvl w:ilvl="5" w:tplc="20000005" w:tentative="1">
+      <w:start w:val="1"/>
+      <w:numFmt w:val="bullet"/>
+      <w:lvlText w:val=""/>
+      <w:lvlJc w:val="left"/>
+      <w:pPr>
+        <w:ind w:left="4320" w:hanging="360"/>
+      </w:pPr>
+      <w:rPr>
+        <w:rFonts w:ascii="Wingdings" w:hAnsi="Wingdings" w:hint="default"/>
+      </w:rPr>
+    </w:lvl>
+    <w:lvl w:ilvl="6" w:tplc="20000001" w:tentative="1">
+      <w:start w:val="1"/>
+      <w:numFmt w:val="bullet"/>
+      <w:lvlText w:val=""/>
+      <w:lvlJc w:val="left"/>
+      <w:pPr>
+        <w:ind w:left="5040" w:hanging="360"/>
+      </w:pPr>
+      <w:rPr>
+        <w:rFonts w:ascii="Symbol" w:hAnsi="Symbol" w:hint="default"/>
+      </w:rPr>
+    </w:lvl>
+    <w:lvl w:ilvl="7" w:tplc="20000003" w:tentative="1">
+      <w:start w:val="1"/>
+      <w:numFmt w:val="bullet"/>
+      <w:lvlText w:val="o"/>
+      <w:lvlJc w:val="left"/>
+      <w:pPr>
+        <w:ind w:left="5760" w:hanging="360"/>
+      </w:pPr>
+      <w:rPr>
+        <w:rFonts w:ascii="Courier New" w:hAnsi="Courier New" w:cs="Courier New" w:hint="default"/>
+      </w:rPr>
+    </w:lvl>
+    <w:lvl w:ilvl="8" w:tplc="20000005" w:tentative="1">
+      <w:start w:val="1"/>
+      <w:numFmt w:val="bullet"/>
+      <w:lvlText w:val=""/>
+      <w:lvlJc w:val="left"/>
+      <w:pPr>
+        <w:ind w:left="6480" w:hanging="360"/>
+      </w:pPr>
+      <w:rPr>
+        <w:rFonts w:ascii="Wingdings" w:hAnsi="Wingdings" w:hint="default"/>
+      </w:rPr>
+    </w:lvl>
+  </w:abstractNum>
+  <w:abstractNum w:abstractNumId="5" w15:restartNumberingAfterBreak="0">
+    <w:nsid w:val="266366A7"/>
+    <w:multiLevelType w:val="hybridMultilevel"/>
+    <w:tmpl w:val="B05C620E"/>
+    <w:lvl w:ilvl="0" w:tplc="20000003">
+      <w:start w:val="1"/>
+      <w:numFmt w:val="bullet"/>
+      <w:lvlText w:val="o"/>
+      <w:lvlJc w:val="left"/>
+      <w:pPr>
+        <w:ind w:left="720" w:hanging="360"/>
+      </w:pPr>
+      <w:rPr>
+        <w:rFonts w:ascii="Courier New" w:hAnsi="Courier New" w:cs="Courier New" w:hint="default"/>
       </w:rPr>
     </w:lvl>
     <w:lvl w:ilvl="1" w:tplc="20000003" w:tentative="1">
@@ -3198,7 +3469,120 @@
       </w:rPr>
     </w:lvl>
   </w:abstractNum>
-  <w:abstractNum w:abstractNumId="4" w15:restartNumberingAfterBreak="0">
+  <w:abstractNum w:abstractNumId="6" w15:restartNumberingAfterBreak="0">
+    <w:nsid w:val="31930DFC"/>
+    <w:multiLevelType w:val="hybridMultilevel"/>
+    <w:tmpl w:val="26BC3FCE"/>
+    <w:lvl w:ilvl="0" w:tplc="20000003">
+      <w:start w:val="1"/>
+      <w:numFmt w:val="bullet"/>
+      <w:lvlText w:val="o"/>
+      <w:lvlJc w:val="left"/>
+      <w:pPr>
+        <w:ind w:left="765" w:hanging="360"/>
+      </w:pPr>
+      <w:rPr>
+        <w:rFonts w:ascii="Courier New" w:hAnsi="Courier New" w:cs="Courier New" w:hint="default"/>
+      </w:rPr>
+    </w:lvl>
+    <w:lvl w:ilvl="1" w:tplc="20000003" w:tentative="1">
+      <w:start w:val="1"/>
+      <w:numFmt w:val="bullet"/>
+      <w:lvlText w:val="o"/>
+      <w:lvlJc w:val="left"/>
+      <w:pPr>
+        <w:ind w:left="1485" w:hanging="360"/>
+      </w:pPr>
+      <w:rPr>
+        <w:rFonts w:ascii="Courier New" w:hAnsi="Courier New" w:cs="Courier New" w:hint="default"/>
+      </w:rPr>
+    </w:lvl>
+    <w:lvl w:ilvl="2" w:tplc="20000005" w:tentative="1">
+      <w:start w:val="1"/>
+      <w:numFmt w:val="bullet"/>
+      <w:lvlText w:val=""/>
+      <w:lvlJc w:val="left"/>
+      <w:pPr>
+        <w:ind w:left="2205" w:hanging="360"/>
+      </w:pPr>
+      <w:rPr>
+        <w:rFonts w:ascii="Wingdings" w:hAnsi="Wingdings" w:hint="default"/>
+      </w:rPr>
+    </w:lvl>
+    <w:lvl w:ilvl="3" w:tplc="20000001" w:tentative="1">
+      <w:start w:val="1"/>
+      <w:numFmt w:val="bullet"/>
+      <w:lvlText w:val=""/>
+      <w:lvlJc w:val="left"/>
+      <w:pPr>
+        <w:ind w:left="2925" w:hanging="360"/>
+      </w:pPr>
+      <w:rPr>
+        <w:rFonts w:ascii="Symbol" w:hAnsi="Symbol" w:hint="default"/>
+      </w:rPr>
+    </w:lvl>
+    <w:lvl w:ilvl="4" w:tplc="20000003" w:tentative="1">
+      <w:start w:val="1"/>
+      <w:numFmt w:val="bullet"/>
+      <w:lvlText w:val="o"/>
+      <w:lvlJc w:val="left"/>
+      <w:pPr>
+        <w:ind w:left="3645" w:hanging="360"/>
+      </w:pPr>
+      <w:rPr>
+        <w:rFonts w:ascii="Courier New" w:hAnsi="Courier New" w:cs="Courier New" w:hint="default"/>
+      </w:rPr>
+    </w:lvl>
+    <w:lvl w:ilvl="5" w:tplc="20000005" w:tentative="1">
+      <w:start w:val="1"/>
+      <w:numFmt w:val="bullet"/>
+      <w:lvlText w:val=""/>
+      <w:lvlJc w:val="left"/>
+      <w:pPr>
+        <w:ind w:left="4365" w:hanging="360"/>
+      </w:pPr>
+      <w:rPr>
+        <w:rFonts w:ascii="Wingdings" w:hAnsi="Wingdings" w:hint="default"/>
+      </w:rPr>
+    </w:lvl>
+    <w:lvl w:ilvl="6" w:tplc="20000001" w:tentative="1">
+      <w:start w:val="1"/>
+      <w:numFmt w:val="bullet"/>
+      <w:lvlText w:val=""/>
+      <w:lvlJc w:val="left"/>
+      <w:pPr>
+        <w:ind w:left="5085" w:hanging="360"/>
+      </w:pPr>
+      <w:rPr>
+        <w:rFonts w:ascii="Symbol" w:hAnsi="Symbol" w:hint="default"/>
+      </w:rPr>
+    </w:lvl>
+    <w:lvl w:ilvl="7" w:tplc="20000003" w:tentative="1">
+      <w:start w:val="1"/>
+      <w:numFmt w:val="bullet"/>
+      <w:lvlText w:val="o"/>
+      <w:lvlJc w:val="left"/>
+      <w:pPr>
+        <w:ind w:left="5805" w:hanging="360"/>
+      </w:pPr>
+      <w:rPr>
+        <w:rFonts w:ascii="Courier New" w:hAnsi="Courier New" w:cs="Courier New" w:hint="default"/>
+      </w:rPr>
+    </w:lvl>
+    <w:lvl w:ilvl="8" w:tplc="20000005" w:tentative="1">
+      <w:start w:val="1"/>
+      <w:numFmt w:val="bullet"/>
+      <w:lvlText w:val=""/>
+      <w:lvlJc w:val="left"/>
+      <w:pPr>
+        <w:ind w:left="6525" w:hanging="360"/>
+      </w:pPr>
+      <w:rPr>
+        <w:rFonts w:ascii="Wingdings" w:hAnsi="Wingdings" w:hint="default"/>
+      </w:rPr>
+    </w:lvl>
+  </w:abstractNum>
+  <w:abstractNum w:abstractNumId="7" w15:restartNumberingAfterBreak="0">
     <w:nsid w:val="319D16C8"/>
     <w:multiLevelType w:val="hybridMultilevel"/>
     <w:tmpl w:val="31C243AA"/>
@@ -3311,7 +3695,7 @@
       </w:rPr>
     </w:lvl>
   </w:abstractNum>
-  <w:abstractNum w:abstractNumId="5" w15:restartNumberingAfterBreak="0">
+  <w:abstractNum w:abstractNumId="8" w15:restartNumberingAfterBreak="0">
     <w:nsid w:val="32C03569"/>
     <w:multiLevelType w:val="hybridMultilevel"/>
     <w:tmpl w:val="61A2049C"/>
@@ -3424,7 +3808,7 @@
       </w:rPr>
     </w:lvl>
   </w:abstractNum>
-  <w:abstractNum w:abstractNumId="6" w15:restartNumberingAfterBreak="0">
+  <w:abstractNum w:abstractNumId="9" w15:restartNumberingAfterBreak="0">
     <w:nsid w:val="34804BCA"/>
     <w:multiLevelType w:val="hybridMultilevel"/>
     <w:tmpl w:val="8BA6DEBA"/>
@@ -3537,7 +3921,7 @@
       </w:rPr>
     </w:lvl>
   </w:abstractNum>
-  <w:abstractNum w:abstractNumId="7" w15:restartNumberingAfterBreak="0">
+  <w:abstractNum w:abstractNumId="10" w15:restartNumberingAfterBreak="0">
     <w:nsid w:val="37FE5D09"/>
     <w:multiLevelType w:val="hybridMultilevel"/>
     <w:tmpl w:val="838C3468"/>
@@ -3626,20 +4010,20 @@
       </w:pPr>
     </w:lvl>
   </w:abstractNum>
-  <w:abstractNum w:abstractNumId="8" w15:restartNumberingAfterBreak="0">
+  <w:abstractNum w:abstractNumId="11" w15:restartNumberingAfterBreak="0">
     <w:nsid w:val="383D4A45"/>
     <w:multiLevelType w:val="hybridMultilevel"/>
-    <w:tmpl w:val="DD2092B4"/>
-    <w:lvl w:ilvl="0" w:tplc="2000000B">
-      <w:start w:val="1"/>
-      <w:numFmt w:val="bullet"/>
-      <w:lvlText w:val=""/>
-      <w:lvlJc w:val="left"/>
-      <w:pPr>
-        <w:ind w:left="720" w:hanging="360"/>
-      </w:pPr>
-      <w:rPr>
-        <w:rFonts w:ascii="Wingdings" w:hAnsi="Wingdings" w:hint="default"/>
+    <w:tmpl w:val="BC8CC10C"/>
+    <w:lvl w:ilvl="0" w:tplc="20000001">
+      <w:start w:val="1"/>
+      <w:numFmt w:val="bullet"/>
+      <w:lvlText w:val=""/>
+      <w:lvlJc w:val="left"/>
+      <w:pPr>
+        <w:ind w:left="1080" w:hanging="360"/>
+      </w:pPr>
+      <w:rPr>
+        <w:rFonts w:ascii="Symbol" w:hAnsi="Symbol" w:hint="default"/>
       </w:rPr>
     </w:lvl>
     <w:lvl w:ilvl="1" w:tplc="20000003" w:tentative="1">
@@ -3648,7 +4032,7 @@
       <w:lvlText w:val="o"/>
       <w:lvlJc w:val="left"/>
       <w:pPr>
-        <w:ind w:left="1440" w:hanging="360"/>
+        <w:ind w:left="1800" w:hanging="360"/>
       </w:pPr>
       <w:rPr>
         <w:rFonts w:ascii="Courier New" w:hAnsi="Courier New" w:cs="Courier New" w:hint="default"/>
@@ -3660,7 +4044,7 @@
       <w:lvlText w:val=""/>
       <w:lvlJc w:val="left"/>
       <w:pPr>
-        <w:ind w:left="2160" w:hanging="360"/>
+        <w:ind w:left="2520" w:hanging="360"/>
       </w:pPr>
       <w:rPr>
         <w:rFonts w:ascii="Wingdings" w:hAnsi="Wingdings" w:hint="default"/>
@@ -3672,7 +4056,7 @@
       <w:lvlText w:val=""/>
       <w:lvlJc w:val="left"/>
       <w:pPr>
-        <w:ind w:left="2880" w:hanging="360"/>
+        <w:ind w:left="3240" w:hanging="360"/>
       </w:pPr>
       <w:rPr>
         <w:rFonts w:ascii="Symbol" w:hAnsi="Symbol" w:hint="default"/>
@@ -3684,7 +4068,7 @@
       <w:lvlText w:val="o"/>
       <w:lvlJc w:val="left"/>
       <w:pPr>
-        <w:ind w:left="3600" w:hanging="360"/>
+        <w:ind w:left="3960" w:hanging="360"/>
       </w:pPr>
       <w:rPr>
         <w:rFonts w:ascii="Courier New" w:hAnsi="Courier New" w:cs="Courier New" w:hint="default"/>
@@ -3696,7 +4080,7 @@
       <w:lvlText w:val=""/>
       <w:lvlJc w:val="left"/>
       <w:pPr>
-        <w:ind w:left="4320" w:hanging="360"/>
+        <w:ind w:left="4680" w:hanging="360"/>
       </w:pPr>
       <w:rPr>
         <w:rFonts w:ascii="Wingdings" w:hAnsi="Wingdings" w:hint="default"/>
@@ -3708,7 +4092,7 @@
       <w:lvlText w:val=""/>
       <w:lvlJc w:val="left"/>
       <w:pPr>
-        <w:ind w:left="5040" w:hanging="360"/>
+        <w:ind w:left="5400" w:hanging="360"/>
       </w:pPr>
       <w:rPr>
         <w:rFonts w:ascii="Symbol" w:hAnsi="Symbol" w:hint="default"/>
@@ -3720,7 +4104,7 @@
       <w:lvlText w:val="o"/>
       <w:lvlJc w:val="left"/>
       <w:pPr>
-        <w:ind w:left="5760" w:hanging="360"/>
+        <w:ind w:left="6120" w:hanging="360"/>
       </w:pPr>
       <w:rPr>
         <w:rFonts w:ascii="Courier New" w:hAnsi="Courier New" w:cs="Courier New" w:hint="default"/>
@@ -3732,27 +4116,27 @@
       <w:lvlText w:val=""/>
       <w:lvlJc w:val="left"/>
       <w:pPr>
-        <w:ind w:left="6480" w:hanging="360"/>
+        <w:ind w:left="6840" w:hanging="360"/>
       </w:pPr>
       <w:rPr>
         <w:rFonts w:ascii="Wingdings" w:hAnsi="Wingdings" w:hint="default"/>
       </w:rPr>
     </w:lvl>
   </w:abstractNum>
-  <w:abstractNum w:abstractNumId="9" w15:restartNumberingAfterBreak="0">
+  <w:abstractNum w:abstractNumId="12" w15:restartNumberingAfterBreak="0">
     <w:nsid w:val="3CC92D91"/>
     <w:multiLevelType w:val="hybridMultilevel"/>
-    <w:tmpl w:val="8DBE20BC"/>
-    <w:lvl w:ilvl="0" w:tplc="2000000B">
-      <w:start w:val="1"/>
-      <w:numFmt w:val="bullet"/>
-      <w:lvlText w:val=""/>
-      <w:lvlJc w:val="left"/>
-      <w:pPr>
-        <w:ind w:left="720" w:hanging="360"/>
-      </w:pPr>
-      <w:rPr>
-        <w:rFonts w:ascii="Wingdings" w:hAnsi="Wingdings" w:hint="default"/>
+    <w:tmpl w:val="099E42DA"/>
+    <w:lvl w:ilvl="0" w:tplc="20000001">
+      <w:start w:val="1"/>
+      <w:numFmt w:val="bullet"/>
+      <w:lvlText w:val=""/>
+      <w:lvlJc w:val="left"/>
+      <w:pPr>
+        <w:ind w:left="1080" w:hanging="360"/>
+      </w:pPr>
+      <w:rPr>
+        <w:rFonts w:ascii="Symbol" w:hAnsi="Symbol" w:hint="default"/>
       </w:rPr>
     </w:lvl>
     <w:lvl w:ilvl="1" w:tplc="20000003" w:tentative="1">
@@ -3761,7 +4145,7 @@
       <w:lvlText w:val="o"/>
       <w:lvlJc w:val="left"/>
       <w:pPr>
-        <w:ind w:left="1440" w:hanging="360"/>
+        <w:ind w:left="1800" w:hanging="360"/>
       </w:pPr>
       <w:rPr>
         <w:rFonts w:ascii="Courier New" w:hAnsi="Courier New" w:cs="Courier New" w:hint="default"/>
@@ -3773,7 +4157,7 @@
       <w:lvlText w:val=""/>
       <w:lvlJc w:val="left"/>
       <w:pPr>
-        <w:ind w:left="2160" w:hanging="360"/>
+        <w:ind w:left="2520" w:hanging="360"/>
       </w:pPr>
       <w:rPr>
         <w:rFonts w:ascii="Wingdings" w:hAnsi="Wingdings" w:hint="default"/>
@@ -3785,7 +4169,7 @@
       <w:lvlText w:val=""/>
       <w:lvlJc w:val="left"/>
       <w:pPr>
-        <w:ind w:left="2880" w:hanging="360"/>
+        <w:ind w:left="3240" w:hanging="360"/>
       </w:pPr>
       <w:rPr>
         <w:rFonts w:ascii="Symbol" w:hAnsi="Symbol" w:hint="default"/>
@@ -3797,7 +4181,7 @@
       <w:lvlText w:val="o"/>
       <w:lvlJc w:val="left"/>
       <w:pPr>
-        <w:ind w:left="3600" w:hanging="360"/>
+        <w:ind w:left="3960" w:hanging="360"/>
       </w:pPr>
       <w:rPr>
         <w:rFonts w:ascii="Courier New" w:hAnsi="Courier New" w:cs="Courier New" w:hint="default"/>
@@ -3809,7 +4193,7 @@
       <w:lvlText w:val=""/>
       <w:lvlJc w:val="left"/>
       <w:pPr>
-        <w:ind w:left="4320" w:hanging="360"/>
+        <w:ind w:left="4680" w:hanging="360"/>
       </w:pPr>
       <w:rPr>
         <w:rFonts w:ascii="Wingdings" w:hAnsi="Wingdings" w:hint="default"/>
@@ -3821,7 +4205,7 @@
       <w:lvlText w:val=""/>
       <w:lvlJc w:val="left"/>
       <w:pPr>
-        <w:ind w:left="5040" w:hanging="360"/>
+        <w:ind w:left="5400" w:hanging="360"/>
       </w:pPr>
       <w:rPr>
         <w:rFonts w:ascii="Symbol" w:hAnsi="Symbol" w:hint="default"/>
@@ -3833,7 +4217,7 @@
       <w:lvlText w:val="o"/>
       <w:lvlJc w:val="left"/>
       <w:pPr>
-        <w:ind w:left="5760" w:hanging="360"/>
+        <w:ind w:left="6120" w:hanging="360"/>
       </w:pPr>
       <w:rPr>
         <w:rFonts w:ascii="Courier New" w:hAnsi="Courier New" w:cs="Courier New" w:hint="default"/>
@@ -3845,36 +4229,36 @@
       <w:lvlText w:val=""/>
       <w:lvlJc w:val="left"/>
       <w:pPr>
-        <w:ind w:left="6480" w:hanging="360"/>
+        <w:ind w:left="6840" w:hanging="360"/>
       </w:pPr>
       <w:rPr>
         <w:rFonts w:ascii="Wingdings" w:hAnsi="Wingdings" w:hint="default"/>
       </w:rPr>
     </w:lvl>
   </w:abstractNum>
-  <w:abstractNum w:abstractNumId="10" w15:restartNumberingAfterBreak="0">
+  <w:abstractNum w:abstractNumId="13" w15:restartNumberingAfterBreak="0">
     <w:nsid w:val="3EB85D2A"/>
     <w:multiLevelType w:val="hybridMultilevel"/>
-    <w:tmpl w:val="E0801532"/>
-    <w:lvl w:ilvl="0" w:tplc="2000000B">
-      <w:start w:val="1"/>
-      <w:numFmt w:val="bullet"/>
-      <w:lvlText w:val=""/>
-      <w:lvlJc w:val="left"/>
-      <w:pPr>
-        <w:ind w:left="720" w:hanging="360"/>
-      </w:pPr>
-      <w:rPr>
-        <w:rFonts w:ascii="Wingdings" w:hAnsi="Wingdings" w:hint="default"/>
-      </w:rPr>
-    </w:lvl>
-    <w:lvl w:ilvl="1" w:tplc="20000003" w:tentative="1">
-      <w:start w:val="1"/>
-      <w:numFmt w:val="bullet"/>
-      <w:lvlText w:val="o"/>
-      <w:lvlJc w:val="left"/>
-      <w:pPr>
-        <w:ind w:left="1440" w:hanging="360"/>
+    <w:tmpl w:val="CF348E3E"/>
+    <w:lvl w:ilvl="0" w:tplc="20000001">
+      <w:start w:val="1"/>
+      <w:numFmt w:val="bullet"/>
+      <w:lvlText w:val=""/>
+      <w:lvlJc w:val="left"/>
+      <w:pPr>
+        <w:ind w:left="2160" w:hanging="360"/>
+      </w:pPr>
+      <w:rPr>
+        <w:rFonts w:ascii="Symbol" w:hAnsi="Symbol" w:hint="default"/>
+      </w:rPr>
+    </w:lvl>
+    <w:lvl w:ilvl="1" w:tplc="20000003">
+      <w:start w:val="1"/>
+      <w:numFmt w:val="bullet"/>
+      <w:lvlText w:val="o"/>
+      <w:lvlJc w:val="left"/>
+      <w:pPr>
+        <w:ind w:left="2880" w:hanging="360"/>
       </w:pPr>
       <w:rPr>
         <w:rFonts w:ascii="Courier New" w:hAnsi="Courier New" w:cs="Courier New" w:hint="default"/>
@@ -3886,7 +4270,7 @@
       <w:lvlText w:val=""/>
       <w:lvlJc w:val="left"/>
       <w:pPr>
-        <w:ind w:left="2160" w:hanging="360"/>
+        <w:ind w:left="3600" w:hanging="360"/>
       </w:pPr>
       <w:rPr>
         <w:rFonts w:ascii="Wingdings" w:hAnsi="Wingdings" w:hint="default"/>
@@ -3898,7 +4282,7 @@
       <w:lvlText w:val=""/>
       <w:lvlJc w:val="left"/>
       <w:pPr>
-        <w:ind w:left="2880" w:hanging="360"/>
+        <w:ind w:left="4320" w:hanging="360"/>
       </w:pPr>
       <w:rPr>
         <w:rFonts w:ascii="Symbol" w:hAnsi="Symbol" w:hint="default"/>
@@ -3910,7 +4294,7 @@
       <w:lvlText w:val="o"/>
       <w:lvlJc w:val="left"/>
       <w:pPr>
-        <w:ind w:left="3600" w:hanging="360"/>
+        <w:ind w:left="5040" w:hanging="360"/>
       </w:pPr>
       <w:rPr>
         <w:rFonts w:ascii="Courier New" w:hAnsi="Courier New" w:cs="Courier New" w:hint="default"/>
@@ -3922,7 +4306,7 @@
       <w:lvlText w:val=""/>
       <w:lvlJc w:val="left"/>
       <w:pPr>
-        <w:ind w:left="4320" w:hanging="360"/>
+        <w:ind w:left="5760" w:hanging="360"/>
       </w:pPr>
       <w:rPr>
         <w:rFonts w:ascii="Wingdings" w:hAnsi="Wingdings" w:hint="default"/>
@@ -3934,7 +4318,7 @@
       <w:lvlText w:val=""/>
       <w:lvlJc w:val="left"/>
       <w:pPr>
-        <w:ind w:left="5040" w:hanging="360"/>
+        <w:ind w:left="6480" w:hanging="360"/>
       </w:pPr>
       <w:rPr>
         <w:rFonts w:ascii="Symbol" w:hAnsi="Symbol" w:hint="default"/>
@@ -3946,7 +4330,7 @@
       <w:lvlText w:val="o"/>
       <w:lvlJc w:val="left"/>
       <w:pPr>
-        <w:ind w:left="5760" w:hanging="360"/>
+        <w:ind w:left="7200" w:hanging="360"/>
       </w:pPr>
       <w:rPr>
         <w:rFonts w:ascii="Courier New" w:hAnsi="Courier New" w:cs="Courier New" w:hint="default"/>
@@ -3958,14 +4342,14 @@
       <w:lvlText w:val=""/>
       <w:lvlJc w:val="left"/>
       <w:pPr>
-        <w:ind w:left="6480" w:hanging="360"/>
+        <w:ind w:left="7920" w:hanging="360"/>
       </w:pPr>
       <w:rPr>
         <w:rFonts w:ascii="Wingdings" w:hAnsi="Wingdings" w:hint="default"/>
       </w:rPr>
     </w:lvl>
   </w:abstractNum>
-  <w:abstractNum w:abstractNumId="11" w15:restartNumberingAfterBreak="0">
+  <w:abstractNum w:abstractNumId="14" w15:restartNumberingAfterBreak="0">
     <w:nsid w:val="3F5D1E05"/>
     <w:multiLevelType w:val="hybridMultilevel"/>
     <w:tmpl w:val="DE5E5BDE"/>
@@ -4078,7 +4462,7 @@
       </w:rPr>
     </w:lvl>
   </w:abstractNum>
-  <w:abstractNum w:abstractNumId="12" w15:restartNumberingAfterBreak="0">
+  <w:abstractNum w:abstractNumId="15" w15:restartNumberingAfterBreak="0">
     <w:nsid w:val="41214281"/>
     <w:multiLevelType w:val="hybridMultilevel"/>
     <w:tmpl w:val="FBDCE9B2"/>
@@ -4167,7 +4551,233 @@
       </w:pPr>
     </w:lvl>
   </w:abstractNum>
-  <w:abstractNum w:abstractNumId="13" w15:restartNumberingAfterBreak="0">
+  <w:abstractNum w:abstractNumId="16" w15:restartNumberingAfterBreak="0">
+    <w:nsid w:val="44CE6176"/>
+    <w:multiLevelType w:val="hybridMultilevel"/>
+    <w:tmpl w:val="925E9C46"/>
+    <w:lvl w:ilvl="0" w:tplc="20000003">
+      <w:start w:val="1"/>
+      <w:numFmt w:val="bullet"/>
+      <w:lvlText w:val="o"/>
+      <w:lvlJc w:val="left"/>
+      <w:pPr>
+        <w:ind w:left="720" w:hanging="360"/>
+      </w:pPr>
+      <w:rPr>
+        <w:rFonts w:ascii="Courier New" w:hAnsi="Courier New" w:cs="Courier New" w:hint="default"/>
+      </w:rPr>
+    </w:lvl>
+    <w:lvl w:ilvl="1" w:tplc="20000003" w:tentative="1">
+      <w:start w:val="1"/>
+      <w:numFmt w:val="bullet"/>
+      <w:lvlText w:val="o"/>
+      <w:lvlJc w:val="left"/>
+      <w:pPr>
+        <w:ind w:left="1440" w:hanging="360"/>
+      </w:pPr>
+      <w:rPr>
+        <w:rFonts w:ascii="Courier New" w:hAnsi="Courier New" w:cs="Courier New" w:hint="default"/>
+      </w:rPr>
+    </w:lvl>
+    <w:lvl w:ilvl="2" w:tplc="20000005" w:tentative="1">
+      <w:start w:val="1"/>
+      <w:numFmt w:val="bullet"/>
+      <w:lvlText w:val=""/>
+      <w:lvlJc w:val="left"/>
+      <w:pPr>
+        <w:ind w:left="2160" w:hanging="360"/>
+      </w:pPr>
+      <w:rPr>
+        <w:rFonts w:ascii="Wingdings" w:hAnsi="Wingdings" w:hint="default"/>
+      </w:rPr>
+    </w:lvl>
+    <w:lvl w:ilvl="3" w:tplc="20000001" w:tentative="1">
+      <w:start w:val="1"/>
+      <w:numFmt w:val="bullet"/>
+      <w:lvlText w:val=""/>
+      <w:lvlJc w:val="left"/>
+      <w:pPr>
+        <w:ind w:left="2880" w:hanging="360"/>
+      </w:pPr>
+      <w:rPr>
+        <w:rFonts w:ascii="Symbol" w:hAnsi="Symbol" w:hint="default"/>
+      </w:rPr>
+    </w:lvl>
+    <w:lvl w:ilvl="4" w:tplc="20000003" w:tentative="1">
+      <w:start w:val="1"/>
+      <w:numFmt w:val="bullet"/>
+      <w:lvlText w:val="o"/>
+      <w:lvlJc w:val="left"/>
+      <w:pPr>
+        <w:ind w:left="3600" w:hanging="360"/>
+      </w:pPr>
+      <w:rPr>
+        <w:rFonts w:ascii="Courier New" w:hAnsi="Courier New" w:cs="Courier New" w:hint="default"/>
+      </w:rPr>
+    </w:lvl>
+    <w:lvl w:ilvl="5" w:tplc="20000005" w:tentative="1">
+      <w:start w:val="1"/>
+      <w:numFmt w:val="bullet"/>
+      <w:lvlText w:val=""/>
+      <w:lvlJc w:val="left"/>
+      <w:pPr>
+        <w:ind w:left="4320" w:hanging="360"/>
+      </w:pPr>
+      <w:rPr>
+        <w:rFonts w:ascii="Wingdings" w:hAnsi="Wingdings" w:hint="default"/>
+      </w:rPr>
+    </w:lvl>
+    <w:lvl w:ilvl="6" w:tplc="20000001" w:tentative="1">
+      <w:start w:val="1"/>
+      <w:numFmt w:val="bullet"/>
+      <w:lvlText w:val=""/>
+      <w:lvlJc w:val="left"/>
+      <w:pPr>
+        <w:ind w:left="5040" w:hanging="360"/>
+      </w:pPr>
+      <w:rPr>
+        <w:rFonts w:ascii="Symbol" w:hAnsi="Symbol" w:hint="default"/>
+      </w:rPr>
+    </w:lvl>
+    <w:lvl w:ilvl="7" w:tplc="20000003" w:tentative="1">
+      <w:start w:val="1"/>
+      <w:numFmt w:val="bullet"/>
+      <w:lvlText w:val="o"/>
+      <w:lvlJc w:val="left"/>
+      <w:pPr>
+        <w:ind w:left="5760" w:hanging="360"/>
+      </w:pPr>
+      <w:rPr>
+        <w:rFonts w:ascii="Courier New" w:hAnsi="Courier New" w:cs="Courier New" w:hint="default"/>
+      </w:rPr>
+    </w:lvl>
+    <w:lvl w:ilvl="8" w:tplc="20000005" w:tentative="1">
+      <w:start w:val="1"/>
+      <w:numFmt w:val="bullet"/>
+      <w:lvlText w:val=""/>
+      <w:lvlJc w:val="left"/>
+      <w:pPr>
+        <w:ind w:left="6480" w:hanging="360"/>
+      </w:pPr>
+      <w:rPr>
+        <w:rFonts w:ascii="Wingdings" w:hAnsi="Wingdings" w:hint="default"/>
+      </w:rPr>
+    </w:lvl>
+  </w:abstractNum>
+  <w:abstractNum w:abstractNumId="17" w15:restartNumberingAfterBreak="0">
+    <w:nsid w:val="45FF141F"/>
+    <w:multiLevelType w:val="hybridMultilevel"/>
+    <w:tmpl w:val="5692AC7E"/>
+    <w:lvl w:ilvl="0" w:tplc="20000003">
+      <w:start w:val="1"/>
+      <w:numFmt w:val="bullet"/>
+      <w:lvlText w:val="o"/>
+      <w:lvlJc w:val="left"/>
+      <w:pPr>
+        <w:ind w:left="720" w:hanging="360"/>
+      </w:pPr>
+      <w:rPr>
+        <w:rFonts w:ascii="Courier New" w:hAnsi="Courier New" w:cs="Courier New" w:hint="default"/>
+      </w:rPr>
+    </w:lvl>
+    <w:lvl w:ilvl="1" w:tplc="20000003" w:tentative="1">
+      <w:start w:val="1"/>
+      <w:numFmt w:val="bullet"/>
+      <w:lvlText w:val="o"/>
+      <w:lvlJc w:val="left"/>
+      <w:pPr>
+        <w:ind w:left="1440" w:hanging="360"/>
+      </w:pPr>
+      <w:rPr>
+        <w:rFonts w:ascii="Courier New" w:hAnsi="Courier New" w:cs="Courier New" w:hint="default"/>
+      </w:rPr>
+    </w:lvl>
+    <w:lvl w:ilvl="2" w:tplc="20000005" w:tentative="1">
+      <w:start w:val="1"/>
+      <w:numFmt w:val="bullet"/>
+      <w:lvlText w:val=""/>
+      <w:lvlJc w:val="left"/>
+      <w:pPr>
+        <w:ind w:left="2160" w:hanging="360"/>
+      </w:pPr>
+      <w:rPr>
+        <w:rFonts w:ascii="Wingdings" w:hAnsi="Wingdings" w:hint="default"/>
+      </w:rPr>
+    </w:lvl>
+    <w:lvl w:ilvl="3" w:tplc="20000001" w:tentative="1">
+      <w:start w:val="1"/>
+      <w:numFmt w:val="bullet"/>
+      <w:lvlText w:val=""/>
+      <w:lvlJc w:val="left"/>
+      <w:pPr>
+        <w:ind w:left="2880" w:hanging="360"/>
+      </w:pPr>
+      <w:rPr>
+        <w:rFonts w:ascii="Symbol" w:hAnsi="Symbol" w:hint="default"/>
+      </w:rPr>
+    </w:lvl>
+    <w:lvl w:ilvl="4" w:tplc="20000003" w:tentative="1">
+      <w:start w:val="1"/>
+      <w:numFmt w:val="bullet"/>
+      <w:lvlText w:val="o"/>
+      <w:lvlJc w:val="left"/>
+      <w:pPr>
+        <w:ind w:left="3600" w:hanging="360"/>
+      </w:pPr>
+      <w:rPr>
+        <w:rFonts w:ascii="Courier New" w:hAnsi="Courier New" w:cs="Courier New" w:hint="default"/>
+      </w:rPr>
+    </w:lvl>
+    <w:lvl w:ilvl="5" w:tplc="20000005" w:tentative="1">
+      <w:start w:val="1"/>
+      <w:numFmt w:val="bullet"/>
+      <w:lvlText w:val=""/>
+      <w:lvlJc w:val="left"/>
+      <w:pPr>
+        <w:ind w:left="4320" w:hanging="360"/>
+      </w:pPr>
+      <w:rPr>
+        <w:rFonts w:ascii="Wingdings" w:hAnsi="Wingdings" w:hint="default"/>
+      </w:rPr>
+    </w:lvl>
+    <w:lvl w:ilvl="6" w:tplc="20000001" w:tentative="1">
+      <w:start w:val="1"/>
+      <w:numFmt w:val="bullet"/>
+      <w:lvlText w:val=""/>
+      <w:lvlJc w:val="left"/>
+      <w:pPr>
+        <w:ind w:left="5040" w:hanging="360"/>
+      </w:pPr>
+      <w:rPr>
+        <w:rFonts w:ascii="Symbol" w:hAnsi="Symbol" w:hint="default"/>
+      </w:rPr>
+    </w:lvl>
+    <w:lvl w:ilvl="7" w:tplc="20000003" w:tentative="1">
+      <w:start w:val="1"/>
+      <w:numFmt w:val="bullet"/>
+      <w:lvlText w:val="o"/>
+      <w:lvlJc w:val="left"/>
+      <w:pPr>
+        <w:ind w:left="5760" w:hanging="360"/>
+      </w:pPr>
+      <w:rPr>
+        <w:rFonts w:ascii="Courier New" w:hAnsi="Courier New" w:cs="Courier New" w:hint="default"/>
+      </w:rPr>
+    </w:lvl>
+    <w:lvl w:ilvl="8" w:tplc="20000005" w:tentative="1">
+      <w:start w:val="1"/>
+      <w:numFmt w:val="bullet"/>
+      <w:lvlText w:val=""/>
+      <w:lvlJc w:val="left"/>
+      <w:pPr>
+        <w:ind w:left="6480" w:hanging="360"/>
+      </w:pPr>
+      <w:rPr>
+        <w:rFonts w:ascii="Wingdings" w:hAnsi="Wingdings" w:hint="default"/>
+      </w:rPr>
+    </w:lvl>
+  </w:abstractNum>
+  <w:abstractNum w:abstractNumId="18" w15:restartNumberingAfterBreak="0">
     <w:nsid w:val="4B0E2553"/>
     <w:multiLevelType w:val="hybridMultilevel"/>
     <w:tmpl w:val="4A783E32"/>
@@ -4280,7 +4890,7 @@
       </w:rPr>
     </w:lvl>
   </w:abstractNum>
-  <w:abstractNum w:abstractNumId="14" w15:restartNumberingAfterBreak="0">
+  <w:abstractNum w:abstractNumId="19" w15:restartNumberingAfterBreak="0">
     <w:nsid w:val="52A83CF3"/>
     <w:multiLevelType w:val="hybridMultilevel"/>
     <w:tmpl w:val="4F003DF6"/>
@@ -4393,7 +5003,7 @@
       </w:rPr>
     </w:lvl>
   </w:abstractNum>
-  <w:abstractNum w:abstractNumId="15" w15:restartNumberingAfterBreak="0">
+  <w:abstractNum w:abstractNumId="20" w15:restartNumberingAfterBreak="0">
     <w:nsid w:val="53EC49E6"/>
     <w:multiLevelType w:val="hybridMultilevel"/>
     <w:tmpl w:val="870A11CA"/>
@@ -4506,7 +5116,7 @@
       </w:rPr>
     </w:lvl>
   </w:abstractNum>
-  <w:abstractNum w:abstractNumId="16" w15:restartNumberingAfterBreak="0">
+  <w:abstractNum w:abstractNumId="21" w15:restartNumberingAfterBreak="0">
     <w:nsid w:val="547B3684"/>
     <w:multiLevelType w:val="hybridMultilevel"/>
     <w:tmpl w:val="470A9746"/>
@@ -4619,20 +5229,20 @@
       </w:rPr>
     </w:lvl>
   </w:abstractNum>
-  <w:abstractNum w:abstractNumId="17" w15:restartNumberingAfterBreak="0">
+  <w:abstractNum w:abstractNumId="22" w15:restartNumberingAfterBreak="0">
     <w:nsid w:val="570B02CA"/>
     <w:multiLevelType w:val="hybridMultilevel"/>
-    <w:tmpl w:val="5644D024"/>
-    <w:lvl w:ilvl="0" w:tplc="2000000B">
-      <w:start w:val="1"/>
-      <w:numFmt w:val="bullet"/>
-      <w:lvlText w:val=""/>
-      <w:lvlJc w:val="left"/>
-      <w:pPr>
-        <w:ind w:left="720" w:hanging="360"/>
-      </w:pPr>
-      <w:rPr>
-        <w:rFonts w:ascii="Wingdings" w:hAnsi="Wingdings" w:hint="default"/>
+    <w:tmpl w:val="DA7EB3E4"/>
+    <w:lvl w:ilvl="0" w:tplc="20000001">
+      <w:start w:val="1"/>
+      <w:numFmt w:val="bullet"/>
+      <w:lvlText w:val=""/>
+      <w:lvlJc w:val="left"/>
+      <w:pPr>
+        <w:ind w:left="3240" w:hanging="360"/>
+      </w:pPr>
+      <w:rPr>
+        <w:rFonts w:ascii="Symbol" w:hAnsi="Symbol" w:hint="default"/>
       </w:rPr>
     </w:lvl>
     <w:lvl w:ilvl="1" w:tplc="20000003" w:tentative="1">
@@ -4641,7 +5251,7 @@
       <w:lvlText w:val="o"/>
       <w:lvlJc w:val="left"/>
       <w:pPr>
-        <w:ind w:left="1440" w:hanging="360"/>
+        <w:ind w:left="3960" w:hanging="360"/>
       </w:pPr>
       <w:rPr>
         <w:rFonts w:ascii="Courier New" w:hAnsi="Courier New" w:cs="Courier New" w:hint="default"/>
@@ -4653,7 +5263,7 @@
       <w:lvlText w:val=""/>
       <w:lvlJc w:val="left"/>
       <w:pPr>
-        <w:ind w:left="2160" w:hanging="360"/>
+        <w:ind w:left="4680" w:hanging="360"/>
       </w:pPr>
       <w:rPr>
         <w:rFonts w:ascii="Wingdings" w:hAnsi="Wingdings" w:hint="default"/>
@@ -4665,7 +5275,7 @@
       <w:lvlText w:val=""/>
       <w:lvlJc w:val="left"/>
       <w:pPr>
-        <w:ind w:left="2880" w:hanging="360"/>
+        <w:ind w:left="5400" w:hanging="360"/>
       </w:pPr>
       <w:rPr>
         <w:rFonts w:ascii="Symbol" w:hAnsi="Symbol" w:hint="default"/>
@@ -4677,7 +5287,7 @@
       <w:lvlText w:val="o"/>
       <w:lvlJc w:val="left"/>
       <w:pPr>
-        <w:ind w:left="3600" w:hanging="360"/>
+        <w:ind w:left="6120" w:hanging="360"/>
       </w:pPr>
       <w:rPr>
         <w:rFonts w:ascii="Courier New" w:hAnsi="Courier New" w:cs="Courier New" w:hint="default"/>
@@ -4689,7 +5299,7 @@
       <w:lvlText w:val=""/>
       <w:lvlJc w:val="left"/>
       <w:pPr>
-        <w:ind w:left="4320" w:hanging="360"/>
+        <w:ind w:left="6840" w:hanging="360"/>
       </w:pPr>
       <w:rPr>
         <w:rFonts w:ascii="Wingdings" w:hAnsi="Wingdings" w:hint="default"/>
@@ -4701,7 +5311,7 @@
       <w:lvlText w:val=""/>
       <w:lvlJc w:val="left"/>
       <w:pPr>
-        <w:ind w:left="5040" w:hanging="360"/>
+        <w:ind w:left="7560" w:hanging="360"/>
       </w:pPr>
       <w:rPr>
         <w:rFonts w:ascii="Symbol" w:hAnsi="Symbol" w:hint="default"/>
@@ -4713,7 +5323,7 @@
       <w:lvlText w:val="o"/>
       <w:lvlJc w:val="left"/>
       <w:pPr>
-        <w:ind w:left="5760" w:hanging="360"/>
+        <w:ind w:left="8280" w:hanging="360"/>
       </w:pPr>
       <w:rPr>
         <w:rFonts w:ascii="Courier New" w:hAnsi="Courier New" w:cs="Courier New" w:hint="default"/>
@@ -4725,14 +5335,14 @@
       <w:lvlText w:val=""/>
       <w:lvlJc w:val="left"/>
       <w:pPr>
-        <w:ind w:left="6480" w:hanging="360"/>
+        <w:ind w:left="9000" w:hanging="360"/>
       </w:pPr>
       <w:rPr>
         <w:rFonts w:ascii="Wingdings" w:hAnsi="Wingdings" w:hint="default"/>
       </w:rPr>
     </w:lvl>
   </w:abstractNum>
-  <w:abstractNum w:abstractNumId="18" w15:restartNumberingAfterBreak="0">
+  <w:abstractNum w:abstractNumId="23" w15:restartNumberingAfterBreak="0">
     <w:nsid w:val="59765A0A"/>
     <w:multiLevelType w:val="hybridMultilevel"/>
     <w:tmpl w:val="FB36E41A"/>
@@ -4845,7 +5455,7 @@
       </w:rPr>
     </w:lvl>
   </w:abstractNum>
-  <w:abstractNum w:abstractNumId="19" w15:restartNumberingAfterBreak="0">
+  <w:abstractNum w:abstractNumId="24" w15:restartNumberingAfterBreak="0">
     <w:nsid w:val="5B367F6E"/>
     <w:multiLevelType w:val="hybridMultilevel"/>
     <w:tmpl w:val="F74A5A4C"/>
@@ -4958,7 +5568,120 @@
       </w:rPr>
     </w:lvl>
   </w:abstractNum>
-  <w:abstractNum w:abstractNumId="20" w15:restartNumberingAfterBreak="0">
+  <w:abstractNum w:abstractNumId="25" w15:restartNumberingAfterBreak="0">
+    <w:nsid w:val="5B6F0C07"/>
+    <w:multiLevelType w:val="hybridMultilevel"/>
+    <w:tmpl w:val="14F8EDC4"/>
+    <w:lvl w:ilvl="0" w:tplc="20000003">
+      <w:start w:val="1"/>
+      <w:numFmt w:val="bullet"/>
+      <w:lvlText w:val="o"/>
+      <w:lvlJc w:val="left"/>
+      <w:pPr>
+        <w:ind w:left="720" w:hanging="360"/>
+      </w:pPr>
+      <w:rPr>
+        <w:rFonts w:ascii="Courier New" w:hAnsi="Courier New" w:cs="Courier New" w:hint="default"/>
+      </w:rPr>
+    </w:lvl>
+    <w:lvl w:ilvl="1" w:tplc="20000003" w:tentative="1">
+      <w:start w:val="1"/>
+      <w:numFmt w:val="bullet"/>
+      <w:lvlText w:val="o"/>
+      <w:lvlJc w:val="left"/>
+      <w:pPr>
+        <w:ind w:left="1440" w:hanging="360"/>
+      </w:pPr>
+      <w:rPr>
+        <w:rFonts w:ascii="Courier New" w:hAnsi="Courier New" w:cs="Courier New" w:hint="default"/>
+      </w:rPr>
+    </w:lvl>
+    <w:lvl w:ilvl="2" w:tplc="20000005" w:tentative="1">
+      <w:start w:val="1"/>
+      <w:numFmt w:val="bullet"/>
+      <w:lvlText w:val=""/>
+      <w:lvlJc w:val="left"/>
+      <w:pPr>
+        <w:ind w:left="2160" w:hanging="360"/>
+      </w:pPr>
+      <w:rPr>
+        <w:rFonts w:ascii="Wingdings" w:hAnsi="Wingdings" w:hint="default"/>
+      </w:rPr>
+    </w:lvl>
+    <w:lvl w:ilvl="3" w:tplc="20000001" w:tentative="1">
+      <w:start w:val="1"/>
+      <w:numFmt w:val="bullet"/>
+      <w:lvlText w:val=""/>
+      <w:lvlJc w:val="left"/>
+      <w:pPr>
+        <w:ind w:left="2880" w:hanging="360"/>
+      </w:pPr>
+      <w:rPr>
+        <w:rFonts w:ascii="Symbol" w:hAnsi="Symbol" w:hint="default"/>
+      </w:rPr>
+    </w:lvl>
+    <w:lvl w:ilvl="4" w:tplc="20000003" w:tentative="1">
+      <w:start w:val="1"/>
+      <w:numFmt w:val="bullet"/>
+      <w:lvlText w:val="o"/>
+      <w:lvlJc w:val="left"/>
+      <w:pPr>
+        <w:ind w:left="3600" w:hanging="360"/>
+      </w:pPr>
+      <w:rPr>
+        <w:rFonts w:ascii="Courier New" w:hAnsi="Courier New" w:cs="Courier New" w:hint="default"/>
+      </w:rPr>
+    </w:lvl>
+    <w:lvl w:ilvl="5" w:tplc="20000005" w:tentative="1">
+      <w:start w:val="1"/>
+      <w:numFmt w:val="bullet"/>
+      <w:lvlText w:val=""/>
+      <w:lvlJc w:val="left"/>
+      <w:pPr>
+        <w:ind w:left="4320" w:hanging="360"/>
+      </w:pPr>
+      <w:rPr>
+        <w:rFonts w:ascii="Wingdings" w:hAnsi="Wingdings" w:hint="default"/>
+      </w:rPr>
+    </w:lvl>
+    <w:lvl w:ilvl="6" w:tplc="20000001" w:tentative="1">
+      <w:start w:val="1"/>
+      <w:numFmt w:val="bullet"/>
+      <w:lvlText w:val=""/>
+      <w:lvlJc w:val="left"/>
+      <w:pPr>
+        <w:ind w:left="5040" w:hanging="360"/>
+      </w:pPr>
+      <w:rPr>
+        <w:rFonts w:ascii="Symbol" w:hAnsi="Symbol" w:hint="default"/>
+      </w:rPr>
+    </w:lvl>
+    <w:lvl w:ilvl="7" w:tplc="20000003" w:tentative="1">
+      <w:start w:val="1"/>
+      <w:numFmt w:val="bullet"/>
+      <w:lvlText w:val="o"/>
+      <w:lvlJc w:val="left"/>
+      <w:pPr>
+        <w:ind w:left="5760" w:hanging="360"/>
+      </w:pPr>
+      <w:rPr>
+        <w:rFonts w:ascii="Courier New" w:hAnsi="Courier New" w:cs="Courier New" w:hint="default"/>
+      </w:rPr>
+    </w:lvl>
+    <w:lvl w:ilvl="8" w:tplc="20000005" w:tentative="1">
+      <w:start w:val="1"/>
+      <w:numFmt w:val="bullet"/>
+      <w:lvlText w:val=""/>
+      <w:lvlJc w:val="left"/>
+      <w:pPr>
+        <w:ind w:left="6480" w:hanging="360"/>
+      </w:pPr>
+      <w:rPr>
+        <w:rFonts w:ascii="Wingdings" w:hAnsi="Wingdings" w:hint="default"/>
+      </w:rPr>
+    </w:lvl>
+  </w:abstractNum>
+  <w:abstractNum w:abstractNumId="26" w15:restartNumberingAfterBreak="0">
     <w:nsid w:val="64DC2630"/>
     <w:multiLevelType w:val="hybridMultilevel"/>
     <w:tmpl w:val="85D4B2A0"/>
@@ -5071,7 +5794,7 @@
       </w:rPr>
     </w:lvl>
   </w:abstractNum>
-  <w:abstractNum w:abstractNumId="21" w15:restartNumberingAfterBreak="0">
+  <w:abstractNum w:abstractNumId="27" w15:restartNumberingAfterBreak="0">
     <w:nsid w:val="657B63A7"/>
     <w:multiLevelType w:val="hybridMultilevel"/>
     <w:tmpl w:val="737A8E66"/>
@@ -5184,7 +5907,7 @@
       </w:rPr>
     </w:lvl>
   </w:abstractNum>
-  <w:abstractNum w:abstractNumId="22" w15:restartNumberingAfterBreak="0">
+  <w:abstractNum w:abstractNumId="28" w15:restartNumberingAfterBreak="0">
     <w:nsid w:val="67171C4F"/>
     <w:multiLevelType w:val="hybridMultilevel"/>
     <w:tmpl w:val="5BF09CF6"/>
@@ -5297,7 +6020,7 @@
       </w:rPr>
     </w:lvl>
   </w:abstractNum>
-  <w:abstractNum w:abstractNumId="23" w15:restartNumberingAfterBreak="0">
+  <w:abstractNum w:abstractNumId="29" w15:restartNumberingAfterBreak="0">
     <w:nsid w:val="67BE4005"/>
     <w:multiLevelType w:val="hybridMultilevel"/>
     <w:tmpl w:val="8B967EDE"/>
@@ -5410,20 +6133,133 @@
       </w:rPr>
     </w:lvl>
   </w:abstractNum>
-  <w:abstractNum w:abstractNumId="24" w15:restartNumberingAfterBreak="0">
+  <w:abstractNum w:abstractNumId="30" w15:restartNumberingAfterBreak="0">
+    <w:nsid w:val="6ABF6E27"/>
+    <w:multiLevelType w:val="hybridMultilevel"/>
+    <w:tmpl w:val="1D5A5D2E"/>
+    <w:lvl w:ilvl="0" w:tplc="20000003">
+      <w:start w:val="1"/>
+      <w:numFmt w:val="bullet"/>
+      <w:lvlText w:val="o"/>
+      <w:lvlJc w:val="left"/>
+      <w:pPr>
+        <w:ind w:left="2880" w:hanging="360"/>
+      </w:pPr>
+      <w:rPr>
+        <w:rFonts w:ascii="Courier New" w:hAnsi="Courier New" w:cs="Courier New" w:hint="default"/>
+      </w:rPr>
+    </w:lvl>
+    <w:lvl w:ilvl="1" w:tplc="20000003" w:tentative="1">
+      <w:start w:val="1"/>
+      <w:numFmt w:val="bullet"/>
+      <w:lvlText w:val="o"/>
+      <w:lvlJc w:val="left"/>
+      <w:pPr>
+        <w:ind w:left="3600" w:hanging="360"/>
+      </w:pPr>
+      <w:rPr>
+        <w:rFonts w:ascii="Courier New" w:hAnsi="Courier New" w:cs="Courier New" w:hint="default"/>
+      </w:rPr>
+    </w:lvl>
+    <w:lvl w:ilvl="2" w:tplc="20000005" w:tentative="1">
+      <w:start w:val="1"/>
+      <w:numFmt w:val="bullet"/>
+      <w:lvlText w:val=""/>
+      <w:lvlJc w:val="left"/>
+      <w:pPr>
+        <w:ind w:left="4320" w:hanging="360"/>
+      </w:pPr>
+      <w:rPr>
+        <w:rFonts w:ascii="Wingdings" w:hAnsi="Wingdings" w:hint="default"/>
+      </w:rPr>
+    </w:lvl>
+    <w:lvl w:ilvl="3" w:tplc="20000001" w:tentative="1">
+      <w:start w:val="1"/>
+      <w:numFmt w:val="bullet"/>
+      <w:lvlText w:val=""/>
+      <w:lvlJc w:val="left"/>
+      <w:pPr>
+        <w:ind w:left="5040" w:hanging="360"/>
+      </w:pPr>
+      <w:rPr>
+        <w:rFonts w:ascii="Symbol" w:hAnsi="Symbol" w:hint="default"/>
+      </w:rPr>
+    </w:lvl>
+    <w:lvl w:ilvl="4" w:tplc="20000003" w:tentative="1">
+      <w:start w:val="1"/>
+      <w:numFmt w:val="bullet"/>
+      <w:lvlText w:val="o"/>
+      <w:lvlJc w:val="left"/>
+      <w:pPr>
+        <w:ind w:left="5760" w:hanging="360"/>
+      </w:pPr>
+      <w:rPr>
+        <w:rFonts w:ascii="Courier New" w:hAnsi="Courier New" w:cs="Courier New" w:hint="default"/>
+      </w:rPr>
+    </w:lvl>
+    <w:lvl w:ilvl="5" w:tplc="20000005" w:tentative="1">
+      <w:start w:val="1"/>
+      <w:numFmt w:val="bullet"/>
+      <w:lvlText w:val=""/>
+      <w:lvlJc w:val="left"/>
+      <w:pPr>
+        <w:ind w:left="6480" w:hanging="360"/>
+      </w:pPr>
+      <w:rPr>
+        <w:rFonts w:ascii="Wingdings" w:hAnsi="Wingdings" w:hint="default"/>
+      </w:rPr>
+    </w:lvl>
+    <w:lvl w:ilvl="6" w:tplc="20000001" w:tentative="1">
+      <w:start w:val="1"/>
+      <w:numFmt w:val="bullet"/>
+      <w:lvlText w:val=""/>
+      <w:lvlJc w:val="left"/>
+      <w:pPr>
+        <w:ind w:left="7200" w:hanging="360"/>
+      </w:pPr>
+      <w:rPr>
+        <w:rFonts w:ascii="Symbol" w:hAnsi="Symbol" w:hint="default"/>
+      </w:rPr>
+    </w:lvl>
+    <w:lvl w:ilvl="7" w:tplc="20000003" w:tentative="1">
+      <w:start w:val="1"/>
+      <w:numFmt w:val="bullet"/>
+      <w:lvlText w:val="o"/>
+      <w:lvlJc w:val="left"/>
+      <w:pPr>
+        <w:ind w:left="7920" w:hanging="360"/>
+      </w:pPr>
+      <w:rPr>
+        <w:rFonts w:ascii="Courier New" w:hAnsi="Courier New" w:cs="Courier New" w:hint="default"/>
+      </w:rPr>
+    </w:lvl>
+    <w:lvl w:ilvl="8" w:tplc="20000005" w:tentative="1">
+      <w:start w:val="1"/>
+      <w:numFmt w:val="bullet"/>
+      <w:lvlText w:val=""/>
+      <w:lvlJc w:val="left"/>
+      <w:pPr>
+        <w:ind w:left="8640" w:hanging="360"/>
+      </w:pPr>
+      <w:rPr>
+        <w:rFonts w:ascii="Wingdings" w:hAnsi="Wingdings" w:hint="default"/>
+      </w:rPr>
+    </w:lvl>
+  </w:abstractNum>
+  <w:abstractNum w:abstractNumId="31" w15:restartNumberingAfterBreak="0">
     <w:nsid w:val="6AEE7D30"/>
     <w:multiLevelType w:val="hybridMultilevel"/>
-    <w:tmpl w:val="4588C4C0"/>
-    <w:lvl w:ilvl="0" w:tplc="2000000B">
-      <w:start w:val="1"/>
-      <w:numFmt w:val="bullet"/>
-      <w:lvlText w:val=""/>
-      <w:lvlJc w:val="left"/>
-      <w:pPr>
-        <w:ind w:left="720" w:hanging="360"/>
-      </w:pPr>
-      <w:rPr>
-        <w:rFonts w:ascii="Wingdings" w:hAnsi="Wingdings" w:hint="default"/>
+    <w:tmpl w:val="1D4E9C84"/>
+    <w:lvl w:ilvl="0" w:tplc="20000001">
+      <w:start w:val="1"/>
+      <w:numFmt w:val="bullet"/>
+      <w:lvlText w:val=""/>
+      <w:lvlJc w:val="left"/>
+      <w:pPr>
+        <w:ind w:left="1125" w:hanging="360"/>
+      </w:pPr>
+      <w:rPr>
+        <w:rFonts w:ascii="Symbol" w:hAnsi="Symbol" w:hint="default"/>
       </w:rPr>
     </w:lvl>
     <w:lvl w:ilvl="1" w:tplc="20000003" w:tentative="1">
@@ -5432,7 +6268,7 @@
       <w:lvlText w:val="o"/>
       <w:lvlJc w:val="left"/>
       <w:pPr>
-        <w:ind w:left="1440" w:hanging="360"/>
+        <w:ind w:left="1845" w:hanging="360"/>
       </w:pPr>
       <w:rPr>
         <w:rFonts w:ascii="Courier New" w:hAnsi="Courier New" w:cs="Courier New" w:hint="default"/>
@@ -5444,7 +6280,7 @@
       <w:lvlText w:val=""/>
       <w:lvlJc w:val="left"/>
       <w:pPr>
-        <w:ind w:left="2160" w:hanging="360"/>
+        <w:ind w:left="2565" w:hanging="360"/>
       </w:pPr>
       <w:rPr>
         <w:rFonts w:ascii="Wingdings" w:hAnsi="Wingdings" w:hint="default"/>
@@ -5456,7 +6292,7 @@
       <w:lvlText w:val=""/>
       <w:lvlJc w:val="left"/>
       <w:pPr>
-        <w:ind w:left="2880" w:hanging="360"/>
+        <w:ind w:left="3285" w:hanging="360"/>
       </w:pPr>
       <w:rPr>
         <w:rFonts w:ascii="Symbol" w:hAnsi="Symbol" w:hint="default"/>
@@ -5468,7 +6304,7 @@
       <w:lvlText w:val="o"/>
       <w:lvlJc w:val="left"/>
       <w:pPr>
-        <w:ind w:left="3600" w:hanging="360"/>
+        <w:ind w:left="4005" w:hanging="360"/>
       </w:pPr>
       <w:rPr>
         <w:rFonts w:ascii="Courier New" w:hAnsi="Courier New" w:cs="Courier New" w:hint="default"/>
@@ -5480,7 +6316,7 @@
       <w:lvlText w:val=""/>
       <w:lvlJc w:val="left"/>
       <w:pPr>
-        <w:ind w:left="4320" w:hanging="360"/>
+        <w:ind w:left="4725" w:hanging="360"/>
       </w:pPr>
       <w:rPr>
         <w:rFonts w:ascii="Wingdings" w:hAnsi="Wingdings" w:hint="default"/>
@@ -5492,7 +6328,7 @@
       <w:lvlText w:val=""/>
       <w:lvlJc w:val="left"/>
       <w:pPr>
-        <w:ind w:left="5040" w:hanging="360"/>
+        <w:ind w:left="5445" w:hanging="360"/>
       </w:pPr>
       <w:rPr>
         <w:rFonts w:ascii="Symbol" w:hAnsi="Symbol" w:hint="default"/>
@@ -5504,7 +6340,7 @@
       <w:lvlText w:val="o"/>
       <w:lvlJc w:val="left"/>
       <w:pPr>
-        <w:ind w:left="5760" w:hanging="360"/>
+        <w:ind w:left="6165" w:hanging="360"/>
       </w:pPr>
       <w:rPr>
         <w:rFonts w:ascii="Courier New" w:hAnsi="Courier New" w:cs="Courier New" w:hint="default"/>
@@ -5516,14 +6352,14 @@
       <w:lvlText w:val=""/>
       <w:lvlJc w:val="left"/>
       <w:pPr>
-        <w:ind w:left="6480" w:hanging="360"/>
+        <w:ind w:left="6885" w:hanging="360"/>
       </w:pPr>
       <w:rPr>
         <w:rFonts w:ascii="Wingdings" w:hAnsi="Wingdings" w:hint="default"/>
       </w:rPr>
     </w:lvl>
   </w:abstractNum>
-  <w:abstractNum w:abstractNumId="25" w15:restartNumberingAfterBreak="0">
+  <w:abstractNum w:abstractNumId="32" w15:restartNumberingAfterBreak="0">
     <w:nsid w:val="6B277C0A"/>
     <w:multiLevelType w:val="hybridMultilevel"/>
     <w:tmpl w:val="C776AB88"/>
@@ -5636,7 +6472,120 @@
       </w:rPr>
     </w:lvl>
   </w:abstractNum>
-  <w:abstractNum w:abstractNumId="26" w15:restartNumberingAfterBreak="0">
+  <w:abstractNum w:abstractNumId="33" w15:restartNumberingAfterBreak="0">
+    <w:nsid w:val="6C746A22"/>
+    <w:multiLevelType w:val="hybridMultilevel"/>
+    <w:tmpl w:val="C928A2BA"/>
+    <w:lvl w:ilvl="0" w:tplc="2000000B">
+      <w:start w:val="1"/>
+      <w:numFmt w:val="bullet"/>
+      <w:lvlText w:val=""/>
+      <w:lvlJc w:val="left"/>
+      <w:pPr>
+        <w:ind w:left="1530" w:hanging="360"/>
+      </w:pPr>
+      <w:rPr>
+        <w:rFonts w:ascii="Wingdings" w:hAnsi="Wingdings" w:hint="default"/>
+      </w:rPr>
+    </w:lvl>
+    <w:lvl w:ilvl="1" w:tplc="20000003" w:tentative="1">
+      <w:start w:val="1"/>
+      <w:numFmt w:val="bullet"/>
+      <w:lvlText w:val="o"/>
+      <w:lvlJc w:val="left"/>
+      <w:pPr>
+        <w:ind w:left="2250" w:hanging="360"/>
+      </w:pPr>
+      <w:rPr>
+        <w:rFonts w:ascii="Courier New" w:hAnsi="Courier New" w:cs="Courier New" w:hint="default"/>
+      </w:rPr>
+    </w:lvl>
+    <w:lvl w:ilvl="2" w:tplc="20000005" w:tentative="1">
+      <w:start w:val="1"/>
+      <w:numFmt w:val="bullet"/>
+      <w:lvlText w:val=""/>
+      <w:lvlJc w:val="left"/>
+      <w:pPr>
+        <w:ind w:left="2970" w:hanging="360"/>
+      </w:pPr>
+      <w:rPr>
+        <w:rFonts w:ascii="Wingdings" w:hAnsi="Wingdings" w:hint="default"/>
+      </w:rPr>
+    </w:lvl>
+    <w:lvl w:ilvl="3" w:tplc="20000001" w:tentative="1">
+      <w:start w:val="1"/>
+      <w:numFmt w:val="bullet"/>
+      <w:lvlText w:val=""/>
+      <w:lvlJc w:val="left"/>
+      <w:pPr>
+        <w:ind w:left="3690" w:hanging="360"/>
+      </w:pPr>
+      <w:rPr>
+        <w:rFonts w:ascii="Symbol" w:hAnsi="Symbol" w:hint="default"/>
+      </w:rPr>
+    </w:lvl>
+    <w:lvl w:ilvl="4" w:tplc="20000003" w:tentative="1">
+      <w:start w:val="1"/>
+      <w:numFmt w:val="bullet"/>
+      <w:lvlText w:val="o"/>
+      <w:lvlJc w:val="left"/>
+      <w:pPr>
+        <w:ind w:left="4410" w:hanging="360"/>
+      </w:pPr>
+      <w:rPr>
+        <w:rFonts w:ascii="Courier New" w:hAnsi="Courier New" w:cs="Courier New" w:hint="default"/>
+      </w:rPr>
+    </w:lvl>
+    <w:lvl w:ilvl="5" w:tplc="20000005" w:tentative="1">
+      <w:start w:val="1"/>
+      <w:numFmt w:val="bullet"/>
+      <w:lvlText w:val=""/>
+      <w:lvlJc w:val="left"/>
+      <w:pPr>
+        <w:ind w:left="5130" w:hanging="360"/>
+      </w:pPr>
+      <w:rPr>
+        <w:rFonts w:ascii="Wingdings" w:hAnsi="Wingdings" w:hint="default"/>
+      </w:rPr>
+    </w:lvl>
+    <w:lvl w:ilvl="6" w:tplc="20000001" w:tentative="1">
+      <w:start w:val="1"/>
+      <w:numFmt w:val="bullet"/>
+      <w:lvlText w:val=""/>
+      <w:lvlJc w:val="left"/>
+      <w:pPr>
+        <w:ind w:left="5850" w:hanging="360"/>
+      </w:pPr>
+      <w:rPr>
+        <w:rFonts w:ascii="Symbol" w:hAnsi="Symbol" w:hint="default"/>
+      </w:rPr>
+    </w:lvl>
+    <w:lvl w:ilvl="7" w:tplc="20000003" w:tentative="1">
+      <w:start w:val="1"/>
+      <w:numFmt w:val="bullet"/>
+      <w:lvlText w:val="o"/>
+      <w:lvlJc w:val="left"/>
+      <w:pPr>
+        <w:ind w:left="6570" w:hanging="360"/>
+      </w:pPr>
+      <w:rPr>
+        <w:rFonts w:ascii="Courier New" w:hAnsi="Courier New" w:cs="Courier New" w:hint="default"/>
+      </w:rPr>
+    </w:lvl>
+    <w:lvl w:ilvl="8" w:tplc="20000005" w:tentative="1">
+      <w:start w:val="1"/>
+      <w:numFmt w:val="bullet"/>
+      <w:lvlText w:val=""/>
+      <w:lvlJc w:val="left"/>
+      <w:pPr>
+        <w:ind w:left="7290" w:hanging="360"/>
+      </w:pPr>
+      <w:rPr>
+        <w:rFonts w:ascii="Wingdings" w:hAnsi="Wingdings" w:hint="default"/>
+      </w:rPr>
+    </w:lvl>
+  </w:abstractNum>
+  <w:abstractNum w:abstractNumId="34" w15:restartNumberingAfterBreak="0">
     <w:nsid w:val="6F3F15E3"/>
     <w:multiLevelType w:val="hybridMultilevel"/>
     <w:tmpl w:val="EBDC1616"/>
@@ -5725,7 +6674,7 @@
       </w:pPr>
     </w:lvl>
   </w:abstractNum>
-  <w:abstractNum w:abstractNumId="27" w15:restartNumberingAfterBreak="0">
+  <w:abstractNum w:abstractNumId="35" w15:restartNumberingAfterBreak="0">
     <w:nsid w:val="76166BD4"/>
     <w:multiLevelType w:val="hybridMultilevel"/>
     <w:tmpl w:val="E8AED8F8"/>
@@ -5838,29 +6787,29 @@
       </w:rPr>
     </w:lvl>
   </w:abstractNum>
-  <w:abstractNum w:abstractNumId="28" w15:restartNumberingAfterBreak="0">
+  <w:abstractNum w:abstractNumId="36" w15:restartNumberingAfterBreak="0">
     <w:nsid w:val="7B681556"/>
     <w:multiLevelType w:val="hybridMultilevel"/>
-    <w:tmpl w:val="7D9088D0"/>
-    <w:lvl w:ilvl="0" w:tplc="2000000B">
-      <w:start w:val="1"/>
-      <w:numFmt w:val="bullet"/>
-      <w:lvlText w:val=""/>
-      <w:lvlJc w:val="left"/>
-      <w:pPr>
-        <w:ind w:left="720" w:hanging="360"/>
-      </w:pPr>
-      <w:rPr>
-        <w:rFonts w:ascii="Wingdings" w:hAnsi="Wingdings" w:hint="default"/>
-      </w:rPr>
-    </w:lvl>
-    <w:lvl w:ilvl="1" w:tplc="20000003" w:tentative="1">
-      <w:start w:val="1"/>
-      <w:numFmt w:val="bullet"/>
-      <w:lvlText w:val="o"/>
-      <w:lvlJc w:val="left"/>
-      <w:pPr>
-        <w:ind w:left="1440" w:hanging="360"/>
+    <w:tmpl w:val="5B6C93E0"/>
+    <w:lvl w:ilvl="0" w:tplc="20000001">
+      <w:start w:val="1"/>
+      <w:numFmt w:val="bullet"/>
+      <w:lvlText w:val=""/>
+      <w:lvlJc w:val="left"/>
+      <w:pPr>
+        <w:ind w:left="1080" w:hanging="360"/>
+      </w:pPr>
+      <w:rPr>
+        <w:rFonts w:ascii="Symbol" w:hAnsi="Symbol" w:hint="default"/>
+      </w:rPr>
+    </w:lvl>
+    <w:lvl w:ilvl="1" w:tplc="20000003">
+      <w:start w:val="1"/>
+      <w:numFmt w:val="bullet"/>
+      <w:lvlText w:val="o"/>
+      <w:lvlJc w:val="left"/>
+      <w:pPr>
+        <w:ind w:left="1800" w:hanging="360"/>
       </w:pPr>
       <w:rPr>
         <w:rFonts w:ascii="Courier New" w:hAnsi="Courier New" w:cs="Courier New" w:hint="default"/>
@@ -5872,7 +6821,7 @@
       <w:lvlText w:val=""/>
       <w:lvlJc w:val="left"/>
       <w:pPr>
-        <w:ind w:left="2160" w:hanging="360"/>
+        <w:ind w:left="2520" w:hanging="360"/>
       </w:pPr>
       <w:rPr>
         <w:rFonts w:ascii="Wingdings" w:hAnsi="Wingdings" w:hint="default"/>
@@ -5884,7 +6833,7 @@
       <w:lvlText w:val=""/>
       <w:lvlJc w:val="left"/>
       <w:pPr>
-        <w:ind w:left="2880" w:hanging="360"/>
+        <w:ind w:left="3240" w:hanging="360"/>
       </w:pPr>
       <w:rPr>
         <w:rFonts w:ascii="Symbol" w:hAnsi="Symbol" w:hint="default"/>
@@ -5896,7 +6845,7 @@
       <w:lvlText w:val="o"/>
       <w:lvlJc w:val="left"/>
       <w:pPr>
-        <w:ind w:left="3600" w:hanging="360"/>
+        <w:ind w:left="3960" w:hanging="360"/>
       </w:pPr>
       <w:rPr>
         <w:rFonts w:ascii="Courier New" w:hAnsi="Courier New" w:cs="Courier New" w:hint="default"/>
@@ -5908,7 +6857,7 @@
       <w:lvlText w:val=""/>
       <w:lvlJc w:val="left"/>
       <w:pPr>
-        <w:ind w:left="4320" w:hanging="360"/>
+        <w:ind w:left="4680" w:hanging="360"/>
       </w:pPr>
       <w:rPr>
         <w:rFonts w:ascii="Wingdings" w:hAnsi="Wingdings" w:hint="default"/>
@@ -5920,7 +6869,7 @@
       <w:lvlText w:val=""/>
       <w:lvlJc w:val="left"/>
       <w:pPr>
-        <w:ind w:left="5040" w:hanging="360"/>
+        <w:ind w:left="5400" w:hanging="360"/>
       </w:pPr>
       <w:rPr>
         <w:rFonts w:ascii="Symbol" w:hAnsi="Symbol" w:hint="default"/>
@@ -5932,7 +6881,7 @@
       <w:lvlText w:val="o"/>
       <w:lvlJc w:val="left"/>
       <w:pPr>
-        <w:ind w:left="5760" w:hanging="360"/>
+        <w:ind w:left="6120" w:hanging="360"/>
       </w:pPr>
       <w:rPr>
         <w:rFonts w:ascii="Courier New" w:hAnsi="Courier New" w:cs="Courier New" w:hint="default"/>
@@ -5944,14 +6893,14 @@
       <w:lvlText w:val=""/>
       <w:lvlJc w:val="left"/>
       <w:pPr>
-        <w:ind w:left="6480" w:hanging="360"/>
+        <w:ind w:left="6840" w:hanging="360"/>
       </w:pPr>
       <w:rPr>
         <w:rFonts w:ascii="Wingdings" w:hAnsi="Wingdings" w:hint="default"/>
       </w:rPr>
     </w:lvl>
   </w:abstractNum>
-  <w:abstractNum w:abstractNumId="29" w15:restartNumberingAfterBreak="0">
+  <w:abstractNum w:abstractNumId="37" w15:restartNumberingAfterBreak="0">
     <w:nsid w:val="7C8422E1"/>
     <w:multiLevelType w:val="hybridMultilevel"/>
     <w:tmpl w:val="B6404648"/>
@@ -6065,94 +7014,118 @@
     </w:lvl>
   </w:abstractNum>
   <w:num w:numId="1" w16cid:durableId="627247836">
-    <w:abstractNumId w:val="16"/>
+    <w:abstractNumId w:val="21"/>
   </w:num>
   <w:num w:numId="2" w16cid:durableId="943926054">
+    <w:abstractNumId w:val="3"/>
+  </w:num>
+  <w:num w:numId="3" w16cid:durableId="1982420795">
+    <w:abstractNumId w:val="34"/>
+  </w:num>
+  <w:num w:numId="4" w16cid:durableId="218976540">
+    <w:abstractNumId w:val="20"/>
+  </w:num>
+  <w:num w:numId="5" w16cid:durableId="909585302">
+    <w:abstractNumId w:val="26"/>
+  </w:num>
+  <w:num w:numId="6" w16cid:durableId="1081294613">
+    <w:abstractNumId w:val="19"/>
+  </w:num>
+  <w:num w:numId="7" w16cid:durableId="78598278">
+    <w:abstractNumId w:val="15"/>
+  </w:num>
+  <w:num w:numId="8" w16cid:durableId="466901631">
+    <w:abstractNumId w:val="37"/>
+  </w:num>
+  <w:num w:numId="9" w16cid:durableId="1578320743">
+    <w:abstractNumId w:val="10"/>
+  </w:num>
+  <w:num w:numId="10" w16cid:durableId="1076442486">
+    <w:abstractNumId w:val="4"/>
+  </w:num>
+  <w:num w:numId="11" w16cid:durableId="295141106">
+    <w:abstractNumId w:val="31"/>
+  </w:num>
+  <w:num w:numId="12" w16cid:durableId="858812447">
+    <w:abstractNumId w:val="11"/>
+  </w:num>
+  <w:num w:numId="13" w16cid:durableId="1627392342">
+    <w:abstractNumId w:val="27"/>
+  </w:num>
+  <w:num w:numId="14" w16cid:durableId="235941581">
+    <w:abstractNumId w:val="7"/>
+  </w:num>
+  <w:num w:numId="15" w16cid:durableId="845167061">
+    <w:abstractNumId w:val="28"/>
+  </w:num>
+  <w:num w:numId="16" w16cid:durableId="1539776899">
+    <w:abstractNumId w:val="29"/>
+  </w:num>
+  <w:num w:numId="17" w16cid:durableId="126169319">
+    <w:abstractNumId w:val="18"/>
+  </w:num>
+  <w:num w:numId="18" w16cid:durableId="734664467">
+    <w:abstractNumId w:val="23"/>
+  </w:num>
+  <w:num w:numId="19" w16cid:durableId="391733642">
+    <w:abstractNumId w:val="9"/>
+  </w:num>
+  <w:num w:numId="20" w16cid:durableId="606086864">
+    <w:abstractNumId w:val="8"/>
+  </w:num>
+  <w:num w:numId="21" w16cid:durableId="1032193543">
+    <w:abstractNumId w:val="36"/>
+  </w:num>
+  <w:num w:numId="22" w16cid:durableId="1306007561">
+    <w:abstractNumId w:val="13"/>
+  </w:num>
+  <w:num w:numId="23" w16cid:durableId="1699043572">
+    <w:abstractNumId w:val="22"/>
+  </w:num>
+  <w:num w:numId="24" w16cid:durableId="421802825">
+    <w:abstractNumId w:val="12"/>
+  </w:num>
+  <w:num w:numId="25" w16cid:durableId="2134329448">
+    <w:abstractNumId w:val="35"/>
+  </w:num>
+  <w:num w:numId="26" w16cid:durableId="990252372">
     <w:abstractNumId w:val="2"/>
   </w:num>
-  <w:num w:numId="3" w16cid:durableId="1982420795">
-    <w:abstractNumId w:val="26"/>
-  </w:num>
-  <w:num w:numId="4" w16cid:durableId="218976540">
-    <w:abstractNumId w:val="15"/>
-  </w:num>
-  <w:num w:numId="5" w16cid:durableId="909585302">
-    <w:abstractNumId w:val="20"/>
-  </w:num>
-  <w:num w:numId="6" w16cid:durableId="1081294613">
-    <w:abstractNumId w:val="14"/>
-  </w:num>
-  <w:num w:numId="7" w16cid:durableId="78598278">
-    <w:abstractNumId w:val="12"/>
-  </w:num>
-  <w:num w:numId="8" w16cid:durableId="466901631">
-    <w:abstractNumId w:val="29"/>
-  </w:num>
-  <w:num w:numId="9" w16cid:durableId="1578320743">
-    <w:abstractNumId w:val="7"/>
-  </w:num>
-  <w:num w:numId="10" w16cid:durableId="1076442486">
-    <w:abstractNumId w:val="3"/>
-  </w:num>
-  <w:num w:numId="11" w16cid:durableId="295141106">
+  <w:num w:numId="27" w16cid:durableId="1102651646">
     <w:abstractNumId w:val="24"/>
-  </w:num>
-  <w:num w:numId="12" w16cid:durableId="858812447">
-    <w:abstractNumId w:val="8"/>
-  </w:num>
-  <w:num w:numId="13" w16cid:durableId="1627392342">
-    <w:abstractNumId w:val="21"/>
-  </w:num>
-  <w:num w:numId="14" w16cid:durableId="235941581">
-    <w:abstractNumId w:val="4"/>
-  </w:num>
-  <w:num w:numId="15" w16cid:durableId="845167061">
-    <w:abstractNumId w:val="22"/>
-  </w:num>
-  <w:num w:numId="16" w16cid:durableId="1539776899">
-    <w:abstractNumId w:val="23"/>
-  </w:num>
-  <w:num w:numId="17" w16cid:durableId="126169319">
-    <w:abstractNumId w:val="13"/>
-  </w:num>
-  <w:num w:numId="18" w16cid:durableId="734664467">
-    <w:abstractNumId w:val="18"/>
-  </w:num>
-  <w:num w:numId="19" w16cid:durableId="391733642">
-    <w:abstractNumId w:val="6"/>
-  </w:num>
-  <w:num w:numId="20" w16cid:durableId="606086864">
-    <w:abstractNumId w:val="5"/>
-  </w:num>
-  <w:num w:numId="21" w16cid:durableId="1032193543">
-    <w:abstractNumId w:val="28"/>
-  </w:num>
-  <w:num w:numId="22" w16cid:durableId="1306007561">
-    <w:abstractNumId w:val="10"/>
-  </w:num>
-  <w:num w:numId="23" w16cid:durableId="1699043572">
-    <w:abstractNumId w:val="17"/>
-  </w:num>
-  <w:num w:numId="24" w16cid:durableId="421802825">
-    <w:abstractNumId w:val="9"/>
-  </w:num>
-  <w:num w:numId="25" w16cid:durableId="2134329448">
-    <w:abstractNumId w:val="27"/>
-  </w:num>
-  <w:num w:numId="26" w16cid:durableId="990252372">
-    <w:abstractNumId w:val="1"/>
-  </w:num>
-  <w:num w:numId="27" w16cid:durableId="1102651646">
-    <w:abstractNumId w:val="19"/>
   </w:num>
   <w:num w:numId="28" w16cid:durableId="1955750087">
     <w:abstractNumId w:val="0"/>
   </w:num>
   <w:num w:numId="29" w16cid:durableId="70348411">
-    <w:abstractNumId w:val="11"/>
+    <w:abstractNumId w:val="14"/>
   </w:num>
   <w:num w:numId="30" w16cid:durableId="1804040225">
+    <w:abstractNumId w:val="32"/>
+  </w:num>
+  <w:num w:numId="31" w16cid:durableId="369040012">
+    <w:abstractNumId w:val="1"/>
+  </w:num>
+  <w:num w:numId="32" w16cid:durableId="839467725">
+    <w:abstractNumId w:val="33"/>
+  </w:num>
+  <w:num w:numId="33" w16cid:durableId="508907309">
+    <w:abstractNumId w:val="6"/>
+  </w:num>
+  <w:num w:numId="34" w16cid:durableId="352804785">
+    <w:abstractNumId w:val="17"/>
+  </w:num>
+  <w:num w:numId="35" w16cid:durableId="90587362">
     <w:abstractNumId w:val="25"/>
+  </w:num>
+  <w:num w:numId="36" w16cid:durableId="282541441">
+    <w:abstractNumId w:val="16"/>
+  </w:num>
+  <w:num w:numId="37" w16cid:durableId="1326982093">
+    <w:abstractNumId w:val="5"/>
+  </w:num>
+  <w:num w:numId="38" w16cid:durableId="1294290771">
+    <w:abstractNumId w:val="30"/>
   </w:num>
 </w:numbering>
 </file>
@@ -6758,7 +7731,6 @@
   <w:style w:type="character" w:default="1" w:styleId="DefaultParagraphFont">
     <w:name w:val="Default Paragraph Font"/>
     <w:uiPriority w:val="1"/>
-    <w:semiHidden/>
     <w:unhideWhenUsed/>
   </w:style>
   <w:style w:type="table" w:default="1" w:styleId="TableNormal">

</xml_diff>

<commit_message>
Bahamas Getaway - final design
</commit_message>
<xml_diff>
--- a/Documentation.docx
+++ b/Documentation.docx
@@ -77,10 +77,7 @@
         <w:t xml:space="preserve"> beaches, culture and attractions.</w:t>
       </w:r>
       <w:r>
-        <w:t xml:space="preserve"> </w:t>
-      </w:r>
-      <w:r>
-        <w:t>However, planning a trip can be time-consuming due to scattered information on destinations, accommodations, and activities. Th</w:t>
+        <w:t xml:space="preserve"> However, planning a trip can be time-consuming due to scattered information on destinations, accommodations, and activities. Th</w:t>
       </w:r>
       <w:r>
         <w:t xml:space="preserve">erefore, </w:t>
@@ -317,6 +314,7 @@
           <w:id w:val="1557044982"/>
           <w:citation/>
         </w:sdtPr>
+        <w:sdtEndPr/>
         <w:sdtContent>
           <w:r>
             <w:fldChar w:fldCharType="begin"/>
@@ -1663,23 +1661,11 @@
         </w:rPr>
         <w:t>Travel tips section</w:t>
       </w:r>
-    </w:p>
-    <w:p>
-      <w:pPr>
-        <w:pStyle w:val="ListParagraph"/>
-        <w:numPr>
-          <w:ilvl w:val="0"/>
-          <w:numId w:val="11"/>
-        </w:numPr>
-        <w:rPr>
-          <w:lang w:val="en-GB"/>
-        </w:rPr>
-      </w:pPr>
-      <w:r>
-        <w:rPr>
-          <w:lang w:val="en-GB"/>
-        </w:rPr>
-        <w:t>Frequently asked questions section.</w:t>
+      <w:r>
+        <w:rPr>
+          <w:lang w:val="en-GB"/>
+        </w:rPr>
+        <w:t>.</w:t>
       </w:r>
     </w:p>
     <w:p>
@@ -1727,7 +1713,19 @@
         <w:rPr>
           <w:lang w:val="en-GB"/>
         </w:rPr>
-        <w:t>Destination search bar.</w:t>
+        <w:t xml:space="preserve">Destination </w:t>
+      </w:r>
+      <w:r>
+        <w:rPr>
+          <w:lang w:val="en-GB"/>
+        </w:rPr>
+        <w:t>choice</w:t>
+      </w:r>
+      <w:r>
+        <w:rPr>
+          <w:lang w:val="en-GB"/>
+        </w:rPr>
+        <w:t xml:space="preserve"> bar.</w:t>
       </w:r>
     </w:p>
     <w:p>
@@ -7731,6 +7729,7 @@
   <w:style w:type="character" w:default="1" w:styleId="DefaultParagraphFont">
     <w:name w:val="Default Paragraph Font"/>
     <w:uiPriority w:val="1"/>
+    <w:semiHidden/>
     <w:unhideWhenUsed/>
   </w:style>
   <w:style w:type="table" w:default="1" w:styleId="TableNormal">

</xml_diff>